<commit_message>
Fix Word contract template mapping and exactness
</commit_message>
<xml_diff>
--- a/src/templates/contracts/student-enrolment-template.docx
+++ b/src/templates/contracts/student-enrolment-template.docx
@@ -734,7 +734,6 @@
               </w:rPr>
               <w:t>{phone}</w:t>
             </w:r>
-            <w:proofErr w:type="gramStart"/>
             <w:r>
               <w:rPr>
                 <w:b/>
@@ -760,7 +759,6 @@
               </w:rPr>
               <w:tab/>
             </w:r>
-            <w:proofErr w:type="gramEnd"/>
             <w:r>
               <w:rPr>
                 <w:sz w:val="22"/>
@@ -2323,7 +2321,6 @@
               </w:rPr>
               <w:t xml:space="preserve">{training_location}</w:t>
             </w:r>
-            <w:proofErr w:type="spellStart"/>
             <w:r>
               <w:rPr>
                 <w:b/>
@@ -2333,7 +2330,6 @@
               </w:rPr>
               <w:t/>
             </w:r>
-            <w:proofErr w:type="spellEnd"/>
             <w:r>
               <w:rPr>
                 <w:b/>
@@ -4906,7 +4902,6 @@
               </w:rPr>
               <w:t xml:space="preserve">            </w:t>
             </w:r>
-            <w:proofErr w:type="gramStart"/>
             <w:r>
               <w:rPr>
                 <w:sz w:val="22"/>
@@ -4935,7 +4930,6 @@
               </w:rPr>
               <w:t>{tuition_fee}</w:t>
             </w:r>
-            <w:proofErr w:type="gramEnd"/>
             <w:r>
               <w:rPr>
                 <w:sz w:val="22"/>
@@ -10063,7 +10057,6 @@
               </w:rPr>
               <w:t xml:space="preserve">I understand that I can refuse to sign this consent form and that I can withdraw my consent at any time for future uses of my personal information by writing to the Chief Operating Officer at 25 </w:t>
             </w:r>
-            <w:proofErr w:type="spellStart"/>
             <w:r>
               <w:rPr>
                 <w:sz w:val="22"/>
@@ -10071,7 +10064,6 @@
               </w:rPr>
               <w:t>Watline</w:t>
             </w:r>
-            <w:proofErr w:type="spellEnd"/>
             <w:r>
               <w:rPr>
                 <w:sz w:val="22"/>
@@ -10605,7 +10597,6 @@
               </w:rPr>
               <w:t xml:space="preserve"> mid-point” means the point in the progress of a vocational program where half of the scheduled hours of instruction for the program have taken place; (“mi-</w:t>
             </w:r>
-            <w:proofErr w:type="spellStart"/>
             <w:r>
               <w:rPr>
                 <w:sz w:val="22"/>
@@ -10613,7 +10604,6 @@
               </w:rPr>
               <w:t>parcours</w:t>
             </w:r>
-            <w:proofErr w:type="spellEnd"/>
             <w:r>
               <w:rPr>
                 <w:sz w:val="22"/>
@@ -15515,7 +15505,6 @@
         </w:rPr>
         <w:t xml:space="preserve">submit up-to-date immunization status within 45 days of commencement of study and that I must, while enrolled in the program, maintain this status </w:t>
       </w:r>
-      <w:proofErr w:type="gramStart"/>
       <w:r>
         <w:rPr>
           <w:rFonts w:ascii="Calibri" w:eastAsia="Calibri" w:hAnsi="Calibri" w:cs="Calibri"/>
@@ -15527,7 +15516,6 @@
         </w:rPr>
         <w:t>in order to</w:t>
       </w:r>
-      <w:proofErr w:type="gramEnd"/>
       <w:r>
         <w:rPr>
           <w:rFonts w:ascii="Calibri" w:eastAsia="Calibri" w:hAnsi="Calibri" w:cs="Calibri"/>
@@ -22188,7 +22176,6 @@
         </w:rPr>
         <w:t xml:space="preserve">We ask that you read the following carefully and sign below to acknowledge </w:t>
       </w:r>
-      <w:proofErr w:type="gramStart"/>
       <w:r>
         <w:rPr>
           <w:rFonts w:asciiTheme="minorHAnsi" w:hAnsiTheme="minorHAnsi"/>
@@ -22197,7 +22184,6 @@
         </w:rPr>
         <w:t>your</w:t>
       </w:r>
-      <w:proofErr w:type="gramEnd"/>
       <w:r>
         <w:rPr>
           <w:rFonts w:asciiTheme="minorHAnsi" w:hAnsiTheme="minorHAnsi"/>
@@ -22388,7 +22374,6 @@
         </w:rPr>
         <w:t xml:space="preserve"> manner </w:t>
       </w:r>
-      <w:proofErr w:type="gramStart"/>
       <w:r>
         <w:rPr>
           <w:rFonts w:asciiTheme="minorHAnsi" w:hAnsiTheme="minorHAnsi"/>
@@ -22397,7 +22382,6 @@
         </w:rPr>
         <w:t>at all times</w:t>
       </w:r>
-      <w:proofErr w:type="gramEnd"/>
       <w:r>
         <w:rPr>
           <w:rFonts w:asciiTheme="minorHAnsi" w:hAnsiTheme="minorHAnsi"/>
@@ -23213,7 +23197,6 @@
         </w:rPr>
         <w:t xml:space="preserve">, with proper </w:t>
       </w:r>
-      <w:proofErr w:type="gramStart"/>
       <w:r>
         <w:rPr>
           <w:rFonts w:asciiTheme="minorHAnsi" w:hAnsiTheme="minorHAnsi"/>
@@ -23222,7 +23205,6 @@
         </w:rPr>
         <w:t>sign-offs</w:t>
       </w:r>
-      <w:proofErr w:type="gramEnd"/>
       <w:r>
         <w:rPr>
           <w:rFonts w:asciiTheme="minorHAnsi" w:hAnsiTheme="minorHAnsi"/>
@@ -24269,7 +24251,6 @@
         <w:br/>
         <w:t xml:space="preserve">I understand that it is my responsibility to ensure compliance with Immigration, Refugees and Citizenship Canada (IRCC) regulations </w:t>
       </w:r>
-      <w:proofErr w:type="gramStart"/>
       <w:r>
         <w:rPr>
           <w:sz w:val="22"/>
@@ -24277,7 +24258,6 @@
         </w:rPr>
         <w:t>at all times</w:t>
       </w:r>
-      <w:proofErr w:type="gramEnd"/>
       <w:r>
         <w:rPr>
           <w:sz w:val="22"/>
@@ -25004,33 +24984,7 @@
         <w:sz w:val="16"/>
         <w:szCs w:val="16"/>
       </w:rPr>
-      <w:t xml:space="preserve">25 </w:t>
-    </w:r>
-    <w:proofErr w:type="spellStart"/>
-    <w:r>
-      <w:rPr>
-        <w:rFonts w:ascii="Arial" w:hAnsi="Arial" w:cs="Arial"/>
-        <w:b/>
-        <w:bCs/>
-        <w:i/>
-        <w:iCs/>
-        <w:sz w:val="16"/>
-        <w:szCs w:val="16"/>
-      </w:rPr>
-      <w:t>Watline</w:t>
-    </w:r>
-    <w:proofErr w:type="spellEnd"/>
-    <w:r>
-      <w:rPr>
-        <w:rFonts w:ascii="Arial" w:hAnsi="Arial" w:cs="Arial"/>
-        <w:b/>
-        <w:bCs/>
-        <w:i/>
-        <w:iCs/>
-        <w:sz w:val="16"/>
-        <w:szCs w:val="16"/>
-      </w:rPr>
-      <w:t xml:space="preserve"> Ave, Unit 204, Mississauga</w:t>
+      <w:t>25 Watline Ave, Unit 204, Mississauga</w:t>
     </w:r>
     <w:r>
       <w:rPr>

</xml_diff>

<commit_message>
Fix Word contract template mapping and exactness (#18)
</commit_message>
<xml_diff>
--- a/src/templates/contracts/student-enrolment-template.docx
+++ b/src/templates/contracts/student-enrolment-template.docx
@@ -734,7 +734,6 @@
               </w:rPr>
               <w:t>{phone}</w:t>
             </w:r>
-            <w:proofErr w:type="gramStart"/>
             <w:r>
               <w:rPr>
                 <w:b/>
@@ -760,7 +759,6 @@
               </w:rPr>
               <w:tab/>
             </w:r>
-            <w:proofErr w:type="gramEnd"/>
             <w:r>
               <w:rPr>
                 <w:sz w:val="22"/>
@@ -2323,7 +2321,6 @@
               </w:rPr>
               <w:t xml:space="preserve">{training_location}</w:t>
             </w:r>
-            <w:proofErr w:type="spellStart"/>
             <w:r>
               <w:rPr>
                 <w:b/>
@@ -2333,7 +2330,6 @@
               </w:rPr>
               <w:t/>
             </w:r>
-            <w:proofErr w:type="spellEnd"/>
             <w:r>
               <w:rPr>
                 <w:b/>
@@ -4906,7 +4902,6 @@
               </w:rPr>
               <w:t xml:space="preserve">            </w:t>
             </w:r>
-            <w:proofErr w:type="gramStart"/>
             <w:r>
               <w:rPr>
                 <w:sz w:val="22"/>
@@ -4935,7 +4930,6 @@
               </w:rPr>
               <w:t>{tuition_fee}</w:t>
             </w:r>
-            <w:proofErr w:type="gramEnd"/>
             <w:r>
               <w:rPr>
                 <w:sz w:val="22"/>
@@ -10063,7 +10057,6 @@
               </w:rPr>
               <w:t xml:space="preserve">I understand that I can refuse to sign this consent form and that I can withdraw my consent at any time for future uses of my personal information by writing to the Chief Operating Officer at 25 </w:t>
             </w:r>
-            <w:proofErr w:type="spellStart"/>
             <w:r>
               <w:rPr>
                 <w:sz w:val="22"/>
@@ -10071,7 +10064,6 @@
               </w:rPr>
               <w:t>Watline</w:t>
             </w:r>
-            <w:proofErr w:type="spellEnd"/>
             <w:r>
               <w:rPr>
                 <w:sz w:val="22"/>
@@ -10605,7 +10597,6 @@
               </w:rPr>
               <w:t xml:space="preserve"> mid-point” means the point in the progress of a vocational program where half of the scheduled hours of instruction for the program have taken place; (“mi-</w:t>
             </w:r>
-            <w:proofErr w:type="spellStart"/>
             <w:r>
               <w:rPr>
                 <w:sz w:val="22"/>
@@ -10613,7 +10604,6 @@
               </w:rPr>
               <w:t>parcours</w:t>
             </w:r>
-            <w:proofErr w:type="spellEnd"/>
             <w:r>
               <w:rPr>
                 <w:sz w:val="22"/>
@@ -15515,7 +15505,6 @@
         </w:rPr>
         <w:t xml:space="preserve">submit up-to-date immunization status within 45 days of commencement of study and that I must, while enrolled in the program, maintain this status </w:t>
       </w:r>
-      <w:proofErr w:type="gramStart"/>
       <w:r>
         <w:rPr>
           <w:rFonts w:ascii="Calibri" w:eastAsia="Calibri" w:hAnsi="Calibri" w:cs="Calibri"/>
@@ -15527,7 +15516,6 @@
         </w:rPr>
         <w:t>in order to</w:t>
       </w:r>
-      <w:proofErr w:type="gramEnd"/>
       <w:r>
         <w:rPr>
           <w:rFonts w:ascii="Calibri" w:eastAsia="Calibri" w:hAnsi="Calibri" w:cs="Calibri"/>
@@ -22188,7 +22176,6 @@
         </w:rPr>
         <w:t xml:space="preserve">We ask that you read the following carefully and sign below to acknowledge </w:t>
       </w:r>
-      <w:proofErr w:type="gramStart"/>
       <w:r>
         <w:rPr>
           <w:rFonts w:asciiTheme="minorHAnsi" w:hAnsiTheme="minorHAnsi"/>
@@ -22197,7 +22184,6 @@
         </w:rPr>
         <w:t>your</w:t>
       </w:r>
-      <w:proofErr w:type="gramEnd"/>
       <w:r>
         <w:rPr>
           <w:rFonts w:asciiTheme="minorHAnsi" w:hAnsiTheme="minorHAnsi"/>
@@ -22388,7 +22374,6 @@
         </w:rPr>
         <w:t xml:space="preserve"> manner </w:t>
       </w:r>
-      <w:proofErr w:type="gramStart"/>
       <w:r>
         <w:rPr>
           <w:rFonts w:asciiTheme="minorHAnsi" w:hAnsiTheme="minorHAnsi"/>
@@ -22397,7 +22382,6 @@
         </w:rPr>
         <w:t>at all times</w:t>
       </w:r>
-      <w:proofErr w:type="gramEnd"/>
       <w:r>
         <w:rPr>
           <w:rFonts w:asciiTheme="minorHAnsi" w:hAnsiTheme="minorHAnsi"/>
@@ -23213,7 +23197,6 @@
         </w:rPr>
         <w:t xml:space="preserve">, with proper </w:t>
       </w:r>
-      <w:proofErr w:type="gramStart"/>
       <w:r>
         <w:rPr>
           <w:rFonts w:asciiTheme="minorHAnsi" w:hAnsiTheme="minorHAnsi"/>
@@ -23222,7 +23205,6 @@
         </w:rPr>
         <w:t>sign-offs</w:t>
       </w:r>
-      <w:proofErr w:type="gramEnd"/>
       <w:r>
         <w:rPr>
           <w:rFonts w:asciiTheme="minorHAnsi" w:hAnsiTheme="minorHAnsi"/>
@@ -24269,7 +24251,6 @@
         <w:br/>
         <w:t xml:space="preserve">I understand that it is my responsibility to ensure compliance with Immigration, Refugees and Citizenship Canada (IRCC) regulations </w:t>
       </w:r>
-      <w:proofErr w:type="gramStart"/>
       <w:r>
         <w:rPr>
           <w:sz w:val="22"/>
@@ -24277,7 +24258,6 @@
         </w:rPr>
         <w:t>at all times</w:t>
       </w:r>
-      <w:proofErr w:type="gramEnd"/>
       <w:r>
         <w:rPr>
           <w:sz w:val="22"/>
@@ -25004,33 +24984,7 @@
         <w:sz w:val="16"/>
         <w:szCs w:val="16"/>
       </w:rPr>
-      <w:t xml:space="preserve">25 </w:t>
-    </w:r>
-    <w:proofErr w:type="spellStart"/>
-    <w:r>
-      <w:rPr>
-        <w:rFonts w:ascii="Arial" w:hAnsi="Arial" w:cs="Arial"/>
-        <w:b/>
-        <w:bCs/>
-        <w:i/>
-        <w:iCs/>
-        <w:sz w:val="16"/>
-        <w:szCs w:val="16"/>
-      </w:rPr>
-      <w:t>Watline</w:t>
-    </w:r>
-    <w:proofErr w:type="spellEnd"/>
-    <w:r>
-      <w:rPr>
-        <w:rFonts w:ascii="Arial" w:hAnsi="Arial" w:cs="Arial"/>
-        <w:b/>
-        <w:bCs/>
-        <w:i/>
-        <w:iCs/>
-        <w:sz w:val="16"/>
-        <w:szCs w:val="16"/>
-      </w:rPr>
-      <w:t xml:space="preserve"> Ave, Unit 204, Mississauga</w:t>
+      <w:t>25 Watline Ave, Unit 204, Mississauga</w:t>
     </w:r>
     <w:r>
       <w:rPr>

</xml_diff>

<commit_message>
Fix contract effective date
</commit_message>
<xml_diff>
--- a/src/templates/contracts/student-enrolment-template.docx
+++ b/src/templates/contracts/student-enrolment-template.docx
@@ -193,7 +193,7 @@
                 <w:sz w:val="22"/>
                 <w:szCs w:val="22"/>
               </w:rPr>
-              <w:t>{contract_date}</w:t>
+              <w:t>02/05/2024</w:t>
             </w:r>
             <w:r>
               <w:rPr>
@@ -346,7 +346,7 @@
                 <w:sz w:val="28"/>
                 <w:szCs w:val="28"/>
               </w:rPr>
-              <w:t>{student_full_name}</w:t>
+              <w:t>CHIDI GLORIA AROWOLO</w:t>
             </w:r>
             <w:r>
               <w:rPr>
@@ -381,7 +381,7 @@
                 <w:sz w:val="28"/>
                 <w:szCs w:val="28"/>
               </w:rPr>
-              <w:t>{student_number}</w:t>
+              <w:t>PSW</w:t>
             </w:r>
             <w:r>
               <w:rPr>
@@ -390,7 +390,7 @@
                 <w:sz w:val="28"/>
                 <w:szCs w:val="28"/>
               </w:rPr>
-              <w:t xml:space="preserve"/>
+              <w:t xml:space="preserve"> </w:t>
             </w:r>
             <w:r>
               <w:rPr>
@@ -399,7 +399,7 @@
                 <w:sz w:val="28"/>
                 <w:szCs w:val="28"/>
               </w:rPr>
-              <w:t/>
+              <w:t>1</w:t>
             </w:r>
             <w:r>
               <w:rPr>
@@ -408,7 +408,7 @@
                 <w:sz w:val="28"/>
                 <w:szCs w:val="28"/>
               </w:rPr>
-              <w:t/>
+              <w:t>25</w:t>
             </w:r>
             <w:r>
               <w:rPr>
@@ -417,7 +417,7 @@
                 <w:sz w:val="28"/>
                 <w:szCs w:val="28"/>
               </w:rPr>
-              <w:t/>
+              <w:t>300</w:t>
             </w:r>
           </w:p>
           <w:p>
@@ -476,7 +476,7 @@
                 <w:sz w:val="22"/>
                 <w:szCs w:val="22"/>
               </w:rPr>
-              <w:t>{mailing_address}</w:t>
+              <w:t>1</w:t>
             </w:r>
             <w:r>
               <w:rPr>
@@ -485,7 +485,7 @@
                 <w:sz w:val="22"/>
                 <w:szCs w:val="22"/>
               </w:rPr>
-              <w:t/>
+              <w:t>09 PRESTON MEADOW AVENUE</w:t>
             </w:r>
           </w:p>
           <w:p>
@@ -538,7 +538,7 @@
                 <w:sz w:val="22"/>
                 <w:szCs w:val="22"/>
               </w:rPr>
-              <w:t>{city}</w:t>
+              <w:t>DRYDEN</w:t>
             </w:r>
             <w:r>
               <w:rPr>
@@ -617,7 +617,7 @@
                 <w:sz w:val="22"/>
                 <w:szCs w:val="22"/>
               </w:rPr>
-              <w:t>{province}</w:t>
+              <w:t>ONTARIO</w:t>
             </w:r>
             <w:r>
               <w:rPr>
@@ -675,7 +675,7 @@
                 <w:sz w:val="22"/>
                 <w:szCs w:val="22"/>
               </w:rPr>
-              <w:t>{postal_code}</w:t>
+              <w:t>L4Z OC3</w:t>
             </w:r>
           </w:p>
           <w:p>
@@ -732,7 +732,7 @@
                 <w:sz w:val="22"/>
                 <w:szCs w:val="22"/>
               </w:rPr>
-              <w:t>{phone}</w:t>
+              <w:t>437-225-8728</w:t>
             </w:r>
             <w:r>
               <w:rPr>
@@ -741,125 +741,461 @@
                 <w:sz w:val="22"/>
                 <w:szCs w:val="22"/>
               </w:rPr>
-              <w:t/>
-            </w:r>
-            <w:r>
+              <w:t xml:space="preserve">  </w:t>
+            </w:r>
+            <w:r>
+              <w:rPr>
+                <w:sz w:val="22"/>
+                <w:szCs w:val="22"/>
+              </w:rPr>
+              <w:tab/>
+            </w:r>
+            <w:r>
+              <w:rPr>
+                <w:sz w:val="22"/>
+                <w:szCs w:val="22"/>
+              </w:rPr>
+              <w:tab/>
+            </w:r>
+            <w:r>
+              <w:rPr>
+                <w:sz w:val="22"/>
+                <w:szCs w:val="22"/>
+              </w:rPr>
+              <w:tab/>
+            </w:r>
+            <w:r>
+              <w:rPr>
+                <w:sz w:val="22"/>
+                <w:szCs w:val="22"/>
+              </w:rPr>
+              <w:t xml:space="preserve">     </w:t>
+            </w:r>
+            <w:r>
+              <w:rPr>
+                <w:sz w:val="22"/>
+                <w:szCs w:val="22"/>
+              </w:rPr>
+              <w:t xml:space="preserve">  </w:t>
+            </w:r>
+            <w:r>
+              <w:rPr>
+                <w:sz w:val="22"/>
+                <w:szCs w:val="22"/>
+              </w:rPr>
+              <w:t xml:space="preserve">   </w:t>
+            </w:r>
+            <w:r>
+              <w:rPr>
+                <w:sz w:val="22"/>
+                <w:szCs w:val="22"/>
+              </w:rPr>
+              <w:t>Alternative Phone</w:t>
+            </w:r>
+            <w:r>
+              <w:rPr>
+                <w:sz w:val="22"/>
+                <w:szCs w:val="22"/>
+              </w:rPr>
+              <w:t>:</w:t>
+            </w:r>
+            <w:r>
+              <w:rPr>
+                <w:sz w:val="22"/>
+                <w:szCs w:val="22"/>
+              </w:rPr>
+              <w:t xml:space="preserve">  </w:t>
+            </w:r>
+            <w:r>
+              <w:rPr>
+                <w:sz w:val="22"/>
+                <w:szCs w:val="22"/>
+              </w:rPr>
+              <w:t>________________</w:t>
+            </w:r>
+            <w:r>
+              <w:rPr>
+                <w:sz w:val="22"/>
+                <w:szCs w:val="22"/>
+              </w:rPr>
+              <w:tab/>
+            </w:r>
+            <w:r>
+              <w:rPr>
+                <w:sz w:val="22"/>
+                <w:szCs w:val="22"/>
+              </w:rPr>
+              <w:tab/>
+            </w:r>
+            <w:r>
+              <w:rPr>
+                <w:sz w:val="22"/>
+                <w:szCs w:val="22"/>
+              </w:rPr>
+              <w:tab/>
+            </w:r>
+          </w:p>
+          <w:p>
+            <w:pPr>
+              <w:pStyle w:val="Default"/>
+              <w:rPr>
+                <w:sz w:val="22"/>
+                <w:szCs w:val="22"/>
+              </w:rPr>
+            </w:pPr>
+          </w:p>
+          <w:p>
+            <w:pPr>
+              <w:pStyle w:val="Default"/>
+              <w:rPr>
+                <w:sz w:val="22"/>
+                <w:szCs w:val="22"/>
+              </w:rPr>
+            </w:pPr>
+            <w:r>
+              <w:rPr>
+                <w:sz w:val="22"/>
+                <w:szCs w:val="22"/>
+                <w:u w:val="single"/>
+              </w:rPr>
+              <w:t>Permanent Address</w:t>
+            </w:r>
+            <w:r>
+              <w:rPr>
+                <w:sz w:val="22"/>
+                <w:szCs w:val="22"/>
+              </w:rPr>
+              <w:t xml:space="preserve"> (if different from mailing address) </w:t>
+            </w:r>
+          </w:p>
+          <w:p>
+            <w:pPr>
+              <w:pStyle w:val="Default"/>
+              <w:rPr>
+                <w:sz w:val="22"/>
+                <w:szCs w:val="22"/>
+              </w:rPr>
+            </w:pPr>
+          </w:p>
+          <w:p>
+            <w:pPr>
+              <w:pStyle w:val="Default"/>
+              <w:rPr>
+                <w:sz w:val="22"/>
+                <w:szCs w:val="22"/>
+              </w:rPr>
+            </w:pPr>
+            <w:r>
+              <w:rPr>
+                <w:sz w:val="22"/>
+                <w:szCs w:val="22"/>
+              </w:rPr>
+              <w:t>City</w:t>
+            </w:r>
+            <w:r>
+              <w:rPr>
+                <w:sz w:val="22"/>
+                <w:szCs w:val="22"/>
+              </w:rPr>
+              <w:t>: _</w:t>
+            </w:r>
+            <w:r>
+              <w:rPr>
+                <w:sz w:val="22"/>
+                <w:szCs w:val="22"/>
+              </w:rPr>
+              <w:t>_________________</w:t>
+            </w:r>
+            <w:r>
+              <w:rPr>
+                <w:sz w:val="22"/>
+                <w:szCs w:val="22"/>
+              </w:rPr>
+              <w:t xml:space="preserve">  </w:t>
+            </w:r>
+            <w:r>
+              <w:rPr>
+                <w:sz w:val="22"/>
+                <w:szCs w:val="22"/>
+              </w:rPr>
+              <w:t xml:space="preserve">  </w:t>
+            </w:r>
+            <w:r>
+              <w:rPr>
+                <w:sz w:val="22"/>
+                <w:szCs w:val="22"/>
+              </w:rPr>
+              <w:t xml:space="preserve"> </w:t>
+            </w:r>
+            <w:r>
+              <w:rPr>
+                <w:sz w:val="22"/>
+                <w:szCs w:val="22"/>
+              </w:rPr>
+              <w:tab/>
+            </w:r>
+            <w:r>
+              <w:rPr>
+                <w:sz w:val="22"/>
+                <w:szCs w:val="22"/>
+              </w:rPr>
+              <w:t xml:space="preserve"> </w:t>
+            </w:r>
+            <w:r>
+              <w:rPr>
+                <w:sz w:val="22"/>
+                <w:szCs w:val="22"/>
+              </w:rPr>
+              <w:t>Province</w:t>
+            </w:r>
+            <w:r>
+              <w:rPr>
+                <w:sz w:val="22"/>
+                <w:szCs w:val="22"/>
+              </w:rPr>
+              <w:t>:</w:t>
+            </w:r>
+            <w:r>
+              <w:rPr>
+                <w:sz w:val="22"/>
+                <w:szCs w:val="22"/>
+              </w:rPr>
+              <w:t xml:space="preserve"> </w:t>
+            </w:r>
+            <w:r>
+              <w:rPr>
+                <w:sz w:val="22"/>
+                <w:szCs w:val="22"/>
+              </w:rPr>
+              <w:t xml:space="preserve">________                </w:t>
+            </w:r>
+            <w:r>
+              <w:rPr>
+                <w:sz w:val="22"/>
+                <w:szCs w:val="22"/>
+              </w:rPr>
+              <w:t>Postal Code</w:t>
+            </w:r>
+            <w:r>
+              <w:rPr>
+                <w:sz w:val="22"/>
+                <w:szCs w:val="22"/>
+              </w:rPr>
+              <w:t>:</w:t>
+            </w:r>
+            <w:r>
+              <w:rPr>
+                <w:sz w:val="22"/>
+                <w:szCs w:val="22"/>
+              </w:rPr>
+              <w:t xml:space="preserve"> </w:t>
+            </w:r>
+            <w:r>
+              <w:rPr>
+                <w:sz w:val="22"/>
+                <w:szCs w:val="22"/>
+              </w:rPr>
+              <w:t>__________</w:t>
+            </w:r>
+          </w:p>
+          <w:p>
+            <w:pPr>
+              <w:pStyle w:val="Default"/>
+              <w:rPr>
+                <w:sz w:val="22"/>
+                <w:szCs w:val="22"/>
+              </w:rPr>
+            </w:pPr>
+          </w:p>
+          <w:p>
+            <w:pPr>
+              <w:pStyle w:val="Default"/>
+              <w:rPr>
+                <w:sz w:val="22"/>
+                <w:szCs w:val="22"/>
+              </w:rPr>
+            </w:pPr>
+            <w:r>
+              <w:rPr>
+                <w:sz w:val="22"/>
+                <w:szCs w:val="22"/>
+              </w:rPr>
+              <w:t>Country</w:t>
+            </w:r>
+            <w:r>
+              <w:rPr>
+                <w:sz w:val="22"/>
+                <w:szCs w:val="22"/>
+              </w:rPr>
+              <w:t>:</w:t>
+            </w:r>
+            <w:r>
+              <w:rPr>
+                <w:sz w:val="22"/>
+                <w:szCs w:val="22"/>
+              </w:rPr>
+              <w:t xml:space="preserve"> </w:t>
+            </w:r>
+            <w:r>
+              <w:rPr>
+                <w:sz w:val="22"/>
+                <w:szCs w:val="22"/>
+              </w:rPr>
+              <w:t>__________</w:t>
+            </w:r>
+            <w:r>
+              <w:rPr>
+                <w:sz w:val="22"/>
+                <w:szCs w:val="22"/>
+              </w:rPr>
+              <w:t>_</w:t>
+            </w:r>
+            <w:r>
+              <w:rPr>
+                <w:sz w:val="22"/>
+                <w:szCs w:val="22"/>
+              </w:rPr>
+              <w:t xml:space="preserve"> </w:t>
+            </w:r>
+            <w:r>
+              <w:rPr>
+                <w:sz w:val="22"/>
+                <w:szCs w:val="22"/>
+              </w:rPr>
+              <w:tab/>
+            </w:r>
+            <w:r>
+              <w:rPr>
+                <w:sz w:val="22"/>
+                <w:szCs w:val="22"/>
+              </w:rPr>
+              <w:tab/>
+            </w:r>
+            <w:r>
+              <w:rPr>
+                <w:sz w:val="22"/>
+                <w:szCs w:val="22"/>
+              </w:rPr>
+              <w:tab/>
+            </w:r>
+            <w:r>
+              <w:rPr>
+                <w:sz w:val="22"/>
+                <w:szCs w:val="22"/>
+              </w:rPr>
+              <w:tab/>
+            </w:r>
+            <w:r>
+              <w:rPr>
+                <w:sz w:val="22"/>
+                <w:szCs w:val="22"/>
+              </w:rPr>
+              <w:tab/>
+            </w:r>
+            <w:r>
+              <w:rPr>
+                <w:sz w:val="22"/>
+                <w:szCs w:val="22"/>
+              </w:rPr>
+              <w:t xml:space="preserve">         </w:t>
+            </w:r>
+            <w:r>
+              <w:rPr>
+                <w:sz w:val="22"/>
+                <w:szCs w:val="22"/>
+              </w:rPr>
+              <w:t xml:space="preserve"> </w:t>
+            </w:r>
+            <w:r>
+              <w:rPr>
+                <w:sz w:val="22"/>
+                <w:szCs w:val="22"/>
+              </w:rPr>
+              <w:t xml:space="preserve">    </w:t>
+            </w:r>
+            <w:r>
+              <w:rPr>
+                <w:sz w:val="22"/>
+                <w:szCs w:val="22"/>
+              </w:rPr>
+              <w:t>Phone</w:t>
+            </w:r>
+            <w:r>
+              <w:rPr>
+                <w:sz w:val="22"/>
+                <w:szCs w:val="22"/>
+              </w:rPr>
+              <w:t>:</w:t>
+            </w:r>
+            <w:r>
+              <w:rPr>
+                <w:sz w:val="22"/>
+                <w:szCs w:val="22"/>
+              </w:rPr>
+              <w:t xml:space="preserve"> _</w:t>
+            </w:r>
+            <w:r>
+              <w:rPr>
+                <w:sz w:val="22"/>
+                <w:szCs w:val="22"/>
+              </w:rPr>
+              <w:t>__________________</w:t>
+            </w:r>
+            <w:r>
+              <w:rPr>
+                <w:sz w:val="22"/>
+                <w:szCs w:val="22"/>
+              </w:rPr>
+              <w:tab/>
+            </w:r>
+            <w:r>
+              <w:rPr>
+                <w:sz w:val="22"/>
+                <w:szCs w:val="22"/>
+              </w:rPr>
+              <w:tab/>
+            </w:r>
+            <w:r>
+              <w:rPr>
+                <w:sz w:val="22"/>
+                <w:szCs w:val="22"/>
+              </w:rPr>
+              <w:tab/>
+            </w:r>
+            <w:r>
+              <w:rPr>
+                <w:sz w:val="22"/>
+                <w:szCs w:val="22"/>
+              </w:rPr>
+              <w:tab/>
+            </w:r>
+            <w:r>
+              <w:rPr>
+                <w:sz w:val="22"/>
+                <w:szCs w:val="22"/>
+              </w:rPr>
+              <w:tab/>
+              <w:t xml:space="preserve">       </w:t>
+            </w:r>
+          </w:p>
+          <w:p>
+            <w:pPr>
+              <w:pStyle w:val="Default"/>
+              <w:rPr>
+                <w:sz w:val="22"/>
+                <w:szCs w:val="22"/>
+              </w:rPr>
+            </w:pPr>
+          </w:p>
+          <w:p>
+            <w:pPr>
+              <w:pStyle w:val="Default"/>
               <w:rPr>
                 <w:b/>
                 <w:bCs/>
                 <w:sz w:val="22"/>
                 <w:szCs w:val="22"/>
               </w:rPr>
-              <w:t xml:space="preserve">  </w:t>
-            </w:r>
-            <w:r>
-              <w:rPr>
-                <w:sz w:val="22"/>
-                <w:szCs w:val="22"/>
-              </w:rPr>
-              <w:tab/>
-            </w:r>
-            <w:r>
-              <w:rPr>
-                <w:sz w:val="22"/>
-                <w:szCs w:val="22"/>
-              </w:rPr>
-              <w:tab/>
-            </w:r>
-            <w:r>
-              <w:rPr>
-                <w:sz w:val="22"/>
-                <w:szCs w:val="22"/>
-              </w:rPr>
-              <w:tab/>
-            </w:r>
-            <w:r>
-              <w:rPr>
-                <w:sz w:val="22"/>
-                <w:szCs w:val="22"/>
-              </w:rPr>
-              <w:t xml:space="preserve">     </w:t>
-            </w:r>
-            <w:r>
-              <w:rPr>
-                <w:sz w:val="22"/>
-                <w:szCs w:val="22"/>
-              </w:rPr>
-              <w:t xml:space="preserve">  </w:t>
-            </w:r>
-            <w:r>
-              <w:rPr>
-                <w:sz w:val="22"/>
-                <w:szCs w:val="22"/>
-              </w:rPr>
-              <w:t xml:space="preserve">   </w:t>
-            </w:r>
-            <w:r>
-              <w:rPr>
-                <w:sz w:val="22"/>
-                <w:szCs w:val="22"/>
-              </w:rPr>
-              <w:t>Alternative Phone</w:t>
-            </w:r>
-            <w:r>
-              <w:rPr>
-                <w:sz w:val="22"/>
-                <w:szCs w:val="22"/>
-              </w:rPr>
-              <w:t>:</w:t>
-            </w:r>
-            <w:r>
-              <w:rPr>
-                <w:sz w:val="22"/>
-                <w:szCs w:val="22"/>
-              </w:rPr>
-              <w:t xml:space="preserve">  </w:t>
-            </w:r>
-            <w:r>
-              <w:rPr>
-                <w:sz w:val="22"/>
-                <w:szCs w:val="22"/>
-              </w:rPr>
-              <w:t>________________</w:t>
-            </w:r>
-            <w:r>
-              <w:rPr>
-                <w:sz w:val="22"/>
-                <w:szCs w:val="22"/>
-              </w:rPr>
-              <w:tab/>
-            </w:r>
-            <w:r>
-              <w:rPr>
-                <w:sz w:val="22"/>
-                <w:szCs w:val="22"/>
-              </w:rPr>
-              <w:tab/>
-            </w:r>
-            <w:r>
-              <w:rPr>
-                <w:sz w:val="22"/>
-                <w:szCs w:val="22"/>
-              </w:rPr>
-              <w:tab/>
-            </w:r>
-          </w:p>
-          <w:p>
-            <w:pPr>
-              <w:pStyle w:val="Default"/>
-              <w:rPr>
-                <w:sz w:val="22"/>
-                <w:szCs w:val="22"/>
-              </w:rPr>
-            </w:pPr>
-          </w:p>
-          <w:p>
-            <w:pPr>
-              <w:pStyle w:val="Default"/>
-              <w:rPr>
-                <w:sz w:val="22"/>
-                <w:szCs w:val="22"/>
-              </w:rPr>
             </w:pPr>
             <w:r>
               <w:rPr>
@@ -867,67 +1203,15 @@
                 <w:szCs w:val="22"/>
                 <w:u w:val="single"/>
               </w:rPr>
-              <w:t>Permanent Address</w:t>
-            </w:r>
-            <w:r>
-              <w:rPr>
-                <w:sz w:val="22"/>
-                <w:szCs w:val="22"/>
-              </w:rPr>
-              <w:t xml:space="preserve"> (if different from mailing address) </w:t>
-            </w:r>
-          </w:p>
-          <w:p>
-            <w:pPr>
-              <w:pStyle w:val="Default"/>
-              <w:rPr>
-                <w:sz w:val="22"/>
-                <w:szCs w:val="22"/>
-              </w:rPr>
-            </w:pPr>
-          </w:p>
-          <w:p>
-            <w:pPr>
-              <w:pStyle w:val="Default"/>
-              <w:rPr>
-                <w:sz w:val="22"/>
-                <w:szCs w:val="22"/>
-              </w:rPr>
-            </w:pPr>
-            <w:r>
-              <w:rPr>
-                <w:sz w:val="22"/>
-                <w:szCs w:val="22"/>
-              </w:rPr>
-              <w:t>City</w:t>
-            </w:r>
-            <w:r>
-              <w:rPr>
-                <w:sz w:val="22"/>
-                <w:szCs w:val="22"/>
-              </w:rPr>
-              <w:t>: _</w:t>
-            </w:r>
-            <w:r>
-              <w:rPr>
-                <w:sz w:val="22"/>
-                <w:szCs w:val="22"/>
-              </w:rPr>
-              <w:t>_________________</w:t>
-            </w:r>
-            <w:r>
-              <w:rPr>
-                <w:sz w:val="22"/>
-                <w:szCs w:val="22"/>
-              </w:rPr>
-              <w:t xml:space="preserve">  </w:t>
-            </w:r>
-            <w:r>
-              <w:rPr>
-                <w:sz w:val="22"/>
-                <w:szCs w:val="22"/>
-              </w:rPr>
-              <w:t xml:space="preserve">  </w:t>
+              <w:t>Email Address</w:t>
+            </w:r>
+            <w:r>
+              <w:rPr>
+                <w:sz w:val="22"/>
+                <w:szCs w:val="22"/>
+                <w:u w:val="single"/>
+              </w:rPr>
+              <w:t xml:space="preserve">: </w:t>
             </w:r>
             <w:r>
               <w:rPr>
@@ -937,295 +1221,9 @@
               <w:t xml:space="preserve"> </w:t>
             </w:r>
             <w:r>
-              <w:rPr>
-                <w:sz w:val="22"/>
-                <w:szCs w:val="22"/>
-              </w:rPr>
-              <w:tab/>
-            </w:r>
-            <w:r>
-              <w:rPr>
-                <w:sz w:val="22"/>
-                <w:szCs w:val="22"/>
-              </w:rPr>
-              <w:t xml:space="preserve"> </w:t>
-            </w:r>
-            <w:r>
-              <w:rPr>
-                <w:sz w:val="22"/>
-                <w:szCs w:val="22"/>
-              </w:rPr>
-              <w:t>Province</w:t>
-            </w:r>
-            <w:r>
-              <w:rPr>
-                <w:sz w:val="22"/>
-                <w:szCs w:val="22"/>
-              </w:rPr>
-              <w:t>:</w:t>
-            </w:r>
-            <w:r>
-              <w:rPr>
-                <w:sz w:val="22"/>
-                <w:szCs w:val="22"/>
-              </w:rPr>
-              <w:t xml:space="preserve"> </w:t>
-            </w:r>
-            <w:r>
-              <w:rPr>
-                <w:sz w:val="22"/>
-                <w:szCs w:val="22"/>
-              </w:rPr>
-              <w:t xml:space="preserve">________                </w:t>
-            </w:r>
-            <w:r>
-              <w:rPr>
-                <w:sz w:val="22"/>
-                <w:szCs w:val="22"/>
-              </w:rPr>
-              <w:t>Postal Code</w:t>
-            </w:r>
-            <w:r>
-              <w:rPr>
-                <w:sz w:val="22"/>
-                <w:szCs w:val="22"/>
-              </w:rPr>
-              <w:t>:</w:t>
-            </w:r>
-            <w:r>
-              <w:rPr>
-                <w:sz w:val="22"/>
-                <w:szCs w:val="22"/>
-              </w:rPr>
-              <w:t xml:space="preserve"> </w:t>
-            </w:r>
-            <w:r>
-              <w:rPr>
-                <w:sz w:val="22"/>
-                <w:szCs w:val="22"/>
-              </w:rPr>
-              <w:t>__________</w:t>
-            </w:r>
-          </w:p>
-          <w:p>
-            <w:pPr>
-              <w:pStyle w:val="Default"/>
-              <w:rPr>
-                <w:sz w:val="22"/>
-                <w:szCs w:val="22"/>
-              </w:rPr>
-            </w:pPr>
-          </w:p>
-          <w:p>
-            <w:pPr>
-              <w:pStyle w:val="Default"/>
-              <w:rPr>
-                <w:sz w:val="22"/>
-                <w:szCs w:val="22"/>
-              </w:rPr>
-            </w:pPr>
-            <w:r>
-              <w:rPr>
-                <w:sz w:val="22"/>
-                <w:szCs w:val="22"/>
-              </w:rPr>
-              <w:t>Country</w:t>
-            </w:r>
-            <w:r>
-              <w:rPr>
-                <w:sz w:val="22"/>
-                <w:szCs w:val="22"/>
-              </w:rPr>
-              <w:t>:</w:t>
-            </w:r>
-            <w:r>
-              <w:rPr>
-                <w:sz w:val="22"/>
-                <w:szCs w:val="22"/>
-              </w:rPr>
-              <w:t xml:space="preserve"> </w:t>
-            </w:r>
-            <w:r>
-              <w:rPr>
-                <w:sz w:val="22"/>
-                <w:szCs w:val="22"/>
-              </w:rPr>
-              <w:t>__________</w:t>
-            </w:r>
-            <w:r>
-              <w:rPr>
-                <w:sz w:val="22"/>
-                <w:szCs w:val="22"/>
-              </w:rPr>
-              <w:t>_</w:t>
-            </w:r>
-            <w:r>
-              <w:rPr>
-                <w:sz w:val="22"/>
-                <w:szCs w:val="22"/>
-              </w:rPr>
-              <w:t xml:space="preserve"> </w:t>
-            </w:r>
-            <w:r>
-              <w:rPr>
-                <w:sz w:val="22"/>
-                <w:szCs w:val="22"/>
-              </w:rPr>
-              <w:tab/>
-            </w:r>
-            <w:r>
-              <w:rPr>
-                <w:sz w:val="22"/>
-                <w:szCs w:val="22"/>
-              </w:rPr>
-              <w:tab/>
-            </w:r>
-            <w:r>
-              <w:rPr>
-                <w:sz w:val="22"/>
-                <w:szCs w:val="22"/>
-              </w:rPr>
-              <w:tab/>
-            </w:r>
-            <w:r>
-              <w:rPr>
-                <w:sz w:val="22"/>
-                <w:szCs w:val="22"/>
-              </w:rPr>
-              <w:tab/>
-            </w:r>
-            <w:r>
-              <w:rPr>
-                <w:sz w:val="22"/>
-                <w:szCs w:val="22"/>
-              </w:rPr>
-              <w:tab/>
-            </w:r>
-            <w:r>
-              <w:rPr>
-                <w:sz w:val="22"/>
-                <w:szCs w:val="22"/>
-              </w:rPr>
-              <w:t xml:space="preserve">         </w:t>
-            </w:r>
-            <w:r>
-              <w:rPr>
-                <w:sz w:val="22"/>
-                <w:szCs w:val="22"/>
-              </w:rPr>
-              <w:t xml:space="preserve"> </w:t>
-            </w:r>
-            <w:r>
-              <w:rPr>
-                <w:sz w:val="22"/>
-                <w:szCs w:val="22"/>
-              </w:rPr>
-              <w:t xml:space="preserve">    </w:t>
-            </w:r>
-            <w:r>
-              <w:rPr>
-                <w:sz w:val="22"/>
-                <w:szCs w:val="22"/>
-              </w:rPr>
-              <w:t>Phone</w:t>
-            </w:r>
-            <w:r>
-              <w:rPr>
-                <w:sz w:val="22"/>
-                <w:szCs w:val="22"/>
-              </w:rPr>
-              <w:t>:</w:t>
-            </w:r>
-            <w:r>
-              <w:rPr>
-                <w:sz w:val="22"/>
-                <w:szCs w:val="22"/>
-              </w:rPr>
-              <w:t xml:space="preserve"> _</w:t>
-            </w:r>
-            <w:r>
-              <w:rPr>
-                <w:sz w:val="22"/>
-                <w:szCs w:val="22"/>
-              </w:rPr>
-              <w:t>__________________</w:t>
-            </w:r>
-            <w:r>
-              <w:rPr>
-                <w:sz w:val="22"/>
-                <w:szCs w:val="22"/>
-              </w:rPr>
-              <w:tab/>
-            </w:r>
-            <w:r>
-              <w:rPr>
-                <w:sz w:val="22"/>
-                <w:szCs w:val="22"/>
-              </w:rPr>
-              <w:tab/>
-            </w:r>
-            <w:r>
-              <w:rPr>
-                <w:sz w:val="22"/>
-                <w:szCs w:val="22"/>
-              </w:rPr>
-              <w:tab/>
-            </w:r>
-            <w:r>
-              <w:rPr>
-                <w:sz w:val="22"/>
-                <w:szCs w:val="22"/>
-              </w:rPr>
-              <w:tab/>
-            </w:r>
-            <w:r>
-              <w:rPr>
-                <w:sz w:val="22"/>
-                <w:szCs w:val="22"/>
-              </w:rPr>
-              <w:tab/>
-              <w:t xml:space="preserve">       </w:t>
-            </w:r>
-          </w:p>
-          <w:p>
-            <w:pPr>
-              <w:pStyle w:val="Default"/>
-              <w:rPr>
-                <w:sz w:val="22"/>
-                <w:szCs w:val="22"/>
-              </w:rPr>
-            </w:pPr>
-          </w:p>
-          <w:p>
-            <w:pPr>
-              <w:pStyle w:val="Default"/>
               <w:rPr>
                 <w:b/>
                 <w:bCs/>
-                <w:sz w:val="22"/>
-                <w:szCs w:val="22"/>
-              </w:rPr>
-            </w:pPr>
-            <w:r>
-              <w:rPr>
-                <w:sz w:val="22"/>
-                <w:szCs w:val="22"/>
-                <w:u w:val="single"/>
-              </w:rPr>
-              <w:t>Email Address</w:t>
-            </w:r>
-            <w:r>
-              <w:rPr>
-                <w:sz w:val="22"/>
-                <w:szCs w:val="22"/>
-                <w:u w:val="single"/>
-              </w:rPr>
-              <w:t xml:space="preserve">: </w:t>
-            </w:r>
-            <w:r>
-              <w:rPr>
-                <w:sz w:val="22"/>
-                <w:szCs w:val="22"/>
               </w:rPr>
               <w:t xml:space="preserve"> </w:t>
             </w:r>
@@ -1234,14 +1232,7 @@
                 <w:b/>
                 <w:bCs/>
               </w:rPr>
-              <w:t xml:space="preserve"> </w:t>
-            </w:r>
-            <w:r>
-              <w:rPr>
-                <w:b/>
-                <w:bCs/>
-              </w:rPr>
-              <w:t>{email}</w:t>
+              <w:t>ladyglowin@gmail.com</w:t>
             </w:r>
           </w:p>
           <w:p>
@@ -1605,7 +1596,7 @@
                 <w:sz w:val="22"/>
                 <w:szCs w:val="22"/>
               </w:rPr>
-              <w:t>{date_of_birth}</w:t>
+              <w:t>0</w:t>
             </w:r>
             <w:r>
               <w:rPr>
@@ -1614,7 +1605,7 @@
                 <w:sz w:val="22"/>
                 <w:szCs w:val="22"/>
               </w:rPr>
-              <w:t/>
+              <w:t>1</w:t>
             </w:r>
             <w:r>
               <w:rPr>
@@ -1623,7 +1614,7 @@
                 <w:sz w:val="22"/>
                 <w:szCs w:val="22"/>
               </w:rPr>
-              <w:t/>
+              <w:t>/</w:t>
             </w:r>
             <w:r>
               <w:rPr>
@@ -1632,7 +1623,7 @@
                 <w:sz w:val="22"/>
                 <w:szCs w:val="22"/>
               </w:rPr>
-              <w:t/>
+              <w:t>11</w:t>
             </w:r>
             <w:r>
               <w:rPr>
@@ -1641,7 +1632,7 @@
                 <w:sz w:val="22"/>
                 <w:szCs w:val="22"/>
               </w:rPr>
-              <w:t/>
+              <w:t>/</w:t>
             </w:r>
             <w:r>
               <w:rPr>
@@ -1650,7 +1641,7 @@
                 <w:sz w:val="22"/>
                 <w:szCs w:val="22"/>
               </w:rPr>
-              <w:t/>
+              <w:t>19</w:t>
             </w:r>
             <w:r>
               <w:rPr>
@@ -1659,7 +1650,7 @@
                 <w:sz w:val="22"/>
                 <w:szCs w:val="22"/>
               </w:rPr>
-              <w:t/>
+              <w:t>7</w:t>
             </w:r>
             <w:r>
               <w:rPr>
@@ -1668,7 +1659,7 @@
                 <w:sz w:val="22"/>
                 <w:szCs w:val="22"/>
               </w:rPr>
-              <w:t/>
+              <w:t>6</w:t>
             </w:r>
           </w:p>
           <w:p>
@@ -1744,14 +1735,14 @@
                 <w:sz w:val="22"/>
                 <w:szCs w:val="22"/>
               </w:rPr>
-              <w:t xml:space="preserve">{program_name}</w:t>
-            </w:r>
-            <w:r>
-              <w:rPr>
-                <w:sz w:val="22"/>
-                <w:szCs w:val="22"/>
-              </w:rPr>
-              <w:t/>
+              <w:t xml:space="preserve">NACC PERSONAL SUPPORT WORKER (PSW) DE 2022 </w:t>
+            </w:r>
+            <w:r>
+              <w:rPr>
+                <w:sz w:val="22"/>
+                <w:szCs w:val="22"/>
+              </w:rPr>
+              <w:t>(Accelerated)</w:t>
             </w:r>
           </w:p>
           <w:p>
@@ -1801,7 +1792,7 @@
                 <w:sz w:val="22"/>
                 <w:szCs w:val="22"/>
               </w:rPr>
-              <w:t>{program_start_date}</w:t>
+              <w:t>27</w:t>
             </w:r>
             <w:r>
               <w:rPr>
@@ -1810,7 +1801,7 @@
                 <w:sz w:val="22"/>
                 <w:szCs w:val="22"/>
               </w:rPr>
-              <w:t/>
+              <w:t>/</w:t>
             </w:r>
             <w:r>
               <w:rPr>
@@ -1819,7 +1810,7 @@
                 <w:sz w:val="22"/>
                 <w:szCs w:val="22"/>
               </w:rPr>
-              <w:t/>
+              <w:t>04</w:t>
             </w:r>
             <w:r>
               <w:rPr>
@@ -1828,7 +1819,7 @@
                 <w:sz w:val="22"/>
                 <w:szCs w:val="22"/>
               </w:rPr>
-              <w:t/>
+              <w:t>/202</w:t>
             </w:r>
             <w:r>
               <w:rPr>
@@ -1837,7 +1828,7 @@
                 <w:sz w:val="22"/>
                 <w:szCs w:val="22"/>
               </w:rPr>
-              <w:t/>
+              <w:t>6</w:t>
             </w:r>
             <w:r>
               <w:rPr>
@@ -1881,7 +1872,7 @@
                 <w:sz w:val="22"/>
                 <w:szCs w:val="22"/>
               </w:rPr>
-              <w:t>{expected_completion_date}</w:t>
+              <w:t>25</w:t>
             </w:r>
             <w:r>
               <w:rPr>
@@ -1890,7 +1881,7 @@
                 <w:sz w:val="22"/>
                 <w:szCs w:val="22"/>
               </w:rPr>
-              <w:t/>
+              <w:t>/</w:t>
             </w:r>
             <w:r>
               <w:rPr>
@@ -1899,7 +1890,7 @@
                 <w:sz w:val="22"/>
                 <w:szCs w:val="22"/>
               </w:rPr>
-              <w:t/>
+              <w:t>10</w:t>
             </w:r>
             <w:r>
               <w:rPr>
@@ -1908,7 +1899,7 @@
                 <w:sz w:val="22"/>
                 <w:szCs w:val="22"/>
               </w:rPr>
-              <w:t/>
+              <w:t>/2026</w:t>
             </w:r>
           </w:p>
           <w:p>
@@ -2076,7 +2067,7 @@
                 <w:sz w:val="22"/>
                 <w:szCs w:val="22"/>
               </w:rPr>
-              <w:t>{credential_name}</w:t>
+              <w:t>PSW Certificate</w:t>
             </w:r>
           </w:p>
           <w:p>
@@ -2319,17 +2310,19 @@
                 <w:sz w:val="28"/>
                 <w:szCs w:val="28"/>
               </w:rPr>
-              <w:t xml:space="preserve">{training_location}</w:t>
-            </w:r>
-            <w:r>
+              <w:t xml:space="preserve">25 Watline Avenue, Unit 204 </w:t>
+            </w:r>
+          </w:p>
+          <w:p>
+            <w:pPr>
+              <w:pStyle w:val="Default"/>
               <w:rPr>
                 <w:b/>
                 <w:bCs/>
                 <w:sz w:val="28"/>
                 <w:szCs w:val="28"/>
               </w:rPr>
-              <w:t/>
-            </w:r>
+            </w:pPr>
             <w:r>
               <w:rPr>
                 <w:b/>
@@ -2337,19 +2330,17 @@
                 <w:sz w:val="28"/>
                 <w:szCs w:val="28"/>
               </w:rPr>
-              <w:t xml:space="preserve"> </w:t>
-            </w:r>
-          </w:p>
-          <w:p>
-            <w:pPr>
-              <w:pStyle w:val="Default"/>
+              <w:t xml:space="preserve">                                   </w:t>
+            </w:r>
+            <w:r>
               <w:rPr>
                 <w:b/>
                 <w:bCs/>
                 <w:sz w:val="28"/>
                 <w:szCs w:val="28"/>
               </w:rPr>
-            </w:pPr>
+              <w:t xml:space="preserve">Mississauga, Ontario, </w:t>
+            </w:r>
             <w:r>
               <w:rPr>
                 <w:b/>
@@ -2357,7 +2348,7 @@
                 <w:sz w:val="28"/>
                 <w:szCs w:val="28"/>
               </w:rPr>
-              <w:t xml:space="preserve">                                   </w:t>
+              <w:t xml:space="preserve">CANADA, </w:t>
             </w:r>
             <w:r>
               <w:rPr>
@@ -2366,97 +2357,98 @@
                 <w:sz w:val="28"/>
                 <w:szCs w:val="28"/>
               </w:rPr>
-              <w:t xml:space="preserve"/>
-            </w:r>
+              <w:t>L4Z 2Z1</w:t>
+            </w:r>
+          </w:p>
+          <w:p>
+            <w:pPr>
+              <w:pStyle w:val="Default"/>
+              <w:rPr>
+                <w:sz w:val="22"/>
+                <w:szCs w:val="22"/>
+              </w:rPr>
+            </w:pPr>
+          </w:p>
+          <w:p>
+            <w:pPr>
+              <w:pStyle w:val="Default"/>
+              <w:rPr>
+                <w:sz w:val="22"/>
+                <w:szCs w:val="22"/>
+              </w:rPr>
+            </w:pPr>
+          </w:p>
+          <w:p>
+            <w:pPr>
+              <w:pStyle w:val="Default"/>
+              <w:rPr>
+                <w:sz w:val="22"/>
+                <w:szCs w:val="22"/>
+              </w:rPr>
+            </w:pPr>
+            <w:r>
+              <w:rPr>
+                <w:sz w:val="22"/>
+                <w:szCs w:val="22"/>
+              </w:rPr>
+              <w:t>Additional Training Location (if any) _________________________________________________</w:t>
+            </w:r>
+          </w:p>
+          <w:p>
+            <w:pPr>
+              <w:pStyle w:val="Default"/>
+              <w:rPr>
+                <w:sz w:val="22"/>
+                <w:szCs w:val="22"/>
+              </w:rPr>
+            </w:pPr>
+          </w:p>
+          <w:p>
+            <w:pPr>
+              <w:pStyle w:val="Default"/>
+              <w:rPr>
+                <w:sz w:val="22"/>
+                <w:szCs w:val="22"/>
+              </w:rPr>
+            </w:pPr>
+          </w:p>
+          <w:p>
+            <w:pPr>
+              <w:pStyle w:val="Default"/>
+              <w:rPr>
+                <w:sz w:val="22"/>
+                <w:szCs w:val="22"/>
+                <w:u w:val="single"/>
+              </w:rPr>
+            </w:pPr>
             <w:r>
               <w:rPr>
                 <w:b/>
                 <w:bCs/>
-                <w:sz w:val="28"/>
-                <w:szCs w:val="28"/>
-              </w:rPr>
-              <w:t xml:space="preserve"/>
+                <w:sz w:val="22"/>
+                <w:szCs w:val="22"/>
+                <w:u w:val="single"/>
+              </w:rPr>
+              <w:t>Location of Practicum</w:t>
             </w:r>
             <w:r>
               <w:rPr>
                 <w:b/>
                 <w:bCs/>
-                <w:sz w:val="28"/>
-                <w:szCs w:val="28"/>
-              </w:rPr>
-              <w:t/>
-            </w:r>
-          </w:p>
-          <w:p>
-            <w:pPr>
-              <w:pStyle w:val="Default"/>
-              <w:rPr>
-                <w:sz w:val="22"/>
-                <w:szCs w:val="22"/>
-              </w:rPr>
-            </w:pPr>
-          </w:p>
-          <w:p>
-            <w:pPr>
-              <w:pStyle w:val="Default"/>
-              <w:rPr>
-                <w:sz w:val="22"/>
-                <w:szCs w:val="22"/>
-              </w:rPr>
-            </w:pPr>
-          </w:p>
-          <w:p>
-            <w:pPr>
-              <w:pStyle w:val="Default"/>
-              <w:rPr>
-                <w:sz w:val="22"/>
-                <w:szCs w:val="22"/>
-              </w:rPr>
-            </w:pPr>
-            <w:r>
-              <w:rPr>
-                <w:sz w:val="22"/>
-                <w:szCs w:val="22"/>
-              </w:rPr>
-              <w:t>Additional Training Location (if any) _________________________________________________</w:t>
-            </w:r>
-          </w:p>
-          <w:p>
-            <w:pPr>
-              <w:pStyle w:val="Default"/>
-              <w:rPr>
-                <w:sz w:val="22"/>
-                <w:szCs w:val="22"/>
-              </w:rPr>
-            </w:pPr>
-          </w:p>
-          <w:p>
-            <w:pPr>
-              <w:pStyle w:val="Default"/>
-              <w:rPr>
-                <w:sz w:val="22"/>
-                <w:szCs w:val="22"/>
-              </w:rPr>
-            </w:pPr>
-          </w:p>
-          <w:p>
-            <w:pPr>
-              <w:pStyle w:val="Default"/>
-              <w:rPr>
                 <w:sz w:val="22"/>
                 <w:szCs w:val="22"/>
                 <w:u w:val="single"/>
               </w:rPr>
-            </w:pPr>
+              <w:t xml:space="preserve">-1 </w:t>
+            </w:r>
             <w:r>
               <w:rPr>
                 <w:b/>
                 <w:bCs/>
                 <w:sz w:val="22"/>
                 <w:szCs w:val="22"/>
-                <w:u w:val="single"/>
-              </w:rPr>
-              <w:t>Location of Practicum</w:t>
+              </w:rPr>
+              <w:t>(</w:t>
             </w:r>
             <w:r>
               <w:rPr>
@@ -2464,9 +2456,8 @@
                 <w:bCs/>
                 <w:sz w:val="22"/>
                 <w:szCs w:val="22"/>
-                <w:u w:val="single"/>
-              </w:rPr>
-              <w:t xml:space="preserve">-1 </w:t>
+              </w:rPr>
+              <w:t xml:space="preserve">200 </w:t>
             </w:r>
             <w:r>
               <w:rPr>
@@ -2475,7 +2466,7 @@
                 <w:sz w:val="22"/>
                 <w:szCs w:val="22"/>
               </w:rPr>
-              <w:t>({practicum_1_hours} Hours)</w:t>
+              <w:t>Hours</w:t>
             </w:r>
             <w:r>
               <w:rPr>
@@ -2484,7 +2475,7 @@
                 <w:sz w:val="22"/>
                 <w:szCs w:val="22"/>
               </w:rPr>
-              <w:t xml:space="preserve"/>
+              <w:t>):</w:t>
             </w:r>
             <w:r>
               <w:rPr>
@@ -2493,7 +2484,7 @@
                 <w:sz w:val="22"/>
                 <w:szCs w:val="22"/>
               </w:rPr>
-              <w:t/>
+              <w:t xml:space="preserve"> </w:t>
             </w:r>
             <w:r>
               <w:rPr>
@@ -2502,7 +2493,7 @@
                 <w:sz w:val="22"/>
                 <w:szCs w:val="22"/>
               </w:rPr>
-              <w:t>:</w:t>
+              <w:t xml:space="preserve"> </w:t>
             </w:r>
             <w:r>
               <w:rPr>
@@ -2511,67 +2502,67 @@
                 <w:sz w:val="22"/>
                 <w:szCs w:val="22"/>
               </w:rPr>
-              <w:t xml:space="preserve"> </w:t>
-            </w:r>
-            <w:r>
+              <w:t>EXTENDICARE (To be determined as per availability)</w:t>
+            </w:r>
+          </w:p>
+          <w:p>
+            <w:pPr>
+              <w:pStyle w:val="Default"/>
               <w:rPr>
                 <w:b/>
                 <w:bCs/>
                 <w:sz w:val="22"/>
                 <w:szCs w:val="22"/>
               </w:rPr>
-              <w:t xml:space="preserve"> </w:t>
-            </w:r>
-            <w:r>
+            </w:pPr>
+          </w:p>
+          <w:p>
+            <w:pPr>
+              <w:pStyle w:val="Default"/>
               <w:rPr>
                 <w:b/>
                 <w:bCs/>
                 <w:sz w:val="22"/>
                 <w:szCs w:val="22"/>
               </w:rPr>
-              <w:t>{practicum_1_location}</w:t>
-            </w:r>
-          </w:p>
-          <w:p>
-            <w:pPr>
-              <w:pStyle w:val="Default"/>
+            </w:pPr>
+          </w:p>
+          <w:p>
+            <w:pPr>
+              <w:pStyle w:val="Default"/>
+              <w:rPr>
+                <w:sz w:val="22"/>
+                <w:szCs w:val="22"/>
+                <w:u w:val="single"/>
+              </w:rPr>
+            </w:pPr>
+            <w:r>
               <w:rPr>
                 <w:b/>
                 <w:bCs/>
                 <w:sz w:val="22"/>
                 <w:szCs w:val="22"/>
-              </w:rPr>
-            </w:pPr>
-          </w:p>
-          <w:p>
-            <w:pPr>
-              <w:pStyle w:val="Default"/>
+                <w:u w:val="single"/>
+              </w:rPr>
+              <w:t xml:space="preserve">Location of practicum-2 </w:t>
+            </w:r>
+            <w:r>
               <w:rPr>
                 <w:b/>
                 <w:bCs/>
                 <w:sz w:val="22"/>
                 <w:szCs w:val="22"/>
               </w:rPr>
-            </w:pPr>
-          </w:p>
-          <w:p>
-            <w:pPr>
-              <w:pStyle w:val="Default"/>
-              <w:rPr>
-                <w:sz w:val="22"/>
-                <w:szCs w:val="22"/>
-                <w:u w:val="single"/>
-              </w:rPr>
-            </w:pPr>
+              <w:t>(</w:t>
+            </w:r>
             <w:r>
               <w:rPr>
                 <w:b/>
                 <w:bCs/>
                 <w:sz w:val="22"/>
                 <w:szCs w:val="22"/>
-                <w:u w:val="single"/>
-              </w:rPr>
-              <w:t xml:space="preserve">Location of practicum-2 </w:t>
+              </w:rPr>
+              <w:t xml:space="preserve">100 </w:t>
             </w:r>
             <w:r>
               <w:rPr>
@@ -2580,7 +2571,7 @@
                 <w:sz w:val="22"/>
                 <w:szCs w:val="22"/>
               </w:rPr>
-              <w:t>({practicum_2_hours} Hours)</w:t>
+              <w:t>Hours)</w:t>
             </w:r>
             <w:r>
               <w:rPr>
@@ -2589,7 +2580,7 @@
                 <w:sz w:val="22"/>
                 <w:szCs w:val="22"/>
               </w:rPr>
-              <w:t xml:space="preserve"/>
+              <w:t>:</w:t>
             </w:r>
             <w:r>
               <w:rPr>
@@ -2598,7 +2589,7 @@
                 <w:sz w:val="22"/>
                 <w:szCs w:val="22"/>
               </w:rPr>
-              <w:t/>
+              <w:t xml:space="preserve">  </w:t>
             </w:r>
             <w:r>
               <w:rPr>
@@ -2607,7 +2598,7 @@
                 <w:sz w:val="22"/>
                 <w:szCs w:val="22"/>
               </w:rPr>
-              <w:t>:</w:t>
+              <w:t>CHARTWELL OR EXTENDICARE</w:t>
             </w:r>
             <w:r>
               <w:rPr>
@@ -2616,37 +2607,39 @@
                 <w:sz w:val="22"/>
                 <w:szCs w:val="22"/>
               </w:rPr>
-              <w:t xml:space="preserve">  </w:t>
-            </w:r>
-            <w:r>
+              <w:t xml:space="preserve"> (To be determined as per availability)</w:t>
+            </w:r>
+          </w:p>
+          <w:p>
+            <w:pPr>
+              <w:pStyle w:val="Default"/>
               <w:rPr>
                 <w:b/>
                 <w:bCs/>
                 <w:sz w:val="22"/>
                 <w:szCs w:val="22"/>
               </w:rPr>
-              <w:t>{practicum_2_location}</w:t>
-            </w:r>
-            <w:r>
+            </w:pPr>
+          </w:p>
+          <w:p>
+            <w:pPr>
+              <w:pStyle w:val="Default"/>
               <w:rPr>
                 <w:b/>
                 <w:bCs/>
                 <w:sz w:val="22"/>
                 <w:szCs w:val="22"/>
               </w:rPr>
-              <w:t xml:space="preserve"/>
-            </w:r>
-          </w:p>
-          <w:p>
-            <w:pPr>
-              <w:pStyle w:val="Default"/>
+            </w:pPr>
+            <w:r>
               <w:rPr>
                 <w:b/>
                 <w:bCs/>
                 <w:sz w:val="22"/>
                 <w:szCs w:val="22"/>
               </w:rPr>
-            </w:pPr>
+              <w:tab/>
+            </w:r>
           </w:p>
           <w:p>
             <w:pPr>
@@ -2676,6 +2669,7 @@
                 <w:bCs/>
                 <w:sz w:val="22"/>
                 <w:szCs w:val="22"/>
+                <w:u w:val="single"/>
               </w:rPr>
             </w:pPr>
             <w:r>
@@ -2684,39 +2678,18 @@
                 <w:bCs/>
                 <w:sz w:val="22"/>
                 <w:szCs w:val="22"/>
-              </w:rPr>
-              <w:tab/>
-            </w:r>
-          </w:p>
-          <w:p>
-            <w:pPr>
-              <w:pStyle w:val="Default"/>
+                <w:u w:val="single"/>
+              </w:rPr>
+              <w:t xml:space="preserve">Program length (in hours) </w:t>
+            </w:r>
+            <w:r>
               <w:rPr>
                 <w:b/>
                 <w:bCs/>
                 <w:sz w:val="22"/>
                 <w:szCs w:val="22"/>
-                <w:u w:val="single"/>
-              </w:rPr>
-            </w:pPr>
-            <w:r>
-              <w:rPr>
-                <w:b/>
-                <w:bCs/>
-                <w:sz w:val="22"/>
-                <w:szCs w:val="22"/>
-                <w:u w:val="single"/>
-              </w:rPr>
-              <w:t xml:space="preserve">Program length (in hours) </w:t>
-            </w:r>
-            <w:r>
-              <w:rPr>
-                <w:b/>
-                <w:bCs/>
-                <w:sz w:val="22"/>
-                <w:szCs w:val="22"/>
-              </w:rPr>
-              <w:t>{program_hours} Hours</w:t>
+              </w:rPr>
+              <w:t>700 Hours</w:t>
             </w:r>
           </w:p>
           <w:p>
@@ -3053,7 +3026,7 @@
                       <w:sz w:val="22"/>
                       <w:szCs w:val="22"/>
                     </w:rPr>
-                    <w:t>{class_time}</w:t>
+                    <w:t>8:00AM-2:00PM</w:t>
                   </w:r>
                 </w:p>
               </w:tc>
@@ -3076,7 +3049,7 @@
                       <w:sz w:val="22"/>
                       <w:szCs w:val="22"/>
                     </w:rPr>
-                    <w:t>{class_time}</w:t>
+                    <w:t>8:00AM-2:00PM</w:t>
                   </w:r>
                 </w:p>
               </w:tc>
@@ -3099,7 +3072,7 @@
                       <w:sz w:val="22"/>
                       <w:szCs w:val="22"/>
                     </w:rPr>
-                    <w:t>{class_time}</w:t>
+                    <w:t>8:00AM-2:00PM</w:t>
                   </w:r>
                 </w:p>
               </w:tc>
@@ -3122,7 +3095,7 @@
                       <w:sz w:val="22"/>
                       <w:szCs w:val="22"/>
                     </w:rPr>
-                    <w:t>{class_time}</w:t>
+                    <w:t>8:00AM-2:00PM</w:t>
                   </w:r>
                 </w:p>
               </w:tc>
@@ -3147,7 +3120,7 @@
                       <w:sz w:val="22"/>
                       <w:szCs w:val="22"/>
                     </w:rPr>
-                    <w:t>{class_time}</w:t>
+                    <w:t>8:00AM-2:00PM</w:t>
                   </w:r>
                 </w:p>
               </w:tc>
@@ -3223,7 +3196,7 @@
                       <w:sz w:val="22"/>
                       <w:szCs w:val="22"/>
                     </w:rPr>
-                    <w:t>{hours_per_day}</w:t>
+                    <w:t>6</w:t>
                   </w:r>
                 </w:p>
               </w:tc>
@@ -3244,7 +3217,7 @@
                       <w:sz w:val="22"/>
                       <w:szCs w:val="22"/>
                     </w:rPr>
-                    <w:t>{hours_per_day}</w:t>
+                    <w:t>6</w:t>
                   </w:r>
                 </w:p>
               </w:tc>
@@ -3265,7 +3238,7 @@
                       <w:sz w:val="22"/>
                       <w:szCs w:val="22"/>
                     </w:rPr>
-                    <w:t>{hours_per_day}</w:t>
+                    <w:t>6</w:t>
                   </w:r>
                 </w:p>
               </w:tc>
@@ -3286,7 +3259,7 @@
                       <w:sz w:val="22"/>
                       <w:szCs w:val="22"/>
                     </w:rPr>
-                    <w:t>{hours_per_day}</w:t>
+                    <w:t>6</w:t>
                   </w:r>
                 </w:p>
               </w:tc>
@@ -3307,7 +3280,7 @@
                       <w:sz w:val="22"/>
                       <w:szCs w:val="22"/>
                     </w:rPr>
-                    <w:t>{hours_per_day}</w:t>
+                    <w:t>6</w:t>
                   </w:r>
                 </w:p>
               </w:tc>
@@ -4359,82 +4332,6 @@
             </w:pPr>
             <w:r>
               <w:rPr>
-                <w:noProof/>
-                <w:sz w:val="22"/>
-                <w:szCs w:val="22"/>
-              </w:rPr>
-              <mc:AlternateContent>
-                <mc:Choice Requires="wps">
-                  <w:drawing>
-                    <wp:anchor distT="0" distB="0" distL="114300" distR="114300" simplePos="0" relativeHeight="251695104" behindDoc="0" locked="0" layoutInCell="1" allowOverlap="1" wp14:anchorId="2160D5A9" wp14:editId="4D6BB4C1">
-                      <wp:simplePos x="0" y="0"/>
-                      <wp:positionH relativeFrom="column">
-                        <wp:posOffset>113030</wp:posOffset>
-                      </wp:positionH>
-                      <wp:positionV relativeFrom="paragraph">
-                        <wp:posOffset>159457</wp:posOffset>
-                      </wp:positionV>
-                      <wp:extent cx="277495" cy="248285"/>
-                      <wp:effectExtent l="0" t="0" r="27305" b="18415"/>
-                      <wp:wrapNone/>
-                      <wp:docPr id="2026893848" name="Oval 15"/>
-                      <wp:cNvGraphicFramePr/>
-                      <a:graphic xmlns:a="http://schemas.openxmlformats.org/drawingml/2006/main">
-                        <a:graphicData uri="http://schemas.microsoft.com/office/word/2010/wordprocessingShape">
-                          <wps:wsp>
-                            <wps:cNvSpPr/>
-                            <wps:spPr>
-                              <a:xfrm>
-                                <a:off x="0" y="0"/>
-                                <a:ext cx="277495" cy="248285"/>
-                              </a:xfrm>
-                              <a:prstGeom prst="ellipse">
-                                <a:avLst/>
-                              </a:prstGeom>
-                              <a:noFill/>
-                            </wps:spPr>
-                            <wps:style>
-                              <a:lnRef idx="2">
-                                <a:schemeClr val="accent1">
-                                  <a:shade val="15000"/>
-                                </a:schemeClr>
-                              </a:lnRef>
-                              <a:fillRef idx="1">
-                                <a:schemeClr val="accent1"/>
-                              </a:fillRef>
-                              <a:effectRef idx="0">
-                                <a:schemeClr val="accent1"/>
-                              </a:effectRef>
-                              <a:fontRef idx="minor">
-                                <a:schemeClr val="lt1"/>
-                              </a:fontRef>
-                            </wps:style>
-                            <wps:bodyPr rot="0" spcFirstLastPara="0" vertOverflow="overflow" horzOverflow="overflow" vert="horz" wrap="square" lIns="91440" tIns="45720" rIns="91440" bIns="45720" numCol="1" spcCol="0" rtlCol="0" fromWordArt="0" anchor="ctr" anchorCtr="0" forceAA="0" compatLnSpc="1">
-                              <a:prstTxWarp prst="textNoShape">
-                                <a:avLst/>
-                              </a:prstTxWarp>
-                              <a:noAutofit/>
-                            </wps:bodyPr>
-                          </wps:wsp>
-                        </a:graphicData>
-                      </a:graphic>
-                      <wp14:sizeRelH relativeFrom="margin">
-                        <wp14:pctWidth>0</wp14:pctWidth>
-                      </wp14:sizeRelH>
-                    </wp:anchor>
-                  </w:drawing>
-                </mc:Choice>
-                <mc:Fallback>
-                  <w:pict>
-                    <v:oval w14:anchorId="374C3CD9" id="Oval 15" o:spid="_x0000_s1026" style="position:absolute;margin-left:8.9pt;margin-top:12.55pt;width:21.85pt;height:19.55pt;z-index:251695104;visibility:visible;mso-wrap-style:square;mso-width-percent:0;mso-wrap-distance-left:9pt;mso-wrap-distance-top:0;mso-wrap-distance-right:9pt;mso-wrap-distance-bottom:0;mso-position-horizontal:absolute;mso-position-horizontal-relative:text;mso-position-vertical:absolute;mso-position-vertical-relative:text;mso-width-percent:0;mso-width-relative:margin;v-text-anchor:middle" o:gfxdata="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" filled="f" strokecolor="#030e13 [484]" strokeweight="1pt">
-                      <v:stroke joinstyle="miter"/>
-                    </v:oval>
-                  </w:pict>
-                </mc:Fallback>
-              </mc:AlternateContent>
-            </w:r>
-            <w:r>
-              <w:rPr>
                 <w:sz w:val="22"/>
                 <w:szCs w:val="22"/>
               </w:rPr>
@@ -4660,85 +4557,6 @@
             </w:pPr>
             <w:r>
               <w:rPr>
-                <w:noProof/>
-                <w:sz w:val="22"/>
-                <w:szCs w:val="22"/>
-              </w:rPr>
-              <mc:AlternateContent>
-                <mc:Choice Requires="wps">
-                  <w:drawing>
-                    <wp:anchor distT="0" distB="0" distL="114300" distR="114300" simplePos="0" relativeHeight="251696128" behindDoc="0" locked="0" layoutInCell="1" allowOverlap="1" wp14:anchorId="06494B06" wp14:editId="57A0B422">
-                      <wp:simplePos x="0" y="0"/>
-                      <wp:positionH relativeFrom="column">
-                        <wp:posOffset>142240</wp:posOffset>
-                      </wp:positionH>
-                      <wp:positionV relativeFrom="paragraph">
-                        <wp:posOffset>147103</wp:posOffset>
-                      </wp:positionV>
-                      <wp:extent cx="248856" cy="231494"/>
-                      <wp:effectExtent l="0" t="0" r="18415" b="16510"/>
-                      <wp:wrapNone/>
-                      <wp:docPr id="1557260172" name="Oval 17"/>
-                      <wp:cNvGraphicFramePr/>
-                      <a:graphic xmlns:a="http://schemas.openxmlformats.org/drawingml/2006/main">
-                        <a:graphicData uri="http://schemas.microsoft.com/office/word/2010/wordprocessingShape">
-                          <wps:wsp>
-                            <wps:cNvSpPr/>
-                            <wps:spPr>
-                              <a:xfrm>
-                                <a:off x="0" y="0"/>
-                                <a:ext cx="248856" cy="231494"/>
-                              </a:xfrm>
-                              <a:prstGeom prst="ellipse">
-                                <a:avLst/>
-                              </a:prstGeom>
-                              <a:noFill/>
-                            </wps:spPr>
-                            <wps:style>
-                              <a:lnRef idx="2">
-                                <a:schemeClr val="accent1">
-                                  <a:shade val="15000"/>
-                                </a:schemeClr>
-                              </a:lnRef>
-                              <a:fillRef idx="1">
-                                <a:schemeClr val="accent1"/>
-                              </a:fillRef>
-                              <a:effectRef idx="0">
-                                <a:schemeClr val="accent1"/>
-                              </a:effectRef>
-                              <a:fontRef idx="minor">
-                                <a:schemeClr val="lt1"/>
-                              </a:fontRef>
-                            </wps:style>
-                            <wps:bodyPr rot="0" spcFirstLastPara="0" vertOverflow="overflow" horzOverflow="overflow" vert="horz" wrap="square" lIns="91440" tIns="45720" rIns="91440" bIns="45720" numCol="1" spcCol="0" rtlCol="0" fromWordArt="0" anchor="ctr" anchorCtr="0" forceAA="0" compatLnSpc="1">
-                              <a:prstTxWarp prst="textNoShape">
-                                <a:avLst/>
-                              </a:prstTxWarp>
-                              <a:noAutofit/>
-                            </wps:bodyPr>
-                          </wps:wsp>
-                        </a:graphicData>
-                      </a:graphic>
-                      <wp14:sizeRelH relativeFrom="margin">
-                        <wp14:pctWidth>0</wp14:pctWidth>
-                      </wp14:sizeRelH>
-                      <wp14:sizeRelV relativeFrom="margin">
-                        <wp14:pctHeight>0</wp14:pctHeight>
-                      </wp14:sizeRelV>
-                    </wp:anchor>
-                  </w:drawing>
-                </mc:Choice>
-                <mc:Fallback>
-                  <w:pict>
-                    <v:oval w14:anchorId="3834128B" id="Oval 17" o:spid="_x0000_s1026" style="position:absolute;margin-left:11.2pt;margin-top:11.6pt;width:19.6pt;height:18.25pt;z-index:251696128;visibility:visible;mso-wrap-style:square;mso-width-percent:0;mso-height-percent:0;mso-wrap-distance-left:9pt;mso-wrap-distance-top:0;mso-wrap-distance-right:9pt;mso-wrap-distance-bottom:0;mso-position-horizontal:absolute;mso-position-horizontal-relative:text;mso-position-vertical:absolute;mso-position-vertical-relative:text;mso-width-percent:0;mso-height-percent:0;mso-width-relative:margin;mso-height-relative:margin;v-text-anchor:middle" o:gfxdata="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" filled="f" strokecolor="#030e13 [484]" strokeweight="1pt">
-                      <v:stroke joinstyle="miter"/>
-                    </v:oval>
-                  </w:pict>
-                </mc:Fallback>
-              </mc:AlternateContent>
-            </w:r>
-            <w:r>
-              <w:rPr>
                 <w:sz w:val="22"/>
                 <w:szCs w:val="22"/>
               </w:rPr>
@@ -4928,42 +4746,35 @@
                 <w:sz w:val="22"/>
                 <w:szCs w:val="22"/>
               </w:rPr>
-              <w:t>{tuition_fee}</w:t>
-            </w:r>
-            <w:r>
-              <w:rPr>
-                <w:sz w:val="22"/>
-                <w:szCs w:val="22"/>
-              </w:rPr>
-              <w:t/>
-            </w:r>
-            <w:r>
-              <w:rPr>
-                <w:sz w:val="22"/>
-                <w:szCs w:val="22"/>
-              </w:rPr>
-              <w:t/>
-            </w:r>
-            <w:r>
-              <w:rPr>
-                <w:sz w:val="22"/>
-                <w:szCs w:val="22"/>
-              </w:rPr>
-              <w:t/>
-            </w:r>
-            <w:r>
-              <w:rPr>
-                <w:sz w:val="22"/>
-                <w:szCs w:val="22"/>
-              </w:rPr>
-              <w:t/>
-            </w:r>
-            <w:r>
-              <w:rPr>
-                <w:sz w:val="22"/>
-                <w:szCs w:val="22"/>
-              </w:rPr>
-              <w:t/>
+              <w:t>___</w:t>
+            </w:r>
+            <w:r>
+              <w:rPr>
+                <w:sz w:val="22"/>
+                <w:szCs w:val="22"/>
+              </w:rPr>
+              <w:t>5</w:t>
+            </w:r>
+            <w:r>
+              <w:rPr>
+                <w:sz w:val="22"/>
+                <w:szCs w:val="22"/>
+              </w:rPr>
+              <w:t>3</w:t>
+            </w:r>
+            <w:r>
+              <w:rPr>
+                <w:sz w:val="22"/>
+                <w:szCs w:val="22"/>
+              </w:rPr>
+              <w:t>65</w:t>
+            </w:r>
+            <w:r>
+              <w:rPr>
+                <w:sz w:val="22"/>
+                <w:szCs w:val="22"/>
+              </w:rPr>
+              <w:t>______________</w:t>
             </w:r>
             <w:r>
               <w:rPr>
@@ -5037,7 +4848,7 @@
                 <w:sz w:val="22"/>
                 <w:szCs w:val="22"/>
               </w:rPr>
-              <w:t>${book_fee}</w:t>
+              <w:t>$___________________</w:t>
             </w:r>
             <w:r>
               <w:rPr>
@@ -5126,21 +4937,21 @@
                 <w:szCs w:val="22"/>
               </w:rPr>
               <w:tab/>
-              <w:t>${compulsory_fee}</w:t>
-            </w:r>
-            <w:r>
-              <w:rPr>
-                <w:sz w:val="22"/>
-                <w:szCs w:val="22"/>
-              </w:rPr>
-              <w:t/>
-            </w:r>
-            <w:r>
-              <w:rPr>
-                <w:sz w:val="22"/>
-                <w:szCs w:val="22"/>
-              </w:rPr>
-              <w:t/>
+              <w:t>$_____________</w:t>
+            </w:r>
+            <w:r>
+              <w:rPr>
+                <w:sz w:val="22"/>
+                <w:szCs w:val="22"/>
+              </w:rPr>
+              <w:t>___</w:t>
+            </w:r>
+            <w:r>
+              <w:rPr>
+                <w:sz w:val="22"/>
+                <w:szCs w:val="22"/>
+              </w:rPr>
+              <w:t>___</w:t>
             </w:r>
             <w:r>
               <w:rPr>
@@ -5228,7 +5039,7 @@
                 <w:sz w:val="22"/>
                 <w:szCs w:val="22"/>
               </w:rPr>
-              <w:t xml:space="preserve">${field_trip_fee} </w:t>
+              <w:t xml:space="preserve">$___________________ </w:t>
             </w:r>
             <w:r>
               <w:rPr>
@@ -5282,21 +5093,21 @@
                 <w:szCs w:val="22"/>
               </w:rPr>
               <w:tab/>
-              <w:t>${uniform_equipment_fee}</w:t>
-            </w:r>
-            <w:r>
-              <w:rPr>
-                <w:sz w:val="22"/>
-                <w:szCs w:val="22"/>
-              </w:rPr>
-              <w:t/>
-            </w:r>
-            <w:r>
-              <w:rPr>
-                <w:sz w:val="22"/>
-                <w:szCs w:val="22"/>
-              </w:rPr>
-              <w:t/>
+              <w:t>$_____________</w:t>
+            </w:r>
+            <w:r>
+              <w:rPr>
+                <w:sz w:val="22"/>
+                <w:szCs w:val="22"/>
+              </w:rPr>
+              <w:t>___</w:t>
+            </w:r>
+            <w:r>
+              <w:rPr>
+                <w:sz w:val="22"/>
+                <w:szCs w:val="22"/>
+              </w:rPr>
+              <w:t>___</w:t>
             </w:r>
             <w:r>
               <w:rPr>
@@ -5378,7 +5189,7 @@
                 <w:sz w:val="22"/>
                 <w:szCs w:val="22"/>
               </w:rPr>
-              <w:t>{professional_exam_fee}</w:t>
+              <w:t>___________________</w:t>
             </w:r>
           </w:p>
           <w:p>
@@ -5424,21 +5235,21 @@
                 <w:sz w:val="22"/>
                 <w:szCs w:val="22"/>
               </w:rPr>
-              <w:t>${expendable_supplies_fee}</w:t>
-            </w:r>
-            <w:r>
-              <w:rPr>
-                <w:sz w:val="22"/>
-                <w:szCs w:val="22"/>
-              </w:rPr>
-              <w:t/>
-            </w:r>
-            <w:r>
-              <w:rPr>
-                <w:sz w:val="22"/>
-                <w:szCs w:val="22"/>
-              </w:rPr>
-              <w:t/>
+              <w:t>$____________</w:t>
+            </w:r>
+            <w:r>
+              <w:rPr>
+                <w:sz w:val="22"/>
+                <w:szCs w:val="22"/>
+              </w:rPr>
+              <w:t>___</w:t>
+            </w:r>
+            <w:r>
+              <w:rPr>
+                <w:sz w:val="22"/>
+                <w:szCs w:val="22"/>
+              </w:rPr>
+              <w:t>____</w:t>
             </w:r>
             <w:r>
               <w:rPr>
@@ -5492,7 +5303,7 @@
                 <w:szCs w:val="22"/>
               </w:rPr>
               <w:tab/>
-              <w:t>${international_fee}</w:t>
+              <w:t>$___________________</w:t>
             </w:r>
             <w:r>
               <w:rPr>
@@ -5565,7 +5376,7 @@
                 <w:sz w:val="22"/>
                 <w:szCs w:val="22"/>
               </w:rPr>
-              <w:t>{optional_fee}</w:t>
+              <w:t>___________________</w:t>
             </w:r>
           </w:p>
           <w:p>
@@ -5652,7 +5463,7 @@
                 <w:sz w:val="22"/>
                 <w:szCs w:val="22"/>
               </w:rPr>
-              <w:t xml:space="preserve"> {total_fees}</w:t>
+              <w:t xml:space="preserve"> ____</w:t>
             </w:r>
             <w:r>
               <w:rPr>
@@ -5661,7 +5472,7 @@
                 <w:sz w:val="22"/>
                 <w:szCs w:val="22"/>
               </w:rPr>
-              <w:t/>
+              <w:t>5</w:t>
             </w:r>
             <w:r>
               <w:rPr>
@@ -5670,7 +5481,7 @@
                 <w:sz w:val="22"/>
                 <w:szCs w:val="22"/>
               </w:rPr>
-              <w:t/>
+              <w:t>3</w:t>
             </w:r>
             <w:r>
               <w:rPr>
@@ -5679,7 +5490,7 @@
                 <w:sz w:val="22"/>
                 <w:szCs w:val="22"/>
               </w:rPr>
-              <w:t/>
+              <w:t>65</w:t>
             </w:r>
             <w:r>
               <w:rPr>
@@ -5688,7 +5499,7 @@
                 <w:sz w:val="22"/>
                 <w:szCs w:val="22"/>
               </w:rPr>
-              <w:t/>
+              <w:t>______</w:t>
             </w:r>
             <w:r>
               <w:rPr>
@@ -5697,7 +5508,7 @@
                 <w:sz w:val="22"/>
                 <w:szCs w:val="22"/>
               </w:rPr>
-              <w:t/>
+              <w:t>__</w:t>
             </w:r>
             <w:r>
               <w:rPr>
@@ -5706,7 +5517,7 @@
                 <w:sz w:val="22"/>
                 <w:szCs w:val="22"/>
               </w:rPr>
-              <w:t/>
+              <w:t>_______</w:t>
             </w:r>
             <w:r>
               <w:rPr>
@@ -5852,7 +5663,7 @@
                 <w:sz w:val="22"/>
                 <w:szCs w:val="22"/>
               </w:rPr>
-              <w:t>{payment_before_signing}</w:t>
+              <w:t>865</w:t>
             </w:r>
           </w:p>
           <w:p>
@@ -5911,7 +5722,7 @@
                 <w:sz w:val="22"/>
                 <w:szCs w:val="22"/>
               </w:rPr>
-              <w:t>{payment_after_signing}</w:t>
+              <w:t>NIL</w:t>
             </w:r>
           </w:p>
           <w:p>
@@ -6064,7 +5875,7 @@
                       <w:sz w:val="22"/>
                       <w:szCs w:val="22"/>
                     </w:rPr>
-                    <w:t>{installment_1_due_date}</w:t>
+                    <w:t>01/06/2026</w:t>
                   </w:r>
                 </w:p>
               </w:tc>
@@ -6089,7 +5900,7 @@
                       <w:sz w:val="22"/>
                       <w:szCs w:val="22"/>
                     </w:rPr>
-                    <w:t>{installment_1_amount}</w:t>
+                    <w:t>900</w:t>
                   </w:r>
                 </w:p>
               </w:tc>
@@ -6151,7 +5962,7 @@
                       <w:sz w:val="22"/>
                       <w:szCs w:val="22"/>
                     </w:rPr>
-                    <w:t>{installment_2_due_date}</w:t>
+                    <w:t>01/07/2026</w:t>
                   </w:r>
                 </w:p>
               </w:tc>
@@ -6176,7 +5987,7 @@
                       <w:sz w:val="22"/>
                       <w:szCs w:val="22"/>
                     </w:rPr>
-                    <w:t>{installment_2_amount}</w:t>
+                    <w:t>900</w:t>
                   </w:r>
                 </w:p>
               </w:tc>
@@ -6238,7 +6049,7 @@
                       <w:sz w:val="22"/>
                       <w:szCs w:val="22"/>
                     </w:rPr>
-                    <w:t>{installment_3_due_date}</w:t>
+                    <w:t>01/08/2026</w:t>
                   </w:r>
                 </w:p>
               </w:tc>
@@ -6263,7 +6074,7 @@
                       <w:sz w:val="22"/>
                       <w:szCs w:val="22"/>
                     </w:rPr>
-                    <w:t>{installment_3_amount}</w:t>
+                    <w:t>900</w:t>
                   </w:r>
                 </w:p>
               </w:tc>
@@ -6325,7 +6136,7 @@
                       <w:sz w:val="22"/>
                       <w:szCs w:val="22"/>
                     </w:rPr>
-                    <w:t>{installment_4_due_date}</w:t>
+                    <w:t>01/0</w:t>
                   </w:r>
                   <w:r>
                     <w:rPr>
@@ -6334,7 +6145,7 @@
                       <w:sz w:val="22"/>
                       <w:szCs w:val="22"/>
                     </w:rPr>
-                    <w:t/>
+                    <w:t>9</w:t>
                   </w:r>
                   <w:r>
                     <w:rPr>
@@ -6343,7 +6154,7 @@
                       <w:sz w:val="22"/>
                       <w:szCs w:val="22"/>
                     </w:rPr>
-                    <w:t/>
+                    <w:t>/2026</w:t>
                   </w:r>
                 </w:p>
               </w:tc>
@@ -6368,7 +6179,7 @@
                       <w:sz w:val="22"/>
                       <w:szCs w:val="22"/>
                     </w:rPr>
-                    <w:t>{installment_4_amount}</w:t>
+                    <w:t>900</w:t>
                   </w:r>
                 </w:p>
               </w:tc>
@@ -6430,7 +6241,7 @@
                       <w:sz w:val="22"/>
                       <w:szCs w:val="22"/>
                     </w:rPr>
-                    <w:t>{installment_5_due_date}</w:t>
+                    <w:t>01/10/2026</w:t>
                   </w:r>
                 </w:p>
               </w:tc>
@@ -6455,7 +6266,7 @@
                       <w:sz w:val="22"/>
                       <w:szCs w:val="22"/>
                     </w:rPr>
-                    <w:t>{installment_5_amount}</w:t>
+                    <w:t>900</w:t>
                   </w:r>
                 </w:p>
               </w:tc>
@@ -6785,7 +6596,7 @@
                 <w:sz w:val="22"/>
                 <w:szCs w:val="22"/>
               </w:rPr>
-              <w:t>{installment_total}</w:t>
+              <w:t>4</w:t>
             </w:r>
             <w:r>
               <w:rPr>
@@ -6794,7 +6605,7 @@
                 <w:sz w:val="22"/>
                 <w:szCs w:val="22"/>
               </w:rPr>
-              <w:t/>
+              <w:t>500</w:t>
             </w:r>
             <w:r>
               <w:rPr>
@@ -7024,7 +6835,7 @@
                 <w:sz w:val="22"/>
                 <w:szCs w:val="22"/>
               </w:rPr>
-              <w:t>{total_payments}</w:t>
+              <w:t>5</w:t>
             </w:r>
             <w:r>
               <w:rPr>
@@ -7033,7 +6844,7 @@
                 <w:sz w:val="22"/>
                 <w:szCs w:val="22"/>
               </w:rPr>
-              <w:t/>
+              <w:t>3</w:t>
             </w:r>
             <w:r>
               <w:rPr>
@@ -7042,7 +6853,7 @@
                 <w:sz w:val="22"/>
                 <w:szCs w:val="22"/>
               </w:rPr>
-              <w:t/>
+              <w:t>65</w:t>
             </w:r>
           </w:p>
           <w:p>
@@ -7133,7 +6944,7 @@
                 <w:sz w:val="28"/>
                 <w:szCs w:val="28"/>
               </w:rPr>
-              <w:t>{student_full_name}</w:t>
+              <w:t>CHIDI GLORIA AROWOLO</w:t>
             </w:r>
           </w:p>
           <w:p>
@@ -7417,7 +7228,7 @@
                 <w:sz w:val="28"/>
                 <w:szCs w:val="28"/>
               </w:rPr>
-              <w:t>{student_full_name}</w:t>
+              <w:t>CHIDI GLORIA AROWOLO</w:t>
             </w:r>
             <w:r>
               <w:rPr>
@@ -9264,7 +9075,7 @@
                 <w:sz w:val="22"/>
                 <w:szCs w:val="22"/>
               </w:rPr>
-              <w:t>{program_name}</w:t>
+              <w:t>NACC Personal Support Worker (PSW)</w:t>
             </w:r>
             <w:r>
               <w:rPr>
@@ -9678,7 +9489,7 @@
                 <w:sz w:val="32"/>
                 <w:szCs w:val="32"/>
               </w:rPr>
-              <w:t>{student_full_name}</w:t>
+              <w:t>CHIDI GLORIA AROWOLO</w:t>
             </w:r>
             <w:r>
               <w:rPr>
@@ -10055,21 +9866,7 @@
                 <w:sz w:val="22"/>
                 <w:szCs w:val="22"/>
               </w:rPr>
-              <w:t xml:space="preserve">I understand that I can refuse to sign this consent form and that I can withdraw my consent at any time for future uses of my personal information by writing to the Chief Operating Officer at 25 </w:t>
-            </w:r>
-            <w:r>
-              <w:rPr>
-                <w:sz w:val="22"/>
-                <w:szCs w:val="22"/>
-              </w:rPr>
-              <w:t>Watline</w:t>
-            </w:r>
-            <w:r>
-              <w:rPr>
-                <w:sz w:val="22"/>
-                <w:szCs w:val="22"/>
-              </w:rPr>
-              <w:t xml:space="preserve"> Avenue, Unit 204 Mississauga, Ontario, L4Z 2Z1. I understand that if I refuse or withdraw my consent the Superintendent may not be able to contact me to inform me of my rights under the Act or collect information to help potential students make informed decisions about their educational choices.</w:t>
+              <w:t>I understand that I can refuse to sign this consent form and that I can withdraw my consent at any time for future uses of my personal information by writing to the Chief Operating Officer at 25 Watline Avenue, Unit 204 Mississauga, Ontario, L4Z 2Z1. I understand that if I refuse or withdraw my consent the Superintendent may not be able to contact me to inform me of my rights under the Act or collect information to help potential students make informed decisions about their educational choices.</w:t>
             </w:r>
           </w:p>
           <w:p>
@@ -10116,7 +9913,7 @@
                 <w:sz w:val="28"/>
                 <w:szCs w:val="28"/>
               </w:rPr>
-              <w:t>{student_full_name}</w:t>
+              <w:t>CHIDI GLORIA AROWOLO</w:t>
             </w:r>
           </w:p>
           <w:p>
@@ -10595,21 +10392,7 @@
                 <w:sz w:val="22"/>
                 <w:szCs w:val="22"/>
               </w:rPr>
-              <w:t xml:space="preserve"> mid-point” means the point in the progress of a vocational program where half of the scheduled hours of instruction for the program have taken place; (“mi-</w:t>
-            </w:r>
-            <w:r>
-              <w:rPr>
-                <w:sz w:val="22"/>
-                <w:szCs w:val="22"/>
-              </w:rPr>
-              <w:t>parcours</w:t>
-            </w:r>
-            <w:r>
-              <w:rPr>
-                <w:sz w:val="22"/>
-                <w:szCs w:val="22"/>
-              </w:rPr>
-              <w:t xml:space="preserve"> du programme”) </w:t>
+              <w:t xml:space="preserve"> mid-point” means the point in the progress of a vocational program where half of the scheduled hours of instruction for the program have taken place; (“mi-parcours du programme”) </w:t>
             </w:r>
           </w:p>
           <w:p>
@@ -13035,7 +12818,7 @@
           <w:lang w:val="en-US"/>
           <w14:ligatures w14:val="none"/>
         </w:rPr>
-        <w:t>{program_name}</w:t>
+        <w:t>NACC</w:t>
       </w:r>
       <w:r>
         <w:rPr>
@@ -13049,7 +12832,7 @@
           <w:lang w:val="en-US"/>
           <w14:ligatures w14:val="none"/>
         </w:rPr>
-        <w:t xml:space="preserve"/>
+        <w:t xml:space="preserve"> </w:t>
       </w:r>
       <w:r>
         <w:rPr>
@@ -13062,7 +12845,7 @@
           <w:lang w:val="en-US"/>
           <w14:ligatures w14:val="none"/>
         </w:rPr>
-        <w:t/>
+        <w:t>Personal Support Worker (PSW)</w:t>
       </w:r>
       <w:r>
         <w:rPr>
@@ -15138,7 +14921,7 @@
           <w:sz w:val="28"/>
           <w:szCs w:val="28"/>
         </w:rPr>
-        <w:t>{student_full_name}</w:t>
+        <w:t>CHIDI GLORIA AROWOLO</w:t>
       </w:r>
       <w:r>
         <w:rPr>
@@ -15503,29 +15286,7 @@
           <w:lang w:val="en-US"/>
           <w14:ligatures w14:val="none"/>
         </w:rPr>
-        <w:t xml:space="preserve">submit up-to-date immunization status within 45 days of commencement of study and that I must, while enrolled in the program, maintain this status </w:t>
-      </w:r>
-      <w:r>
-        <w:rPr>
-          <w:rFonts w:ascii="Calibri" w:eastAsia="Calibri" w:hAnsi="Calibri" w:cs="Calibri"/>
-          <w:kern w:val="0"/>
-          <w:sz w:val="23"/>
-          <w:szCs w:val="23"/>
-          <w:lang w:val="en-US"/>
-          <w14:ligatures w14:val="none"/>
-        </w:rPr>
-        <w:t>in order to</w:t>
-      </w:r>
-      <w:r>
-        <w:rPr>
-          <w:rFonts w:ascii="Calibri" w:eastAsia="Calibri" w:hAnsi="Calibri" w:cs="Calibri"/>
-          <w:kern w:val="0"/>
-          <w:sz w:val="23"/>
-          <w:szCs w:val="23"/>
-          <w:lang w:val="en-US"/>
-          <w14:ligatures w14:val="none"/>
-        </w:rPr>
-        <w:t xml:space="preserve"> complete the practicum placement and graduate.</w:t>
+        <w:t>submit up-to-date immunization status within 45 days of commencement of study and that I must, while enrolled in the program, maintain this status in order to complete the practicum placement and graduate.</w:t>
       </w:r>
     </w:p>
     <w:p>
@@ -20159,7 +19920,7 @@
           <w:sz w:val="28"/>
           <w:szCs w:val="28"/>
         </w:rPr>
-        <w:t>{student_full_name}</w:t>
+        <w:t>CHIDI GLORIA AROWOLO</w:t>
       </w:r>
       <w:r>
         <w:rPr>
@@ -22104,7 +21865,7 @@
           <w:sz w:val="22"/>
           <w:szCs w:val="22"/>
         </w:rPr>
-        <w:t>{program_name}</w:t>
+        <w:t>Personal Support Worker (PSW) Program</w:t>
       </w:r>
       <w:r>
         <w:rPr>
@@ -22174,50 +21935,34 @@
           <w:sz w:val="22"/>
           <w:szCs w:val="22"/>
         </w:rPr>
-        <w:t xml:space="preserve">We ask that you read the following carefully and sign below to acknowledge </w:t>
-      </w:r>
-      <w:r>
+        <w:t>We ask that you read the following carefully and sign below to acknowledge your understanding and agreement.</w:t>
+      </w:r>
+    </w:p>
+    <w:p>
+      <w:pPr>
+        <w:pStyle w:val="Default"/>
         <w:rPr>
           <w:rFonts w:asciiTheme="minorHAnsi" w:hAnsiTheme="minorHAnsi"/>
           <w:sz w:val="22"/>
           <w:szCs w:val="22"/>
         </w:rPr>
-        <w:t>your</w:t>
-      </w:r>
-      <w:r>
+      </w:pPr>
+    </w:p>
+    <w:p>
+      <w:pPr>
+        <w:pStyle w:val="Default"/>
         <w:rPr>
           <w:rFonts w:asciiTheme="minorHAnsi" w:hAnsiTheme="minorHAnsi"/>
           <w:sz w:val="22"/>
           <w:szCs w:val="22"/>
         </w:rPr>
-        <w:t xml:space="preserve"> understanding and agreement.</w:t>
-      </w:r>
-    </w:p>
-    <w:p>
-      <w:pPr>
-        <w:pStyle w:val="Default"/>
+      </w:pPr>
+      <w:r>
         <w:rPr>
           <w:rFonts w:asciiTheme="minorHAnsi" w:hAnsiTheme="minorHAnsi"/>
           <w:sz w:val="22"/>
           <w:szCs w:val="22"/>
         </w:rPr>
-      </w:pPr>
-    </w:p>
-    <w:p>
-      <w:pPr>
-        <w:pStyle w:val="Default"/>
-        <w:rPr>
-          <w:rFonts w:asciiTheme="minorHAnsi" w:hAnsiTheme="minorHAnsi"/>
-          <w:sz w:val="22"/>
-          <w:szCs w:val="22"/>
-        </w:rPr>
-      </w:pPr>
-      <w:r>
-        <w:rPr>
-          <w:rFonts w:asciiTheme="minorHAnsi" w:hAnsiTheme="minorHAnsi"/>
-          <w:sz w:val="22"/>
-          <w:szCs w:val="22"/>
-        </w:rPr>
         <w:pict w14:anchorId="76A3705E">
           <v:rect id="_x0000_i1025" style="width:0;height:1.5pt" o:hralign="center" o:hrstd="t" o:hr="t" fillcolor="#a0a0a0" stroked="f"/>
         </w:pict>
@@ -22242,7 +21987,7 @@
           <w:sz w:val="22"/>
           <w:szCs w:val="22"/>
         </w:rPr>
-        <w:t/>
+        <w:t>📌</w:t>
       </w:r>
       <w:r>
         <w:rPr>
@@ -22372,23 +22117,7 @@
           <w:sz w:val="22"/>
           <w:szCs w:val="22"/>
         </w:rPr>
-        <w:t xml:space="preserve"> manner </w:t>
-      </w:r>
-      <w:r>
-        <w:rPr>
-          <w:rFonts w:asciiTheme="minorHAnsi" w:hAnsiTheme="minorHAnsi"/>
-          <w:sz w:val="22"/>
-          <w:szCs w:val="22"/>
-        </w:rPr>
-        <w:t>at all times</w:t>
-      </w:r>
-      <w:r>
-        <w:rPr>
-          <w:rFonts w:asciiTheme="minorHAnsi" w:hAnsiTheme="minorHAnsi"/>
-          <w:sz w:val="22"/>
-          <w:szCs w:val="22"/>
-        </w:rPr>
-        <w:t>.</w:t>
+        <w:t xml:space="preserve"> manner at all times.</w:t>
       </w:r>
     </w:p>
     <w:p>
@@ -22965,7 +22694,7 @@
           <w:sz w:val="22"/>
           <w:szCs w:val="22"/>
         </w:rPr>
-        <w:t>{total_practicum_hours} hours</w:t>
+        <w:t>300 hours</w:t>
       </w:r>
       <w:r>
         <w:rPr>
@@ -22995,7 +22724,7 @@
           <w:sz w:val="22"/>
           <w:szCs w:val="22"/>
         </w:rPr>
-        <w:t xml:space="preserve">{practicum_1_hours} hours in a </w:t>
+        <w:t xml:space="preserve">200 hours in a </w:t>
       </w:r>
       <w:r>
         <w:rPr>
@@ -23035,7 +22764,7 @@
           <w:sz w:val="22"/>
           <w:szCs w:val="22"/>
         </w:rPr>
-        <w:t xml:space="preserve">{practicum_2_hours} hours in a </w:t>
+        <w:t xml:space="preserve">100 hours in a </w:t>
       </w:r>
       <w:r>
         <w:rPr>
@@ -23195,23 +22924,7 @@
           <w:sz w:val="22"/>
           <w:szCs w:val="22"/>
         </w:rPr>
-        <w:t xml:space="preserve">, with proper </w:t>
-      </w:r>
-      <w:r>
-        <w:rPr>
-          <w:rFonts w:asciiTheme="minorHAnsi" w:hAnsiTheme="minorHAnsi"/>
-          <w:sz w:val="22"/>
-          <w:szCs w:val="22"/>
-        </w:rPr>
-        <w:t>sign-offs</w:t>
-      </w:r>
-      <w:r>
-        <w:rPr>
-          <w:rFonts w:asciiTheme="minorHAnsi" w:hAnsiTheme="minorHAnsi"/>
-          <w:sz w:val="22"/>
-          <w:szCs w:val="22"/>
-        </w:rPr>
-        <w:t>.</w:t>
+        <w:t>, with proper sign-offs.</w:t>
       </w:r>
     </w:p>
     <w:p>
@@ -23423,7 +23136,7 @@
           <w:sz w:val="22"/>
           <w:szCs w:val="22"/>
         </w:rPr>
-        <w:t/>
+        <w:t>📄</w:t>
       </w:r>
       <w:r>
         <w:rPr>
@@ -23512,7 +23225,7 @@
           <w:sz w:val="28"/>
           <w:szCs w:val="28"/>
         </w:rPr>
-        <w:t>{student_full_name}</w:t>
+        <w:t>CHIDI GLORIA AROWOLO</w:t>
       </w:r>
       <w:r>
         <w:rPr>
@@ -23838,7 +23551,7 @@
           <w:sz w:val="28"/>
           <w:szCs w:val="28"/>
         </w:rPr>
-        <w:t>{student_full_name}</w:t>
+        <w:t>CHIDI GLORIA AROWOLO</w:t>
       </w:r>
       <w:r>
         <w:rPr>
@@ -23868,7 +23581,7 @@
           <w:sz w:val="22"/>
           <w:szCs w:val="22"/>
         </w:rPr>
-        <w:t>{program_name}</w:t>
+        <w:t>NACC PSW</w:t>
       </w:r>
       <w:r>
         <w:rPr>
@@ -23899,7 +23612,7 @@
           <w:sz w:val="22"/>
           <w:szCs w:val="22"/>
         </w:rPr>
-        <w:t>{program_start_date}</w:t>
+        <w:t>27</w:t>
       </w:r>
       <w:r>
         <w:rPr>
@@ -23908,7 +23621,7 @@
           <w:sz w:val="22"/>
           <w:szCs w:val="22"/>
         </w:rPr>
-        <w:t/>
+        <w:t>/</w:t>
       </w:r>
       <w:r>
         <w:rPr>
@@ -23917,7 +23630,7 @@
           <w:sz w:val="22"/>
           <w:szCs w:val="22"/>
         </w:rPr>
-        <w:t/>
+        <w:t>04</w:t>
       </w:r>
       <w:r>
         <w:rPr>
@@ -23926,7 +23639,7 @@
           <w:sz w:val="22"/>
           <w:szCs w:val="22"/>
         </w:rPr>
-        <w:t/>
+        <w:t>/202</w:t>
       </w:r>
       <w:r>
         <w:rPr>
@@ -23935,7 +23648,7 @@
           <w:sz w:val="22"/>
           <w:szCs w:val="22"/>
         </w:rPr>
-        <w:t/>
+        <w:t>6</w:t>
       </w:r>
       <w:r>
         <w:rPr>
@@ -23972,7 +23685,7 @@
           <w:sz w:val="22"/>
           <w:szCs w:val="22"/>
         </w:rPr>
-        <w:t>{expected_completion_date}</w:t>
+        <w:t>25/</w:t>
       </w:r>
       <w:r>
         <w:rPr>
@@ -23981,7 +23694,7 @@
           <w:sz w:val="22"/>
           <w:szCs w:val="22"/>
         </w:rPr>
-        <w:t/>
+        <w:t>10</w:t>
       </w:r>
       <w:r>
         <w:rPr>
@@ -23990,7 +23703,7 @@
           <w:sz w:val="22"/>
           <w:szCs w:val="22"/>
         </w:rPr>
-        <w:t/>
+        <w:t>/2026</w:t>
       </w:r>
     </w:p>
     <w:p>
@@ -24249,21 +23962,7 @@
           <w:szCs w:val="22"/>
         </w:rPr>
         <w:br/>
-        <w:t xml:space="preserve">I understand that it is my responsibility to ensure compliance with Immigration, Refugees and Citizenship Canada (IRCC) regulations </w:t>
-      </w:r>
-      <w:r>
-        <w:rPr>
-          <w:sz w:val="22"/>
-          <w:szCs w:val="22"/>
-        </w:rPr>
-        <w:t>at all times</w:t>
-      </w:r>
-      <w:r>
-        <w:rPr>
-          <w:sz w:val="22"/>
-          <w:szCs w:val="22"/>
-        </w:rPr>
-        <w:t>, and to seek legal or immigration counsel if needed.</w:t>
+        <w:t>I understand that it is my responsibility to ensure compliance with Immigration, Refugees and Citizenship Canada (IRCC) regulations at all times, and to seek legal or immigration counsel if needed.</w:t>
       </w:r>
     </w:p>
     <w:p>
@@ -24683,7 +24382,7 @@
           <w:sz w:val="28"/>
           <w:szCs w:val="28"/>
         </w:rPr>
-        <w:t>{student_full_name}</w:t>
+        <w:t>CHIDI GLORIA AROWOLO</w:t>
       </w:r>
     </w:p>
     <w:p>

</xml_diff>

<commit_message>
Fix contract effective date (#32)
</commit_message>
<xml_diff>
--- a/src/templates/contracts/student-enrolment-template.docx
+++ b/src/templates/contracts/student-enrolment-template.docx
@@ -193,7 +193,7 @@
                 <w:sz w:val="22"/>
                 <w:szCs w:val="22"/>
               </w:rPr>
-              <w:t>{contract_date}</w:t>
+              <w:t>02/05/2024</w:t>
             </w:r>
             <w:r>
               <w:rPr>
@@ -346,7 +346,7 @@
                 <w:sz w:val="28"/>
                 <w:szCs w:val="28"/>
               </w:rPr>
-              <w:t>{student_full_name}</w:t>
+              <w:t>CHIDI GLORIA AROWOLO</w:t>
             </w:r>
             <w:r>
               <w:rPr>
@@ -381,7 +381,7 @@
                 <w:sz w:val="28"/>
                 <w:szCs w:val="28"/>
               </w:rPr>
-              <w:t>{student_number}</w:t>
+              <w:t>PSW</w:t>
             </w:r>
             <w:r>
               <w:rPr>
@@ -390,7 +390,7 @@
                 <w:sz w:val="28"/>
                 <w:szCs w:val="28"/>
               </w:rPr>
-              <w:t xml:space="preserve"/>
+              <w:t xml:space="preserve"> </w:t>
             </w:r>
             <w:r>
               <w:rPr>
@@ -399,7 +399,7 @@
                 <w:sz w:val="28"/>
                 <w:szCs w:val="28"/>
               </w:rPr>
-              <w:t/>
+              <w:t>1</w:t>
             </w:r>
             <w:r>
               <w:rPr>
@@ -408,7 +408,7 @@
                 <w:sz w:val="28"/>
                 <w:szCs w:val="28"/>
               </w:rPr>
-              <w:t/>
+              <w:t>25</w:t>
             </w:r>
             <w:r>
               <w:rPr>
@@ -417,7 +417,7 @@
                 <w:sz w:val="28"/>
                 <w:szCs w:val="28"/>
               </w:rPr>
-              <w:t/>
+              <w:t>300</w:t>
             </w:r>
           </w:p>
           <w:p>
@@ -476,7 +476,7 @@
                 <w:sz w:val="22"/>
                 <w:szCs w:val="22"/>
               </w:rPr>
-              <w:t>{mailing_address}</w:t>
+              <w:t>1</w:t>
             </w:r>
             <w:r>
               <w:rPr>
@@ -485,7 +485,7 @@
                 <w:sz w:val="22"/>
                 <w:szCs w:val="22"/>
               </w:rPr>
-              <w:t/>
+              <w:t>09 PRESTON MEADOW AVENUE</w:t>
             </w:r>
           </w:p>
           <w:p>
@@ -538,7 +538,7 @@
                 <w:sz w:val="22"/>
                 <w:szCs w:val="22"/>
               </w:rPr>
-              <w:t>{city}</w:t>
+              <w:t>DRYDEN</w:t>
             </w:r>
             <w:r>
               <w:rPr>
@@ -617,7 +617,7 @@
                 <w:sz w:val="22"/>
                 <w:szCs w:val="22"/>
               </w:rPr>
-              <w:t>{province}</w:t>
+              <w:t>ONTARIO</w:t>
             </w:r>
             <w:r>
               <w:rPr>
@@ -675,7 +675,7 @@
                 <w:sz w:val="22"/>
                 <w:szCs w:val="22"/>
               </w:rPr>
-              <w:t>{postal_code}</w:t>
+              <w:t>L4Z OC3</w:t>
             </w:r>
           </w:p>
           <w:p>
@@ -732,7 +732,7 @@
                 <w:sz w:val="22"/>
                 <w:szCs w:val="22"/>
               </w:rPr>
-              <w:t>{phone}</w:t>
+              <w:t>437-225-8728</w:t>
             </w:r>
             <w:r>
               <w:rPr>
@@ -741,125 +741,461 @@
                 <w:sz w:val="22"/>
                 <w:szCs w:val="22"/>
               </w:rPr>
-              <w:t/>
-            </w:r>
-            <w:r>
+              <w:t xml:space="preserve">  </w:t>
+            </w:r>
+            <w:r>
+              <w:rPr>
+                <w:sz w:val="22"/>
+                <w:szCs w:val="22"/>
+              </w:rPr>
+              <w:tab/>
+            </w:r>
+            <w:r>
+              <w:rPr>
+                <w:sz w:val="22"/>
+                <w:szCs w:val="22"/>
+              </w:rPr>
+              <w:tab/>
+            </w:r>
+            <w:r>
+              <w:rPr>
+                <w:sz w:val="22"/>
+                <w:szCs w:val="22"/>
+              </w:rPr>
+              <w:tab/>
+            </w:r>
+            <w:r>
+              <w:rPr>
+                <w:sz w:val="22"/>
+                <w:szCs w:val="22"/>
+              </w:rPr>
+              <w:t xml:space="preserve">     </w:t>
+            </w:r>
+            <w:r>
+              <w:rPr>
+                <w:sz w:val="22"/>
+                <w:szCs w:val="22"/>
+              </w:rPr>
+              <w:t xml:space="preserve">  </w:t>
+            </w:r>
+            <w:r>
+              <w:rPr>
+                <w:sz w:val="22"/>
+                <w:szCs w:val="22"/>
+              </w:rPr>
+              <w:t xml:space="preserve">   </w:t>
+            </w:r>
+            <w:r>
+              <w:rPr>
+                <w:sz w:val="22"/>
+                <w:szCs w:val="22"/>
+              </w:rPr>
+              <w:t>Alternative Phone</w:t>
+            </w:r>
+            <w:r>
+              <w:rPr>
+                <w:sz w:val="22"/>
+                <w:szCs w:val="22"/>
+              </w:rPr>
+              <w:t>:</w:t>
+            </w:r>
+            <w:r>
+              <w:rPr>
+                <w:sz w:val="22"/>
+                <w:szCs w:val="22"/>
+              </w:rPr>
+              <w:t xml:space="preserve">  </w:t>
+            </w:r>
+            <w:r>
+              <w:rPr>
+                <w:sz w:val="22"/>
+                <w:szCs w:val="22"/>
+              </w:rPr>
+              <w:t>________________</w:t>
+            </w:r>
+            <w:r>
+              <w:rPr>
+                <w:sz w:val="22"/>
+                <w:szCs w:val="22"/>
+              </w:rPr>
+              <w:tab/>
+            </w:r>
+            <w:r>
+              <w:rPr>
+                <w:sz w:val="22"/>
+                <w:szCs w:val="22"/>
+              </w:rPr>
+              <w:tab/>
+            </w:r>
+            <w:r>
+              <w:rPr>
+                <w:sz w:val="22"/>
+                <w:szCs w:val="22"/>
+              </w:rPr>
+              <w:tab/>
+            </w:r>
+          </w:p>
+          <w:p>
+            <w:pPr>
+              <w:pStyle w:val="Default"/>
+              <w:rPr>
+                <w:sz w:val="22"/>
+                <w:szCs w:val="22"/>
+              </w:rPr>
+            </w:pPr>
+          </w:p>
+          <w:p>
+            <w:pPr>
+              <w:pStyle w:val="Default"/>
+              <w:rPr>
+                <w:sz w:val="22"/>
+                <w:szCs w:val="22"/>
+              </w:rPr>
+            </w:pPr>
+            <w:r>
+              <w:rPr>
+                <w:sz w:val="22"/>
+                <w:szCs w:val="22"/>
+                <w:u w:val="single"/>
+              </w:rPr>
+              <w:t>Permanent Address</w:t>
+            </w:r>
+            <w:r>
+              <w:rPr>
+                <w:sz w:val="22"/>
+                <w:szCs w:val="22"/>
+              </w:rPr>
+              <w:t xml:space="preserve"> (if different from mailing address) </w:t>
+            </w:r>
+          </w:p>
+          <w:p>
+            <w:pPr>
+              <w:pStyle w:val="Default"/>
+              <w:rPr>
+                <w:sz w:val="22"/>
+                <w:szCs w:val="22"/>
+              </w:rPr>
+            </w:pPr>
+          </w:p>
+          <w:p>
+            <w:pPr>
+              <w:pStyle w:val="Default"/>
+              <w:rPr>
+                <w:sz w:val="22"/>
+                <w:szCs w:val="22"/>
+              </w:rPr>
+            </w:pPr>
+            <w:r>
+              <w:rPr>
+                <w:sz w:val="22"/>
+                <w:szCs w:val="22"/>
+              </w:rPr>
+              <w:t>City</w:t>
+            </w:r>
+            <w:r>
+              <w:rPr>
+                <w:sz w:val="22"/>
+                <w:szCs w:val="22"/>
+              </w:rPr>
+              <w:t>: _</w:t>
+            </w:r>
+            <w:r>
+              <w:rPr>
+                <w:sz w:val="22"/>
+                <w:szCs w:val="22"/>
+              </w:rPr>
+              <w:t>_________________</w:t>
+            </w:r>
+            <w:r>
+              <w:rPr>
+                <w:sz w:val="22"/>
+                <w:szCs w:val="22"/>
+              </w:rPr>
+              <w:t xml:space="preserve">  </w:t>
+            </w:r>
+            <w:r>
+              <w:rPr>
+                <w:sz w:val="22"/>
+                <w:szCs w:val="22"/>
+              </w:rPr>
+              <w:t xml:space="preserve">  </w:t>
+            </w:r>
+            <w:r>
+              <w:rPr>
+                <w:sz w:val="22"/>
+                <w:szCs w:val="22"/>
+              </w:rPr>
+              <w:t xml:space="preserve"> </w:t>
+            </w:r>
+            <w:r>
+              <w:rPr>
+                <w:sz w:val="22"/>
+                <w:szCs w:val="22"/>
+              </w:rPr>
+              <w:tab/>
+            </w:r>
+            <w:r>
+              <w:rPr>
+                <w:sz w:val="22"/>
+                <w:szCs w:val="22"/>
+              </w:rPr>
+              <w:t xml:space="preserve"> </w:t>
+            </w:r>
+            <w:r>
+              <w:rPr>
+                <w:sz w:val="22"/>
+                <w:szCs w:val="22"/>
+              </w:rPr>
+              <w:t>Province</w:t>
+            </w:r>
+            <w:r>
+              <w:rPr>
+                <w:sz w:val="22"/>
+                <w:szCs w:val="22"/>
+              </w:rPr>
+              <w:t>:</w:t>
+            </w:r>
+            <w:r>
+              <w:rPr>
+                <w:sz w:val="22"/>
+                <w:szCs w:val="22"/>
+              </w:rPr>
+              <w:t xml:space="preserve"> </w:t>
+            </w:r>
+            <w:r>
+              <w:rPr>
+                <w:sz w:val="22"/>
+                <w:szCs w:val="22"/>
+              </w:rPr>
+              <w:t xml:space="preserve">________                </w:t>
+            </w:r>
+            <w:r>
+              <w:rPr>
+                <w:sz w:val="22"/>
+                <w:szCs w:val="22"/>
+              </w:rPr>
+              <w:t>Postal Code</w:t>
+            </w:r>
+            <w:r>
+              <w:rPr>
+                <w:sz w:val="22"/>
+                <w:szCs w:val="22"/>
+              </w:rPr>
+              <w:t>:</w:t>
+            </w:r>
+            <w:r>
+              <w:rPr>
+                <w:sz w:val="22"/>
+                <w:szCs w:val="22"/>
+              </w:rPr>
+              <w:t xml:space="preserve"> </w:t>
+            </w:r>
+            <w:r>
+              <w:rPr>
+                <w:sz w:val="22"/>
+                <w:szCs w:val="22"/>
+              </w:rPr>
+              <w:t>__________</w:t>
+            </w:r>
+          </w:p>
+          <w:p>
+            <w:pPr>
+              <w:pStyle w:val="Default"/>
+              <w:rPr>
+                <w:sz w:val="22"/>
+                <w:szCs w:val="22"/>
+              </w:rPr>
+            </w:pPr>
+          </w:p>
+          <w:p>
+            <w:pPr>
+              <w:pStyle w:val="Default"/>
+              <w:rPr>
+                <w:sz w:val="22"/>
+                <w:szCs w:val="22"/>
+              </w:rPr>
+            </w:pPr>
+            <w:r>
+              <w:rPr>
+                <w:sz w:val="22"/>
+                <w:szCs w:val="22"/>
+              </w:rPr>
+              <w:t>Country</w:t>
+            </w:r>
+            <w:r>
+              <w:rPr>
+                <w:sz w:val="22"/>
+                <w:szCs w:val="22"/>
+              </w:rPr>
+              <w:t>:</w:t>
+            </w:r>
+            <w:r>
+              <w:rPr>
+                <w:sz w:val="22"/>
+                <w:szCs w:val="22"/>
+              </w:rPr>
+              <w:t xml:space="preserve"> </w:t>
+            </w:r>
+            <w:r>
+              <w:rPr>
+                <w:sz w:val="22"/>
+                <w:szCs w:val="22"/>
+              </w:rPr>
+              <w:t>__________</w:t>
+            </w:r>
+            <w:r>
+              <w:rPr>
+                <w:sz w:val="22"/>
+                <w:szCs w:val="22"/>
+              </w:rPr>
+              <w:t>_</w:t>
+            </w:r>
+            <w:r>
+              <w:rPr>
+                <w:sz w:val="22"/>
+                <w:szCs w:val="22"/>
+              </w:rPr>
+              <w:t xml:space="preserve"> </w:t>
+            </w:r>
+            <w:r>
+              <w:rPr>
+                <w:sz w:val="22"/>
+                <w:szCs w:val="22"/>
+              </w:rPr>
+              <w:tab/>
+            </w:r>
+            <w:r>
+              <w:rPr>
+                <w:sz w:val="22"/>
+                <w:szCs w:val="22"/>
+              </w:rPr>
+              <w:tab/>
+            </w:r>
+            <w:r>
+              <w:rPr>
+                <w:sz w:val="22"/>
+                <w:szCs w:val="22"/>
+              </w:rPr>
+              <w:tab/>
+            </w:r>
+            <w:r>
+              <w:rPr>
+                <w:sz w:val="22"/>
+                <w:szCs w:val="22"/>
+              </w:rPr>
+              <w:tab/>
+            </w:r>
+            <w:r>
+              <w:rPr>
+                <w:sz w:val="22"/>
+                <w:szCs w:val="22"/>
+              </w:rPr>
+              <w:tab/>
+            </w:r>
+            <w:r>
+              <w:rPr>
+                <w:sz w:val="22"/>
+                <w:szCs w:val="22"/>
+              </w:rPr>
+              <w:t xml:space="preserve">         </w:t>
+            </w:r>
+            <w:r>
+              <w:rPr>
+                <w:sz w:val="22"/>
+                <w:szCs w:val="22"/>
+              </w:rPr>
+              <w:t xml:space="preserve"> </w:t>
+            </w:r>
+            <w:r>
+              <w:rPr>
+                <w:sz w:val="22"/>
+                <w:szCs w:val="22"/>
+              </w:rPr>
+              <w:t xml:space="preserve">    </w:t>
+            </w:r>
+            <w:r>
+              <w:rPr>
+                <w:sz w:val="22"/>
+                <w:szCs w:val="22"/>
+              </w:rPr>
+              <w:t>Phone</w:t>
+            </w:r>
+            <w:r>
+              <w:rPr>
+                <w:sz w:val="22"/>
+                <w:szCs w:val="22"/>
+              </w:rPr>
+              <w:t>:</w:t>
+            </w:r>
+            <w:r>
+              <w:rPr>
+                <w:sz w:val="22"/>
+                <w:szCs w:val="22"/>
+              </w:rPr>
+              <w:t xml:space="preserve"> _</w:t>
+            </w:r>
+            <w:r>
+              <w:rPr>
+                <w:sz w:val="22"/>
+                <w:szCs w:val="22"/>
+              </w:rPr>
+              <w:t>__________________</w:t>
+            </w:r>
+            <w:r>
+              <w:rPr>
+                <w:sz w:val="22"/>
+                <w:szCs w:val="22"/>
+              </w:rPr>
+              <w:tab/>
+            </w:r>
+            <w:r>
+              <w:rPr>
+                <w:sz w:val="22"/>
+                <w:szCs w:val="22"/>
+              </w:rPr>
+              <w:tab/>
+            </w:r>
+            <w:r>
+              <w:rPr>
+                <w:sz w:val="22"/>
+                <w:szCs w:val="22"/>
+              </w:rPr>
+              <w:tab/>
+            </w:r>
+            <w:r>
+              <w:rPr>
+                <w:sz w:val="22"/>
+                <w:szCs w:val="22"/>
+              </w:rPr>
+              <w:tab/>
+            </w:r>
+            <w:r>
+              <w:rPr>
+                <w:sz w:val="22"/>
+                <w:szCs w:val="22"/>
+              </w:rPr>
+              <w:tab/>
+              <w:t xml:space="preserve">       </w:t>
+            </w:r>
+          </w:p>
+          <w:p>
+            <w:pPr>
+              <w:pStyle w:val="Default"/>
+              <w:rPr>
+                <w:sz w:val="22"/>
+                <w:szCs w:val="22"/>
+              </w:rPr>
+            </w:pPr>
+          </w:p>
+          <w:p>
+            <w:pPr>
+              <w:pStyle w:val="Default"/>
               <w:rPr>
                 <w:b/>
                 <w:bCs/>
                 <w:sz w:val="22"/>
                 <w:szCs w:val="22"/>
               </w:rPr>
-              <w:t xml:space="preserve">  </w:t>
-            </w:r>
-            <w:r>
-              <w:rPr>
-                <w:sz w:val="22"/>
-                <w:szCs w:val="22"/>
-              </w:rPr>
-              <w:tab/>
-            </w:r>
-            <w:r>
-              <w:rPr>
-                <w:sz w:val="22"/>
-                <w:szCs w:val="22"/>
-              </w:rPr>
-              <w:tab/>
-            </w:r>
-            <w:r>
-              <w:rPr>
-                <w:sz w:val="22"/>
-                <w:szCs w:val="22"/>
-              </w:rPr>
-              <w:tab/>
-            </w:r>
-            <w:r>
-              <w:rPr>
-                <w:sz w:val="22"/>
-                <w:szCs w:val="22"/>
-              </w:rPr>
-              <w:t xml:space="preserve">     </w:t>
-            </w:r>
-            <w:r>
-              <w:rPr>
-                <w:sz w:val="22"/>
-                <w:szCs w:val="22"/>
-              </w:rPr>
-              <w:t xml:space="preserve">  </w:t>
-            </w:r>
-            <w:r>
-              <w:rPr>
-                <w:sz w:val="22"/>
-                <w:szCs w:val="22"/>
-              </w:rPr>
-              <w:t xml:space="preserve">   </w:t>
-            </w:r>
-            <w:r>
-              <w:rPr>
-                <w:sz w:val="22"/>
-                <w:szCs w:val="22"/>
-              </w:rPr>
-              <w:t>Alternative Phone</w:t>
-            </w:r>
-            <w:r>
-              <w:rPr>
-                <w:sz w:val="22"/>
-                <w:szCs w:val="22"/>
-              </w:rPr>
-              <w:t>:</w:t>
-            </w:r>
-            <w:r>
-              <w:rPr>
-                <w:sz w:val="22"/>
-                <w:szCs w:val="22"/>
-              </w:rPr>
-              <w:t xml:space="preserve">  </w:t>
-            </w:r>
-            <w:r>
-              <w:rPr>
-                <w:sz w:val="22"/>
-                <w:szCs w:val="22"/>
-              </w:rPr>
-              <w:t>________________</w:t>
-            </w:r>
-            <w:r>
-              <w:rPr>
-                <w:sz w:val="22"/>
-                <w:szCs w:val="22"/>
-              </w:rPr>
-              <w:tab/>
-            </w:r>
-            <w:r>
-              <w:rPr>
-                <w:sz w:val="22"/>
-                <w:szCs w:val="22"/>
-              </w:rPr>
-              <w:tab/>
-            </w:r>
-            <w:r>
-              <w:rPr>
-                <w:sz w:val="22"/>
-                <w:szCs w:val="22"/>
-              </w:rPr>
-              <w:tab/>
-            </w:r>
-          </w:p>
-          <w:p>
-            <w:pPr>
-              <w:pStyle w:val="Default"/>
-              <w:rPr>
-                <w:sz w:val="22"/>
-                <w:szCs w:val="22"/>
-              </w:rPr>
-            </w:pPr>
-          </w:p>
-          <w:p>
-            <w:pPr>
-              <w:pStyle w:val="Default"/>
-              <w:rPr>
-                <w:sz w:val="22"/>
-                <w:szCs w:val="22"/>
-              </w:rPr>
             </w:pPr>
             <w:r>
               <w:rPr>
@@ -867,67 +1203,15 @@
                 <w:szCs w:val="22"/>
                 <w:u w:val="single"/>
               </w:rPr>
-              <w:t>Permanent Address</w:t>
-            </w:r>
-            <w:r>
-              <w:rPr>
-                <w:sz w:val="22"/>
-                <w:szCs w:val="22"/>
-              </w:rPr>
-              <w:t xml:space="preserve"> (if different from mailing address) </w:t>
-            </w:r>
-          </w:p>
-          <w:p>
-            <w:pPr>
-              <w:pStyle w:val="Default"/>
-              <w:rPr>
-                <w:sz w:val="22"/>
-                <w:szCs w:val="22"/>
-              </w:rPr>
-            </w:pPr>
-          </w:p>
-          <w:p>
-            <w:pPr>
-              <w:pStyle w:val="Default"/>
-              <w:rPr>
-                <w:sz w:val="22"/>
-                <w:szCs w:val="22"/>
-              </w:rPr>
-            </w:pPr>
-            <w:r>
-              <w:rPr>
-                <w:sz w:val="22"/>
-                <w:szCs w:val="22"/>
-              </w:rPr>
-              <w:t>City</w:t>
-            </w:r>
-            <w:r>
-              <w:rPr>
-                <w:sz w:val="22"/>
-                <w:szCs w:val="22"/>
-              </w:rPr>
-              <w:t>: _</w:t>
-            </w:r>
-            <w:r>
-              <w:rPr>
-                <w:sz w:val="22"/>
-                <w:szCs w:val="22"/>
-              </w:rPr>
-              <w:t>_________________</w:t>
-            </w:r>
-            <w:r>
-              <w:rPr>
-                <w:sz w:val="22"/>
-                <w:szCs w:val="22"/>
-              </w:rPr>
-              <w:t xml:space="preserve">  </w:t>
-            </w:r>
-            <w:r>
-              <w:rPr>
-                <w:sz w:val="22"/>
-                <w:szCs w:val="22"/>
-              </w:rPr>
-              <w:t xml:space="preserve">  </w:t>
+              <w:t>Email Address</w:t>
+            </w:r>
+            <w:r>
+              <w:rPr>
+                <w:sz w:val="22"/>
+                <w:szCs w:val="22"/>
+                <w:u w:val="single"/>
+              </w:rPr>
+              <w:t xml:space="preserve">: </w:t>
             </w:r>
             <w:r>
               <w:rPr>
@@ -937,295 +1221,9 @@
               <w:t xml:space="preserve"> </w:t>
             </w:r>
             <w:r>
-              <w:rPr>
-                <w:sz w:val="22"/>
-                <w:szCs w:val="22"/>
-              </w:rPr>
-              <w:tab/>
-            </w:r>
-            <w:r>
-              <w:rPr>
-                <w:sz w:val="22"/>
-                <w:szCs w:val="22"/>
-              </w:rPr>
-              <w:t xml:space="preserve"> </w:t>
-            </w:r>
-            <w:r>
-              <w:rPr>
-                <w:sz w:val="22"/>
-                <w:szCs w:val="22"/>
-              </w:rPr>
-              <w:t>Province</w:t>
-            </w:r>
-            <w:r>
-              <w:rPr>
-                <w:sz w:val="22"/>
-                <w:szCs w:val="22"/>
-              </w:rPr>
-              <w:t>:</w:t>
-            </w:r>
-            <w:r>
-              <w:rPr>
-                <w:sz w:val="22"/>
-                <w:szCs w:val="22"/>
-              </w:rPr>
-              <w:t xml:space="preserve"> </w:t>
-            </w:r>
-            <w:r>
-              <w:rPr>
-                <w:sz w:val="22"/>
-                <w:szCs w:val="22"/>
-              </w:rPr>
-              <w:t xml:space="preserve">________                </w:t>
-            </w:r>
-            <w:r>
-              <w:rPr>
-                <w:sz w:val="22"/>
-                <w:szCs w:val="22"/>
-              </w:rPr>
-              <w:t>Postal Code</w:t>
-            </w:r>
-            <w:r>
-              <w:rPr>
-                <w:sz w:val="22"/>
-                <w:szCs w:val="22"/>
-              </w:rPr>
-              <w:t>:</w:t>
-            </w:r>
-            <w:r>
-              <w:rPr>
-                <w:sz w:val="22"/>
-                <w:szCs w:val="22"/>
-              </w:rPr>
-              <w:t xml:space="preserve"> </w:t>
-            </w:r>
-            <w:r>
-              <w:rPr>
-                <w:sz w:val="22"/>
-                <w:szCs w:val="22"/>
-              </w:rPr>
-              <w:t>__________</w:t>
-            </w:r>
-          </w:p>
-          <w:p>
-            <w:pPr>
-              <w:pStyle w:val="Default"/>
-              <w:rPr>
-                <w:sz w:val="22"/>
-                <w:szCs w:val="22"/>
-              </w:rPr>
-            </w:pPr>
-          </w:p>
-          <w:p>
-            <w:pPr>
-              <w:pStyle w:val="Default"/>
-              <w:rPr>
-                <w:sz w:val="22"/>
-                <w:szCs w:val="22"/>
-              </w:rPr>
-            </w:pPr>
-            <w:r>
-              <w:rPr>
-                <w:sz w:val="22"/>
-                <w:szCs w:val="22"/>
-              </w:rPr>
-              <w:t>Country</w:t>
-            </w:r>
-            <w:r>
-              <w:rPr>
-                <w:sz w:val="22"/>
-                <w:szCs w:val="22"/>
-              </w:rPr>
-              <w:t>:</w:t>
-            </w:r>
-            <w:r>
-              <w:rPr>
-                <w:sz w:val="22"/>
-                <w:szCs w:val="22"/>
-              </w:rPr>
-              <w:t xml:space="preserve"> </w:t>
-            </w:r>
-            <w:r>
-              <w:rPr>
-                <w:sz w:val="22"/>
-                <w:szCs w:val="22"/>
-              </w:rPr>
-              <w:t>__________</w:t>
-            </w:r>
-            <w:r>
-              <w:rPr>
-                <w:sz w:val="22"/>
-                <w:szCs w:val="22"/>
-              </w:rPr>
-              <w:t>_</w:t>
-            </w:r>
-            <w:r>
-              <w:rPr>
-                <w:sz w:val="22"/>
-                <w:szCs w:val="22"/>
-              </w:rPr>
-              <w:t xml:space="preserve"> </w:t>
-            </w:r>
-            <w:r>
-              <w:rPr>
-                <w:sz w:val="22"/>
-                <w:szCs w:val="22"/>
-              </w:rPr>
-              <w:tab/>
-            </w:r>
-            <w:r>
-              <w:rPr>
-                <w:sz w:val="22"/>
-                <w:szCs w:val="22"/>
-              </w:rPr>
-              <w:tab/>
-            </w:r>
-            <w:r>
-              <w:rPr>
-                <w:sz w:val="22"/>
-                <w:szCs w:val="22"/>
-              </w:rPr>
-              <w:tab/>
-            </w:r>
-            <w:r>
-              <w:rPr>
-                <w:sz w:val="22"/>
-                <w:szCs w:val="22"/>
-              </w:rPr>
-              <w:tab/>
-            </w:r>
-            <w:r>
-              <w:rPr>
-                <w:sz w:val="22"/>
-                <w:szCs w:val="22"/>
-              </w:rPr>
-              <w:tab/>
-            </w:r>
-            <w:r>
-              <w:rPr>
-                <w:sz w:val="22"/>
-                <w:szCs w:val="22"/>
-              </w:rPr>
-              <w:t xml:space="preserve">         </w:t>
-            </w:r>
-            <w:r>
-              <w:rPr>
-                <w:sz w:val="22"/>
-                <w:szCs w:val="22"/>
-              </w:rPr>
-              <w:t xml:space="preserve"> </w:t>
-            </w:r>
-            <w:r>
-              <w:rPr>
-                <w:sz w:val="22"/>
-                <w:szCs w:val="22"/>
-              </w:rPr>
-              <w:t xml:space="preserve">    </w:t>
-            </w:r>
-            <w:r>
-              <w:rPr>
-                <w:sz w:val="22"/>
-                <w:szCs w:val="22"/>
-              </w:rPr>
-              <w:t>Phone</w:t>
-            </w:r>
-            <w:r>
-              <w:rPr>
-                <w:sz w:val="22"/>
-                <w:szCs w:val="22"/>
-              </w:rPr>
-              <w:t>:</w:t>
-            </w:r>
-            <w:r>
-              <w:rPr>
-                <w:sz w:val="22"/>
-                <w:szCs w:val="22"/>
-              </w:rPr>
-              <w:t xml:space="preserve"> _</w:t>
-            </w:r>
-            <w:r>
-              <w:rPr>
-                <w:sz w:val="22"/>
-                <w:szCs w:val="22"/>
-              </w:rPr>
-              <w:t>__________________</w:t>
-            </w:r>
-            <w:r>
-              <w:rPr>
-                <w:sz w:val="22"/>
-                <w:szCs w:val="22"/>
-              </w:rPr>
-              <w:tab/>
-            </w:r>
-            <w:r>
-              <w:rPr>
-                <w:sz w:val="22"/>
-                <w:szCs w:val="22"/>
-              </w:rPr>
-              <w:tab/>
-            </w:r>
-            <w:r>
-              <w:rPr>
-                <w:sz w:val="22"/>
-                <w:szCs w:val="22"/>
-              </w:rPr>
-              <w:tab/>
-            </w:r>
-            <w:r>
-              <w:rPr>
-                <w:sz w:val="22"/>
-                <w:szCs w:val="22"/>
-              </w:rPr>
-              <w:tab/>
-            </w:r>
-            <w:r>
-              <w:rPr>
-                <w:sz w:val="22"/>
-                <w:szCs w:val="22"/>
-              </w:rPr>
-              <w:tab/>
-              <w:t xml:space="preserve">       </w:t>
-            </w:r>
-          </w:p>
-          <w:p>
-            <w:pPr>
-              <w:pStyle w:val="Default"/>
-              <w:rPr>
-                <w:sz w:val="22"/>
-                <w:szCs w:val="22"/>
-              </w:rPr>
-            </w:pPr>
-          </w:p>
-          <w:p>
-            <w:pPr>
-              <w:pStyle w:val="Default"/>
               <w:rPr>
                 <w:b/>
                 <w:bCs/>
-                <w:sz w:val="22"/>
-                <w:szCs w:val="22"/>
-              </w:rPr>
-            </w:pPr>
-            <w:r>
-              <w:rPr>
-                <w:sz w:val="22"/>
-                <w:szCs w:val="22"/>
-                <w:u w:val="single"/>
-              </w:rPr>
-              <w:t>Email Address</w:t>
-            </w:r>
-            <w:r>
-              <w:rPr>
-                <w:sz w:val="22"/>
-                <w:szCs w:val="22"/>
-                <w:u w:val="single"/>
-              </w:rPr>
-              <w:t xml:space="preserve">: </w:t>
-            </w:r>
-            <w:r>
-              <w:rPr>
-                <w:sz w:val="22"/>
-                <w:szCs w:val="22"/>
               </w:rPr>
               <w:t xml:space="preserve"> </w:t>
             </w:r>
@@ -1234,14 +1232,7 @@
                 <w:b/>
                 <w:bCs/>
               </w:rPr>
-              <w:t xml:space="preserve"> </w:t>
-            </w:r>
-            <w:r>
-              <w:rPr>
-                <w:b/>
-                <w:bCs/>
-              </w:rPr>
-              <w:t>{email}</w:t>
+              <w:t>ladyglowin@gmail.com</w:t>
             </w:r>
           </w:p>
           <w:p>
@@ -1605,7 +1596,7 @@
                 <w:sz w:val="22"/>
                 <w:szCs w:val="22"/>
               </w:rPr>
-              <w:t>{date_of_birth}</w:t>
+              <w:t>0</w:t>
             </w:r>
             <w:r>
               <w:rPr>
@@ -1614,7 +1605,7 @@
                 <w:sz w:val="22"/>
                 <w:szCs w:val="22"/>
               </w:rPr>
-              <w:t/>
+              <w:t>1</w:t>
             </w:r>
             <w:r>
               <w:rPr>
@@ -1623,7 +1614,7 @@
                 <w:sz w:val="22"/>
                 <w:szCs w:val="22"/>
               </w:rPr>
-              <w:t/>
+              <w:t>/</w:t>
             </w:r>
             <w:r>
               <w:rPr>
@@ -1632,7 +1623,7 @@
                 <w:sz w:val="22"/>
                 <w:szCs w:val="22"/>
               </w:rPr>
-              <w:t/>
+              <w:t>11</w:t>
             </w:r>
             <w:r>
               <w:rPr>
@@ -1641,7 +1632,7 @@
                 <w:sz w:val="22"/>
                 <w:szCs w:val="22"/>
               </w:rPr>
-              <w:t/>
+              <w:t>/</w:t>
             </w:r>
             <w:r>
               <w:rPr>
@@ -1650,7 +1641,7 @@
                 <w:sz w:val="22"/>
                 <w:szCs w:val="22"/>
               </w:rPr>
-              <w:t/>
+              <w:t>19</w:t>
             </w:r>
             <w:r>
               <w:rPr>
@@ -1659,7 +1650,7 @@
                 <w:sz w:val="22"/>
                 <w:szCs w:val="22"/>
               </w:rPr>
-              <w:t/>
+              <w:t>7</w:t>
             </w:r>
             <w:r>
               <w:rPr>
@@ -1668,7 +1659,7 @@
                 <w:sz w:val="22"/>
                 <w:szCs w:val="22"/>
               </w:rPr>
-              <w:t/>
+              <w:t>6</w:t>
             </w:r>
           </w:p>
           <w:p>
@@ -1744,14 +1735,14 @@
                 <w:sz w:val="22"/>
                 <w:szCs w:val="22"/>
               </w:rPr>
-              <w:t xml:space="preserve">{program_name}</w:t>
-            </w:r>
-            <w:r>
-              <w:rPr>
-                <w:sz w:val="22"/>
-                <w:szCs w:val="22"/>
-              </w:rPr>
-              <w:t/>
+              <w:t xml:space="preserve">NACC PERSONAL SUPPORT WORKER (PSW) DE 2022 </w:t>
+            </w:r>
+            <w:r>
+              <w:rPr>
+                <w:sz w:val="22"/>
+                <w:szCs w:val="22"/>
+              </w:rPr>
+              <w:t>(Accelerated)</w:t>
             </w:r>
           </w:p>
           <w:p>
@@ -1801,7 +1792,7 @@
                 <w:sz w:val="22"/>
                 <w:szCs w:val="22"/>
               </w:rPr>
-              <w:t>{program_start_date}</w:t>
+              <w:t>27</w:t>
             </w:r>
             <w:r>
               <w:rPr>
@@ -1810,7 +1801,7 @@
                 <w:sz w:val="22"/>
                 <w:szCs w:val="22"/>
               </w:rPr>
-              <w:t/>
+              <w:t>/</w:t>
             </w:r>
             <w:r>
               <w:rPr>
@@ -1819,7 +1810,7 @@
                 <w:sz w:val="22"/>
                 <w:szCs w:val="22"/>
               </w:rPr>
-              <w:t/>
+              <w:t>04</w:t>
             </w:r>
             <w:r>
               <w:rPr>
@@ -1828,7 +1819,7 @@
                 <w:sz w:val="22"/>
                 <w:szCs w:val="22"/>
               </w:rPr>
-              <w:t/>
+              <w:t>/202</w:t>
             </w:r>
             <w:r>
               <w:rPr>
@@ -1837,7 +1828,7 @@
                 <w:sz w:val="22"/>
                 <w:szCs w:val="22"/>
               </w:rPr>
-              <w:t/>
+              <w:t>6</w:t>
             </w:r>
             <w:r>
               <w:rPr>
@@ -1881,7 +1872,7 @@
                 <w:sz w:val="22"/>
                 <w:szCs w:val="22"/>
               </w:rPr>
-              <w:t>{expected_completion_date}</w:t>
+              <w:t>25</w:t>
             </w:r>
             <w:r>
               <w:rPr>
@@ -1890,7 +1881,7 @@
                 <w:sz w:val="22"/>
                 <w:szCs w:val="22"/>
               </w:rPr>
-              <w:t/>
+              <w:t>/</w:t>
             </w:r>
             <w:r>
               <w:rPr>
@@ -1899,7 +1890,7 @@
                 <w:sz w:val="22"/>
                 <w:szCs w:val="22"/>
               </w:rPr>
-              <w:t/>
+              <w:t>10</w:t>
             </w:r>
             <w:r>
               <w:rPr>
@@ -1908,7 +1899,7 @@
                 <w:sz w:val="22"/>
                 <w:szCs w:val="22"/>
               </w:rPr>
-              <w:t/>
+              <w:t>/2026</w:t>
             </w:r>
           </w:p>
           <w:p>
@@ -2076,7 +2067,7 @@
                 <w:sz w:val="22"/>
                 <w:szCs w:val="22"/>
               </w:rPr>
-              <w:t>{credential_name}</w:t>
+              <w:t>PSW Certificate</w:t>
             </w:r>
           </w:p>
           <w:p>
@@ -2319,17 +2310,19 @@
                 <w:sz w:val="28"/>
                 <w:szCs w:val="28"/>
               </w:rPr>
-              <w:t xml:space="preserve">{training_location}</w:t>
-            </w:r>
-            <w:r>
+              <w:t xml:space="preserve">25 Watline Avenue, Unit 204 </w:t>
+            </w:r>
+          </w:p>
+          <w:p>
+            <w:pPr>
+              <w:pStyle w:val="Default"/>
               <w:rPr>
                 <w:b/>
                 <w:bCs/>
                 <w:sz w:val="28"/>
                 <w:szCs w:val="28"/>
               </w:rPr>
-              <w:t/>
-            </w:r>
+            </w:pPr>
             <w:r>
               <w:rPr>
                 <w:b/>
@@ -2337,19 +2330,17 @@
                 <w:sz w:val="28"/>
                 <w:szCs w:val="28"/>
               </w:rPr>
-              <w:t xml:space="preserve"> </w:t>
-            </w:r>
-          </w:p>
-          <w:p>
-            <w:pPr>
-              <w:pStyle w:val="Default"/>
+              <w:t xml:space="preserve">                                   </w:t>
+            </w:r>
+            <w:r>
               <w:rPr>
                 <w:b/>
                 <w:bCs/>
                 <w:sz w:val="28"/>
                 <w:szCs w:val="28"/>
               </w:rPr>
-            </w:pPr>
+              <w:t xml:space="preserve">Mississauga, Ontario, </w:t>
+            </w:r>
             <w:r>
               <w:rPr>
                 <w:b/>
@@ -2357,7 +2348,7 @@
                 <w:sz w:val="28"/>
                 <w:szCs w:val="28"/>
               </w:rPr>
-              <w:t xml:space="preserve">                                   </w:t>
+              <w:t xml:space="preserve">CANADA, </w:t>
             </w:r>
             <w:r>
               <w:rPr>
@@ -2366,97 +2357,98 @@
                 <w:sz w:val="28"/>
                 <w:szCs w:val="28"/>
               </w:rPr>
-              <w:t xml:space="preserve"/>
-            </w:r>
+              <w:t>L4Z 2Z1</w:t>
+            </w:r>
+          </w:p>
+          <w:p>
+            <w:pPr>
+              <w:pStyle w:val="Default"/>
+              <w:rPr>
+                <w:sz w:val="22"/>
+                <w:szCs w:val="22"/>
+              </w:rPr>
+            </w:pPr>
+          </w:p>
+          <w:p>
+            <w:pPr>
+              <w:pStyle w:val="Default"/>
+              <w:rPr>
+                <w:sz w:val="22"/>
+                <w:szCs w:val="22"/>
+              </w:rPr>
+            </w:pPr>
+          </w:p>
+          <w:p>
+            <w:pPr>
+              <w:pStyle w:val="Default"/>
+              <w:rPr>
+                <w:sz w:val="22"/>
+                <w:szCs w:val="22"/>
+              </w:rPr>
+            </w:pPr>
+            <w:r>
+              <w:rPr>
+                <w:sz w:val="22"/>
+                <w:szCs w:val="22"/>
+              </w:rPr>
+              <w:t>Additional Training Location (if any) _________________________________________________</w:t>
+            </w:r>
+          </w:p>
+          <w:p>
+            <w:pPr>
+              <w:pStyle w:val="Default"/>
+              <w:rPr>
+                <w:sz w:val="22"/>
+                <w:szCs w:val="22"/>
+              </w:rPr>
+            </w:pPr>
+          </w:p>
+          <w:p>
+            <w:pPr>
+              <w:pStyle w:val="Default"/>
+              <w:rPr>
+                <w:sz w:val="22"/>
+                <w:szCs w:val="22"/>
+              </w:rPr>
+            </w:pPr>
+          </w:p>
+          <w:p>
+            <w:pPr>
+              <w:pStyle w:val="Default"/>
+              <w:rPr>
+                <w:sz w:val="22"/>
+                <w:szCs w:val="22"/>
+                <w:u w:val="single"/>
+              </w:rPr>
+            </w:pPr>
             <w:r>
               <w:rPr>
                 <w:b/>
                 <w:bCs/>
-                <w:sz w:val="28"/>
-                <w:szCs w:val="28"/>
-              </w:rPr>
-              <w:t xml:space="preserve"/>
+                <w:sz w:val="22"/>
+                <w:szCs w:val="22"/>
+                <w:u w:val="single"/>
+              </w:rPr>
+              <w:t>Location of Practicum</w:t>
             </w:r>
             <w:r>
               <w:rPr>
                 <w:b/>
                 <w:bCs/>
-                <w:sz w:val="28"/>
-                <w:szCs w:val="28"/>
-              </w:rPr>
-              <w:t/>
-            </w:r>
-          </w:p>
-          <w:p>
-            <w:pPr>
-              <w:pStyle w:val="Default"/>
-              <w:rPr>
-                <w:sz w:val="22"/>
-                <w:szCs w:val="22"/>
-              </w:rPr>
-            </w:pPr>
-          </w:p>
-          <w:p>
-            <w:pPr>
-              <w:pStyle w:val="Default"/>
-              <w:rPr>
-                <w:sz w:val="22"/>
-                <w:szCs w:val="22"/>
-              </w:rPr>
-            </w:pPr>
-          </w:p>
-          <w:p>
-            <w:pPr>
-              <w:pStyle w:val="Default"/>
-              <w:rPr>
-                <w:sz w:val="22"/>
-                <w:szCs w:val="22"/>
-              </w:rPr>
-            </w:pPr>
-            <w:r>
-              <w:rPr>
-                <w:sz w:val="22"/>
-                <w:szCs w:val="22"/>
-              </w:rPr>
-              <w:t>Additional Training Location (if any) _________________________________________________</w:t>
-            </w:r>
-          </w:p>
-          <w:p>
-            <w:pPr>
-              <w:pStyle w:val="Default"/>
-              <w:rPr>
-                <w:sz w:val="22"/>
-                <w:szCs w:val="22"/>
-              </w:rPr>
-            </w:pPr>
-          </w:p>
-          <w:p>
-            <w:pPr>
-              <w:pStyle w:val="Default"/>
-              <w:rPr>
-                <w:sz w:val="22"/>
-                <w:szCs w:val="22"/>
-              </w:rPr>
-            </w:pPr>
-          </w:p>
-          <w:p>
-            <w:pPr>
-              <w:pStyle w:val="Default"/>
-              <w:rPr>
                 <w:sz w:val="22"/>
                 <w:szCs w:val="22"/>
                 <w:u w:val="single"/>
               </w:rPr>
-            </w:pPr>
+              <w:t xml:space="preserve">-1 </w:t>
+            </w:r>
             <w:r>
               <w:rPr>
                 <w:b/>
                 <w:bCs/>
                 <w:sz w:val="22"/>
                 <w:szCs w:val="22"/>
-                <w:u w:val="single"/>
-              </w:rPr>
-              <w:t>Location of Practicum</w:t>
+              </w:rPr>
+              <w:t>(</w:t>
             </w:r>
             <w:r>
               <w:rPr>
@@ -2464,9 +2456,8 @@
                 <w:bCs/>
                 <w:sz w:val="22"/>
                 <w:szCs w:val="22"/>
-                <w:u w:val="single"/>
-              </w:rPr>
-              <w:t xml:space="preserve">-1 </w:t>
+              </w:rPr>
+              <w:t xml:space="preserve">200 </w:t>
             </w:r>
             <w:r>
               <w:rPr>
@@ -2475,7 +2466,7 @@
                 <w:sz w:val="22"/>
                 <w:szCs w:val="22"/>
               </w:rPr>
-              <w:t>({practicum_1_hours} Hours)</w:t>
+              <w:t>Hours</w:t>
             </w:r>
             <w:r>
               <w:rPr>
@@ -2484,7 +2475,7 @@
                 <w:sz w:val="22"/>
                 <w:szCs w:val="22"/>
               </w:rPr>
-              <w:t xml:space="preserve"/>
+              <w:t>):</w:t>
             </w:r>
             <w:r>
               <w:rPr>
@@ -2493,7 +2484,7 @@
                 <w:sz w:val="22"/>
                 <w:szCs w:val="22"/>
               </w:rPr>
-              <w:t/>
+              <w:t xml:space="preserve"> </w:t>
             </w:r>
             <w:r>
               <w:rPr>
@@ -2502,7 +2493,7 @@
                 <w:sz w:val="22"/>
                 <w:szCs w:val="22"/>
               </w:rPr>
-              <w:t>:</w:t>
+              <w:t xml:space="preserve"> </w:t>
             </w:r>
             <w:r>
               <w:rPr>
@@ -2511,67 +2502,67 @@
                 <w:sz w:val="22"/>
                 <w:szCs w:val="22"/>
               </w:rPr>
-              <w:t xml:space="preserve"> </w:t>
-            </w:r>
-            <w:r>
+              <w:t>EXTENDICARE (To be determined as per availability)</w:t>
+            </w:r>
+          </w:p>
+          <w:p>
+            <w:pPr>
+              <w:pStyle w:val="Default"/>
               <w:rPr>
                 <w:b/>
                 <w:bCs/>
                 <w:sz w:val="22"/>
                 <w:szCs w:val="22"/>
               </w:rPr>
-              <w:t xml:space="preserve"> </w:t>
-            </w:r>
-            <w:r>
+            </w:pPr>
+          </w:p>
+          <w:p>
+            <w:pPr>
+              <w:pStyle w:val="Default"/>
               <w:rPr>
                 <w:b/>
                 <w:bCs/>
                 <w:sz w:val="22"/>
                 <w:szCs w:val="22"/>
               </w:rPr>
-              <w:t>{practicum_1_location}</w:t>
-            </w:r>
-          </w:p>
-          <w:p>
-            <w:pPr>
-              <w:pStyle w:val="Default"/>
+            </w:pPr>
+          </w:p>
+          <w:p>
+            <w:pPr>
+              <w:pStyle w:val="Default"/>
+              <w:rPr>
+                <w:sz w:val="22"/>
+                <w:szCs w:val="22"/>
+                <w:u w:val="single"/>
+              </w:rPr>
+            </w:pPr>
+            <w:r>
               <w:rPr>
                 <w:b/>
                 <w:bCs/>
                 <w:sz w:val="22"/>
                 <w:szCs w:val="22"/>
-              </w:rPr>
-            </w:pPr>
-          </w:p>
-          <w:p>
-            <w:pPr>
-              <w:pStyle w:val="Default"/>
+                <w:u w:val="single"/>
+              </w:rPr>
+              <w:t xml:space="preserve">Location of practicum-2 </w:t>
+            </w:r>
+            <w:r>
               <w:rPr>
                 <w:b/>
                 <w:bCs/>
                 <w:sz w:val="22"/>
                 <w:szCs w:val="22"/>
               </w:rPr>
-            </w:pPr>
-          </w:p>
-          <w:p>
-            <w:pPr>
-              <w:pStyle w:val="Default"/>
-              <w:rPr>
-                <w:sz w:val="22"/>
-                <w:szCs w:val="22"/>
-                <w:u w:val="single"/>
-              </w:rPr>
-            </w:pPr>
+              <w:t>(</w:t>
+            </w:r>
             <w:r>
               <w:rPr>
                 <w:b/>
                 <w:bCs/>
                 <w:sz w:val="22"/>
                 <w:szCs w:val="22"/>
-                <w:u w:val="single"/>
-              </w:rPr>
-              <w:t xml:space="preserve">Location of practicum-2 </w:t>
+              </w:rPr>
+              <w:t xml:space="preserve">100 </w:t>
             </w:r>
             <w:r>
               <w:rPr>
@@ -2580,7 +2571,7 @@
                 <w:sz w:val="22"/>
                 <w:szCs w:val="22"/>
               </w:rPr>
-              <w:t>({practicum_2_hours} Hours)</w:t>
+              <w:t>Hours)</w:t>
             </w:r>
             <w:r>
               <w:rPr>
@@ -2589,7 +2580,7 @@
                 <w:sz w:val="22"/>
                 <w:szCs w:val="22"/>
               </w:rPr>
-              <w:t xml:space="preserve"/>
+              <w:t>:</w:t>
             </w:r>
             <w:r>
               <w:rPr>
@@ -2598,7 +2589,7 @@
                 <w:sz w:val="22"/>
                 <w:szCs w:val="22"/>
               </w:rPr>
-              <w:t/>
+              <w:t xml:space="preserve">  </w:t>
             </w:r>
             <w:r>
               <w:rPr>
@@ -2607,7 +2598,7 @@
                 <w:sz w:val="22"/>
                 <w:szCs w:val="22"/>
               </w:rPr>
-              <w:t>:</w:t>
+              <w:t>CHARTWELL OR EXTENDICARE</w:t>
             </w:r>
             <w:r>
               <w:rPr>
@@ -2616,37 +2607,39 @@
                 <w:sz w:val="22"/>
                 <w:szCs w:val="22"/>
               </w:rPr>
-              <w:t xml:space="preserve">  </w:t>
-            </w:r>
-            <w:r>
+              <w:t xml:space="preserve"> (To be determined as per availability)</w:t>
+            </w:r>
+          </w:p>
+          <w:p>
+            <w:pPr>
+              <w:pStyle w:val="Default"/>
               <w:rPr>
                 <w:b/>
                 <w:bCs/>
                 <w:sz w:val="22"/>
                 <w:szCs w:val="22"/>
               </w:rPr>
-              <w:t>{practicum_2_location}</w:t>
-            </w:r>
-            <w:r>
+            </w:pPr>
+          </w:p>
+          <w:p>
+            <w:pPr>
+              <w:pStyle w:val="Default"/>
               <w:rPr>
                 <w:b/>
                 <w:bCs/>
                 <w:sz w:val="22"/>
                 <w:szCs w:val="22"/>
               </w:rPr>
-              <w:t xml:space="preserve"/>
-            </w:r>
-          </w:p>
-          <w:p>
-            <w:pPr>
-              <w:pStyle w:val="Default"/>
+            </w:pPr>
+            <w:r>
               <w:rPr>
                 <w:b/>
                 <w:bCs/>
                 <w:sz w:val="22"/>
                 <w:szCs w:val="22"/>
               </w:rPr>
-            </w:pPr>
+              <w:tab/>
+            </w:r>
           </w:p>
           <w:p>
             <w:pPr>
@@ -2676,6 +2669,7 @@
                 <w:bCs/>
                 <w:sz w:val="22"/>
                 <w:szCs w:val="22"/>
+                <w:u w:val="single"/>
               </w:rPr>
             </w:pPr>
             <w:r>
@@ -2684,39 +2678,18 @@
                 <w:bCs/>
                 <w:sz w:val="22"/>
                 <w:szCs w:val="22"/>
-              </w:rPr>
-              <w:tab/>
-            </w:r>
-          </w:p>
-          <w:p>
-            <w:pPr>
-              <w:pStyle w:val="Default"/>
+                <w:u w:val="single"/>
+              </w:rPr>
+              <w:t xml:space="preserve">Program length (in hours) </w:t>
+            </w:r>
+            <w:r>
               <w:rPr>
                 <w:b/>
                 <w:bCs/>
                 <w:sz w:val="22"/>
                 <w:szCs w:val="22"/>
-                <w:u w:val="single"/>
-              </w:rPr>
-            </w:pPr>
-            <w:r>
-              <w:rPr>
-                <w:b/>
-                <w:bCs/>
-                <w:sz w:val="22"/>
-                <w:szCs w:val="22"/>
-                <w:u w:val="single"/>
-              </w:rPr>
-              <w:t xml:space="preserve">Program length (in hours) </w:t>
-            </w:r>
-            <w:r>
-              <w:rPr>
-                <w:b/>
-                <w:bCs/>
-                <w:sz w:val="22"/>
-                <w:szCs w:val="22"/>
-              </w:rPr>
-              <w:t>{program_hours} Hours</w:t>
+              </w:rPr>
+              <w:t>700 Hours</w:t>
             </w:r>
           </w:p>
           <w:p>
@@ -3053,7 +3026,7 @@
                       <w:sz w:val="22"/>
                       <w:szCs w:val="22"/>
                     </w:rPr>
-                    <w:t>{class_time}</w:t>
+                    <w:t>8:00AM-2:00PM</w:t>
                   </w:r>
                 </w:p>
               </w:tc>
@@ -3076,7 +3049,7 @@
                       <w:sz w:val="22"/>
                       <w:szCs w:val="22"/>
                     </w:rPr>
-                    <w:t>{class_time}</w:t>
+                    <w:t>8:00AM-2:00PM</w:t>
                   </w:r>
                 </w:p>
               </w:tc>
@@ -3099,7 +3072,7 @@
                       <w:sz w:val="22"/>
                       <w:szCs w:val="22"/>
                     </w:rPr>
-                    <w:t>{class_time}</w:t>
+                    <w:t>8:00AM-2:00PM</w:t>
                   </w:r>
                 </w:p>
               </w:tc>
@@ -3122,7 +3095,7 @@
                       <w:sz w:val="22"/>
                       <w:szCs w:val="22"/>
                     </w:rPr>
-                    <w:t>{class_time}</w:t>
+                    <w:t>8:00AM-2:00PM</w:t>
                   </w:r>
                 </w:p>
               </w:tc>
@@ -3147,7 +3120,7 @@
                       <w:sz w:val="22"/>
                       <w:szCs w:val="22"/>
                     </w:rPr>
-                    <w:t>{class_time}</w:t>
+                    <w:t>8:00AM-2:00PM</w:t>
                   </w:r>
                 </w:p>
               </w:tc>
@@ -3223,7 +3196,7 @@
                       <w:sz w:val="22"/>
                       <w:szCs w:val="22"/>
                     </w:rPr>
-                    <w:t>{hours_per_day}</w:t>
+                    <w:t>6</w:t>
                   </w:r>
                 </w:p>
               </w:tc>
@@ -3244,7 +3217,7 @@
                       <w:sz w:val="22"/>
                       <w:szCs w:val="22"/>
                     </w:rPr>
-                    <w:t>{hours_per_day}</w:t>
+                    <w:t>6</w:t>
                   </w:r>
                 </w:p>
               </w:tc>
@@ -3265,7 +3238,7 @@
                       <w:sz w:val="22"/>
                       <w:szCs w:val="22"/>
                     </w:rPr>
-                    <w:t>{hours_per_day}</w:t>
+                    <w:t>6</w:t>
                   </w:r>
                 </w:p>
               </w:tc>
@@ -3286,7 +3259,7 @@
                       <w:sz w:val="22"/>
                       <w:szCs w:val="22"/>
                     </w:rPr>
-                    <w:t>{hours_per_day}</w:t>
+                    <w:t>6</w:t>
                   </w:r>
                 </w:p>
               </w:tc>
@@ -3307,7 +3280,7 @@
                       <w:sz w:val="22"/>
                       <w:szCs w:val="22"/>
                     </w:rPr>
-                    <w:t>{hours_per_day}</w:t>
+                    <w:t>6</w:t>
                   </w:r>
                 </w:p>
               </w:tc>
@@ -4359,82 +4332,6 @@
             </w:pPr>
             <w:r>
               <w:rPr>
-                <w:noProof/>
-                <w:sz w:val="22"/>
-                <w:szCs w:val="22"/>
-              </w:rPr>
-              <mc:AlternateContent>
-                <mc:Choice Requires="wps">
-                  <w:drawing>
-                    <wp:anchor distT="0" distB="0" distL="114300" distR="114300" simplePos="0" relativeHeight="251695104" behindDoc="0" locked="0" layoutInCell="1" allowOverlap="1" wp14:anchorId="2160D5A9" wp14:editId="4D6BB4C1">
-                      <wp:simplePos x="0" y="0"/>
-                      <wp:positionH relativeFrom="column">
-                        <wp:posOffset>113030</wp:posOffset>
-                      </wp:positionH>
-                      <wp:positionV relativeFrom="paragraph">
-                        <wp:posOffset>159457</wp:posOffset>
-                      </wp:positionV>
-                      <wp:extent cx="277495" cy="248285"/>
-                      <wp:effectExtent l="0" t="0" r="27305" b="18415"/>
-                      <wp:wrapNone/>
-                      <wp:docPr id="2026893848" name="Oval 15"/>
-                      <wp:cNvGraphicFramePr/>
-                      <a:graphic xmlns:a="http://schemas.openxmlformats.org/drawingml/2006/main">
-                        <a:graphicData uri="http://schemas.microsoft.com/office/word/2010/wordprocessingShape">
-                          <wps:wsp>
-                            <wps:cNvSpPr/>
-                            <wps:spPr>
-                              <a:xfrm>
-                                <a:off x="0" y="0"/>
-                                <a:ext cx="277495" cy="248285"/>
-                              </a:xfrm>
-                              <a:prstGeom prst="ellipse">
-                                <a:avLst/>
-                              </a:prstGeom>
-                              <a:noFill/>
-                            </wps:spPr>
-                            <wps:style>
-                              <a:lnRef idx="2">
-                                <a:schemeClr val="accent1">
-                                  <a:shade val="15000"/>
-                                </a:schemeClr>
-                              </a:lnRef>
-                              <a:fillRef idx="1">
-                                <a:schemeClr val="accent1"/>
-                              </a:fillRef>
-                              <a:effectRef idx="0">
-                                <a:schemeClr val="accent1"/>
-                              </a:effectRef>
-                              <a:fontRef idx="minor">
-                                <a:schemeClr val="lt1"/>
-                              </a:fontRef>
-                            </wps:style>
-                            <wps:bodyPr rot="0" spcFirstLastPara="0" vertOverflow="overflow" horzOverflow="overflow" vert="horz" wrap="square" lIns="91440" tIns="45720" rIns="91440" bIns="45720" numCol="1" spcCol="0" rtlCol="0" fromWordArt="0" anchor="ctr" anchorCtr="0" forceAA="0" compatLnSpc="1">
-                              <a:prstTxWarp prst="textNoShape">
-                                <a:avLst/>
-                              </a:prstTxWarp>
-                              <a:noAutofit/>
-                            </wps:bodyPr>
-                          </wps:wsp>
-                        </a:graphicData>
-                      </a:graphic>
-                      <wp14:sizeRelH relativeFrom="margin">
-                        <wp14:pctWidth>0</wp14:pctWidth>
-                      </wp14:sizeRelH>
-                    </wp:anchor>
-                  </w:drawing>
-                </mc:Choice>
-                <mc:Fallback>
-                  <w:pict>
-                    <v:oval w14:anchorId="374C3CD9" id="Oval 15" o:spid="_x0000_s1026" style="position:absolute;margin-left:8.9pt;margin-top:12.55pt;width:21.85pt;height:19.55pt;z-index:251695104;visibility:visible;mso-wrap-style:square;mso-width-percent:0;mso-wrap-distance-left:9pt;mso-wrap-distance-top:0;mso-wrap-distance-right:9pt;mso-wrap-distance-bottom:0;mso-position-horizontal:absolute;mso-position-horizontal-relative:text;mso-position-vertical:absolute;mso-position-vertical-relative:text;mso-width-percent:0;mso-width-relative:margin;v-text-anchor:middle" o:gfxdata="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" filled="f" strokecolor="#030e13 [484]" strokeweight="1pt">
-                      <v:stroke joinstyle="miter"/>
-                    </v:oval>
-                  </w:pict>
-                </mc:Fallback>
-              </mc:AlternateContent>
-            </w:r>
-            <w:r>
-              <w:rPr>
                 <w:sz w:val="22"/>
                 <w:szCs w:val="22"/>
               </w:rPr>
@@ -4660,85 +4557,6 @@
             </w:pPr>
             <w:r>
               <w:rPr>
-                <w:noProof/>
-                <w:sz w:val="22"/>
-                <w:szCs w:val="22"/>
-              </w:rPr>
-              <mc:AlternateContent>
-                <mc:Choice Requires="wps">
-                  <w:drawing>
-                    <wp:anchor distT="0" distB="0" distL="114300" distR="114300" simplePos="0" relativeHeight="251696128" behindDoc="0" locked="0" layoutInCell="1" allowOverlap="1" wp14:anchorId="06494B06" wp14:editId="57A0B422">
-                      <wp:simplePos x="0" y="0"/>
-                      <wp:positionH relativeFrom="column">
-                        <wp:posOffset>142240</wp:posOffset>
-                      </wp:positionH>
-                      <wp:positionV relativeFrom="paragraph">
-                        <wp:posOffset>147103</wp:posOffset>
-                      </wp:positionV>
-                      <wp:extent cx="248856" cy="231494"/>
-                      <wp:effectExtent l="0" t="0" r="18415" b="16510"/>
-                      <wp:wrapNone/>
-                      <wp:docPr id="1557260172" name="Oval 17"/>
-                      <wp:cNvGraphicFramePr/>
-                      <a:graphic xmlns:a="http://schemas.openxmlformats.org/drawingml/2006/main">
-                        <a:graphicData uri="http://schemas.microsoft.com/office/word/2010/wordprocessingShape">
-                          <wps:wsp>
-                            <wps:cNvSpPr/>
-                            <wps:spPr>
-                              <a:xfrm>
-                                <a:off x="0" y="0"/>
-                                <a:ext cx="248856" cy="231494"/>
-                              </a:xfrm>
-                              <a:prstGeom prst="ellipse">
-                                <a:avLst/>
-                              </a:prstGeom>
-                              <a:noFill/>
-                            </wps:spPr>
-                            <wps:style>
-                              <a:lnRef idx="2">
-                                <a:schemeClr val="accent1">
-                                  <a:shade val="15000"/>
-                                </a:schemeClr>
-                              </a:lnRef>
-                              <a:fillRef idx="1">
-                                <a:schemeClr val="accent1"/>
-                              </a:fillRef>
-                              <a:effectRef idx="0">
-                                <a:schemeClr val="accent1"/>
-                              </a:effectRef>
-                              <a:fontRef idx="minor">
-                                <a:schemeClr val="lt1"/>
-                              </a:fontRef>
-                            </wps:style>
-                            <wps:bodyPr rot="0" spcFirstLastPara="0" vertOverflow="overflow" horzOverflow="overflow" vert="horz" wrap="square" lIns="91440" tIns="45720" rIns="91440" bIns="45720" numCol="1" spcCol="0" rtlCol="0" fromWordArt="0" anchor="ctr" anchorCtr="0" forceAA="0" compatLnSpc="1">
-                              <a:prstTxWarp prst="textNoShape">
-                                <a:avLst/>
-                              </a:prstTxWarp>
-                              <a:noAutofit/>
-                            </wps:bodyPr>
-                          </wps:wsp>
-                        </a:graphicData>
-                      </a:graphic>
-                      <wp14:sizeRelH relativeFrom="margin">
-                        <wp14:pctWidth>0</wp14:pctWidth>
-                      </wp14:sizeRelH>
-                      <wp14:sizeRelV relativeFrom="margin">
-                        <wp14:pctHeight>0</wp14:pctHeight>
-                      </wp14:sizeRelV>
-                    </wp:anchor>
-                  </w:drawing>
-                </mc:Choice>
-                <mc:Fallback>
-                  <w:pict>
-                    <v:oval w14:anchorId="3834128B" id="Oval 17" o:spid="_x0000_s1026" style="position:absolute;margin-left:11.2pt;margin-top:11.6pt;width:19.6pt;height:18.25pt;z-index:251696128;visibility:visible;mso-wrap-style:square;mso-width-percent:0;mso-height-percent:0;mso-wrap-distance-left:9pt;mso-wrap-distance-top:0;mso-wrap-distance-right:9pt;mso-wrap-distance-bottom:0;mso-position-horizontal:absolute;mso-position-horizontal-relative:text;mso-position-vertical:absolute;mso-position-vertical-relative:text;mso-width-percent:0;mso-height-percent:0;mso-width-relative:margin;mso-height-relative:margin;v-text-anchor:middle" o:gfxdata="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" filled="f" strokecolor="#030e13 [484]" strokeweight="1pt">
-                      <v:stroke joinstyle="miter"/>
-                    </v:oval>
-                  </w:pict>
-                </mc:Fallback>
-              </mc:AlternateContent>
-            </w:r>
-            <w:r>
-              <w:rPr>
                 <w:sz w:val="22"/>
                 <w:szCs w:val="22"/>
               </w:rPr>
@@ -4928,42 +4746,35 @@
                 <w:sz w:val="22"/>
                 <w:szCs w:val="22"/>
               </w:rPr>
-              <w:t>{tuition_fee}</w:t>
-            </w:r>
-            <w:r>
-              <w:rPr>
-                <w:sz w:val="22"/>
-                <w:szCs w:val="22"/>
-              </w:rPr>
-              <w:t/>
-            </w:r>
-            <w:r>
-              <w:rPr>
-                <w:sz w:val="22"/>
-                <w:szCs w:val="22"/>
-              </w:rPr>
-              <w:t/>
-            </w:r>
-            <w:r>
-              <w:rPr>
-                <w:sz w:val="22"/>
-                <w:szCs w:val="22"/>
-              </w:rPr>
-              <w:t/>
-            </w:r>
-            <w:r>
-              <w:rPr>
-                <w:sz w:val="22"/>
-                <w:szCs w:val="22"/>
-              </w:rPr>
-              <w:t/>
-            </w:r>
-            <w:r>
-              <w:rPr>
-                <w:sz w:val="22"/>
-                <w:szCs w:val="22"/>
-              </w:rPr>
-              <w:t/>
+              <w:t>___</w:t>
+            </w:r>
+            <w:r>
+              <w:rPr>
+                <w:sz w:val="22"/>
+                <w:szCs w:val="22"/>
+              </w:rPr>
+              <w:t>5</w:t>
+            </w:r>
+            <w:r>
+              <w:rPr>
+                <w:sz w:val="22"/>
+                <w:szCs w:val="22"/>
+              </w:rPr>
+              <w:t>3</w:t>
+            </w:r>
+            <w:r>
+              <w:rPr>
+                <w:sz w:val="22"/>
+                <w:szCs w:val="22"/>
+              </w:rPr>
+              <w:t>65</w:t>
+            </w:r>
+            <w:r>
+              <w:rPr>
+                <w:sz w:val="22"/>
+                <w:szCs w:val="22"/>
+              </w:rPr>
+              <w:t>______________</w:t>
             </w:r>
             <w:r>
               <w:rPr>
@@ -5037,7 +4848,7 @@
                 <w:sz w:val="22"/>
                 <w:szCs w:val="22"/>
               </w:rPr>
-              <w:t>${book_fee}</w:t>
+              <w:t>$___________________</w:t>
             </w:r>
             <w:r>
               <w:rPr>
@@ -5126,21 +4937,21 @@
                 <w:szCs w:val="22"/>
               </w:rPr>
               <w:tab/>
-              <w:t>${compulsory_fee}</w:t>
-            </w:r>
-            <w:r>
-              <w:rPr>
-                <w:sz w:val="22"/>
-                <w:szCs w:val="22"/>
-              </w:rPr>
-              <w:t/>
-            </w:r>
-            <w:r>
-              <w:rPr>
-                <w:sz w:val="22"/>
-                <w:szCs w:val="22"/>
-              </w:rPr>
-              <w:t/>
+              <w:t>$_____________</w:t>
+            </w:r>
+            <w:r>
+              <w:rPr>
+                <w:sz w:val="22"/>
+                <w:szCs w:val="22"/>
+              </w:rPr>
+              <w:t>___</w:t>
+            </w:r>
+            <w:r>
+              <w:rPr>
+                <w:sz w:val="22"/>
+                <w:szCs w:val="22"/>
+              </w:rPr>
+              <w:t>___</w:t>
             </w:r>
             <w:r>
               <w:rPr>
@@ -5228,7 +5039,7 @@
                 <w:sz w:val="22"/>
                 <w:szCs w:val="22"/>
               </w:rPr>
-              <w:t xml:space="preserve">${field_trip_fee} </w:t>
+              <w:t xml:space="preserve">$___________________ </w:t>
             </w:r>
             <w:r>
               <w:rPr>
@@ -5282,21 +5093,21 @@
                 <w:szCs w:val="22"/>
               </w:rPr>
               <w:tab/>
-              <w:t>${uniform_equipment_fee}</w:t>
-            </w:r>
-            <w:r>
-              <w:rPr>
-                <w:sz w:val="22"/>
-                <w:szCs w:val="22"/>
-              </w:rPr>
-              <w:t/>
-            </w:r>
-            <w:r>
-              <w:rPr>
-                <w:sz w:val="22"/>
-                <w:szCs w:val="22"/>
-              </w:rPr>
-              <w:t/>
+              <w:t>$_____________</w:t>
+            </w:r>
+            <w:r>
+              <w:rPr>
+                <w:sz w:val="22"/>
+                <w:szCs w:val="22"/>
+              </w:rPr>
+              <w:t>___</w:t>
+            </w:r>
+            <w:r>
+              <w:rPr>
+                <w:sz w:val="22"/>
+                <w:szCs w:val="22"/>
+              </w:rPr>
+              <w:t>___</w:t>
             </w:r>
             <w:r>
               <w:rPr>
@@ -5378,7 +5189,7 @@
                 <w:sz w:val="22"/>
                 <w:szCs w:val="22"/>
               </w:rPr>
-              <w:t>{professional_exam_fee}</w:t>
+              <w:t>___________________</w:t>
             </w:r>
           </w:p>
           <w:p>
@@ -5424,21 +5235,21 @@
                 <w:sz w:val="22"/>
                 <w:szCs w:val="22"/>
               </w:rPr>
-              <w:t>${expendable_supplies_fee}</w:t>
-            </w:r>
-            <w:r>
-              <w:rPr>
-                <w:sz w:val="22"/>
-                <w:szCs w:val="22"/>
-              </w:rPr>
-              <w:t/>
-            </w:r>
-            <w:r>
-              <w:rPr>
-                <w:sz w:val="22"/>
-                <w:szCs w:val="22"/>
-              </w:rPr>
-              <w:t/>
+              <w:t>$____________</w:t>
+            </w:r>
+            <w:r>
+              <w:rPr>
+                <w:sz w:val="22"/>
+                <w:szCs w:val="22"/>
+              </w:rPr>
+              <w:t>___</w:t>
+            </w:r>
+            <w:r>
+              <w:rPr>
+                <w:sz w:val="22"/>
+                <w:szCs w:val="22"/>
+              </w:rPr>
+              <w:t>____</w:t>
             </w:r>
             <w:r>
               <w:rPr>
@@ -5492,7 +5303,7 @@
                 <w:szCs w:val="22"/>
               </w:rPr>
               <w:tab/>
-              <w:t>${international_fee}</w:t>
+              <w:t>$___________________</w:t>
             </w:r>
             <w:r>
               <w:rPr>
@@ -5565,7 +5376,7 @@
                 <w:sz w:val="22"/>
                 <w:szCs w:val="22"/>
               </w:rPr>
-              <w:t>{optional_fee}</w:t>
+              <w:t>___________________</w:t>
             </w:r>
           </w:p>
           <w:p>
@@ -5652,7 +5463,7 @@
                 <w:sz w:val="22"/>
                 <w:szCs w:val="22"/>
               </w:rPr>
-              <w:t xml:space="preserve"> {total_fees}</w:t>
+              <w:t xml:space="preserve"> ____</w:t>
             </w:r>
             <w:r>
               <w:rPr>
@@ -5661,7 +5472,7 @@
                 <w:sz w:val="22"/>
                 <w:szCs w:val="22"/>
               </w:rPr>
-              <w:t/>
+              <w:t>5</w:t>
             </w:r>
             <w:r>
               <w:rPr>
@@ -5670,7 +5481,7 @@
                 <w:sz w:val="22"/>
                 <w:szCs w:val="22"/>
               </w:rPr>
-              <w:t/>
+              <w:t>3</w:t>
             </w:r>
             <w:r>
               <w:rPr>
@@ -5679,7 +5490,7 @@
                 <w:sz w:val="22"/>
                 <w:szCs w:val="22"/>
               </w:rPr>
-              <w:t/>
+              <w:t>65</w:t>
             </w:r>
             <w:r>
               <w:rPr>
@@ -5688,7 +5499,7 @@
                 <w:sz w:val="22"/>
                 <w:szCs w:val="22"/>
               </w:rPr>
-              <w:t/>
+              <w:t>______</w:t>
             </w:r>
             <w:r>
               <w:rPr>
@@ -5697,7 +5508,7 @@
                 <w:sz w:val="22"/>
                 <w:szCs w:val="22"/>
               </w:rPr>
-              <w:t/>
+              <w:t>__</w:t>
             </w:r>
             <w:r>
               <w:rPr>
@@ -5706,7 +5517,7 @@
                 <w:sz w:val="22"/>
                 <w:szCs w:val="22"/>
               </w:rPr>
-              <w:t/>
+              <w:t>_______</w:t>
             </w:r>
             <w:r>
               <w:rPr>
@@ -5852,7 +5663,7 @@
                 <w:sz w:val="22"/>
                 <w:szCs w:val="22"/>
               </w:rPr>
-              <w:t>{payment_before_signing}</w:t>
+              <w:t>865</w:t>
             </w:r>
           </w:p>
           <w:p>
@@ -5911,7 +5722,7 @@
                 <w:sz w:val="22"/>
                 <w:szCs w:val="22"/>
               </w:rPr>
-              <w:t>{payment_after_signing}</w:t>
+              <w:t>NIL</w:t>
             </w:r>
           </w:p>
           <w:p>
@@ -6064,7 +5875,7 @@
                       <w:sz w:val="22"/>
                       <w:szCs w:val="22"/>
                     </w:rPr>
-                    <w:t>{installment_1_due_date}</w:t>
+                    <w:t>01/06/2026</w:t>
                   </w:r>
                 </w:p>
               </w:tc>
@@ -6089,7 +5900,7 @@
                       <w:sz w:val="22"/>
                       <w:szCs w:val="22"/>
                     </w:rPr>
-                    <w:t>{installment_1_amount}</w:t>
+                    <w:t>900</w:t>
                   </w:r>
                 </w:p>
               </w:tc>
@@ -6151,7 +5962,7 @@
                       <w:sz w:val="22"/>
                       <w:szCs w:val="22"/>
                     </w:rPr>
-                    <w:t>{installment_2_due_date}</w:t>
+                    <w:t>01/07/2026</w:t>
                   </w:r>
                 </w:p>
               </w:tc>
@@ -6176,7 +5987,7 @@
                       <w:sz w:val="22"/>
                       <w:szCs w:val="22"/>
                     </w:rPr>
-                    <w:t>{installment_2_amount}</w:t>
+                    <w:t>900</w:t>
                   </w:r>
                 </w:p>
               </w:tc>
@@ -6238,7 +6049,7 @@
                       <w:sz w:val="22"/>
                       <w:szCs w:val="22"/>
                     </w:rPr>
-                    <w:t>{installment_3_due_date}</w:t>
+                    <w:t>01/08/2026</w:t>
                   </w:r>
                 </w:p>
               </w:tc>
@@ -6263,7 +6074,7 @@
                       <w:sz w:val="22"/>
                       <w:szCs w:val="22"/>
                     </w:rPr>
-                    <w:t>{installment_3_amount}</w:t>
+                    <w:t>900</w:t>
                   </w:r>
                 </w:p>
               </w:tc>
@@ -6325,7 +6136,7 @@
                       <w:sz w:val="22"/>
                       <w:szCs w:val="22"/>
                     </w:rPr>
-                    <w:t>{installment_4_due_date}</w:t>
+                    <w:t>01/0</w:t>
                   </w:r>
                   <w:r>
                     <w:rPr>
@@ -6334,7 +6145,7 @@
                       <w:sz w:val="22"/>
                       <w:szCs w:val="22"/>
                     </w:rPr>
-                    <w:t/>
+                    <w:t>9</w:t>
                   </w:r>
                   <w:r>
                     <w:rPr>
@@ -6343,7 +6154,7 @@
                       <w:sz w:val="22"/>
                       <w:szCs w:val="22"/>
                     </w:rPr>
-                    <w:t/>
+                    <w:t>/2026</w:t>
                   </w:r>
                 </w:p>
               </w:tc>
@@ -6368,7 +6179,7 @@
                       <w:sz w:val="22"/>
                       <w:szCs w:val="22"/>
                     </w:rPr>
-                    <w:t>{installment_4_amount}</w:t>
+                    <w:t>900</w:t>
                   </w:r>
                 </w:p>
               </w:tc>
@@ -6430,7 +6241,7 @@
                       <w:sz w:val="22"/>
                       <w:szCs w:val="22"/>
                     </w:rPr>
-                    <w:t>{installment_5_due_date}</w:t>
+                    <w:t>01/10/2026</w:t>
                   </w:r>
                 </w:p>
               </w:tc>
@@ -6455,7 +6266,7 @@
                       <w:sz w:val="22"/>
                       <w:szCs w:val="22"/>
                     </w:rPr>
-                    <w:t>{installment_5_amount}</w:t>
+                    <w:t>900</w:t>
                   </w:r>
                 </w:p>
               </w:tc>
@@ -6785,7 +6596,7 @@
                 <w:sz w:val="22"/>
                 <w:szCs w:val="22"/>
               </w:rPr>
-              <w:t>{installment_total}</w:t>
+              <w:t>4</w:t>
             </w:r>
             <w:r>
               <w:rPr>
@@ -6794,7 +6605,7 @@
                 <w:sz w:val="22"/>
                 <w:szCs w:val="22"/>
               </w:rPr>
-              <w:t/>
+              <w:t>500</w:t>
             </w:r>
             <w:r>
               <w:rPr>
@@ -7024,7 +6835,7 @@
                 <w:sz w:val="22"/>
                 <w:szCs w:val="22"/>
               </w:rPr>
-              <w:t>{total_payments}</w:t>
+              <w:t>5</w:t>
             </w:r>
             <w:r>
               <w:rPr>
@@ -7033,7 +6844,7 @@
                 <w:sz w:val="22"/>
                 <w:szCs w:val="22"/>
               </w:rPr>
-              <w:t/>
+              <w:t>3</w:t>
             </w:r>
             <w:r>
               <w:rPr>
@@ -7042,7 +6853,7 @@
                 <w:sz w:val="22"/>
                 <w:szCs w:val="22"/>
               </w:rPr>
-              <w:t/>
+              <w:t>65</w:t>
             </w:r>
           </w:p>
           <w:p>
@@ -7133,7 +6944,7 @@
                 <w:sz w:val="28"/>
                 <w:szCs w:val="28"/>
               </w:rPr>
-              <w:t>{student_full_name}</w:t>
+              <w:t>CHIDI GLORIA AROWOLO</w:t>
             </w:r>
           </w:p>
           <w:p>
@@ -7417,7 +7228,7 @@
                 <w:sz w:val="28"/>
                 <w:szCs w:val="28"/>
               </w:rPr>
-              <w:t>{student_full_name}</w:t>
+              <w:t>CHIDI GLORIA AROWOLO</w:t>
             </w:r>
             <w:r>
               <w:rPr>
@@ -9264,7 +9075,7 @@
                 <w:sz w:val="22"/>
                 <w:szCs w:val="22"/>
               </w:rPr>
-              <w:t>{program_name}</w:t>
+              <w:t>NACC Personal Support Worker (PSW)</w:t>
             </w:r>
             <w:r>
               <w:rPr>
@@ -9678,7 +9489,7 @@
                 <w:sz w:val="32"/>
                 <w:szCs w:val="32"/>
               </w:rPr>
-              <w:t>{student_full_name}</w:t>
+              <w:t>CHIDI GLORIA AROWOLO</w:t>
             </w:r>
             <w:r>
               <w:rPr>
@@ -10055,21 +9866,7 @@
                 <w:sz w:val="22"/>
                 <w:szCs w:val="22"/>
               </w:rPr>
-              <w:t xml:space="preserve">I understand that I can refuse to sign this consent form and that I can withdraw my consent at any time for future uses of my personal information by writing to the Chief Operating Officer at 25 </w:t>
-            </w:r>
-            <w:r>
-              <w:rPr>
-                <w:sz w:val="22"/>
-                <w:szCs w:val="22"/>
-              </w:rPr>
-              <w:t>Watline</w:t>
-            </w:r>
-            <w:r>
-              <w:rPr>
-                <w:sz w:val="22"/>
-                <w:szCs w:val="22"/>
-              </w:rPr>
-              <w:t xml:space="preserve"> Avenue, Unit 204 Mississauga, Ontario, L4Z 2Z1. I understand that if I refuse or withdraw my consent the Superintendent may not be able to contact me to inform me of my rights under the Act or collect information to help potential students make informed decisions about their educational choices.</w:t>
+              <w:t>I understand that I can refuse to sign this consent form and that I can withdraw my consent at any time for future uses of my personal information by writing to the Chief Operating Officer at 25 Watline Avenue, Unit 204 Mississauga, Ontario, L4Z 2Z1. I understand that if I refuse or withdraw my consent the Superintendent may not be able to contact me to inform me of my rights under the Act or collect information to help potential students make informed decisions about their educational choices.</w:t>
             </w:r>
           </w:p>
           <w:p>
@@ -10116,7 +9913,7 @@
                 <w:sz w:val="28"/>
                 <w:szCs w:val="28"/>
               </w:rPr>
-              <w:t>{student_full_name}</w:t>
+              <w:t>CHIDI GLORIA AROWOLO</w:t>
             </w:r>
           </w:p>
           <w:p>
@@ -10595,21 +10392,7 @@
                 <w:sz w:val="22"/>
                 <w:szCs w:val="22"/>
               </w:rPr>
-              <w:t xml:space="preserve"> mid-point” means the point in the progress of a vocational program where half of the scheduled hours of instruction for the program have taken place; (“mi-</w:t>
-            </w:r>
-            <w:r>
-              <w:rPr>
-                <w:sz w:val="22"/>
-                <w:szCs w:val="22"/>
-              </w:rPr>
-              <w:t>parcours</w:t>
-            </w:r>
-            <w:r>
-              <w:rPr>
-                <w:sz w:val="22"/>
-                <w:szCs w:val="22"/>
-              </w:rPr>
-              <w:t xml:space="preserve"> du programme”) </w:t>
+              <w:t xml:space="preserve"> mid-point” means the point in the progress of a vocational program where half of the scheduled hours of instruction for the program have taken place; (“mi-parcours du programme”) </w:t>
             </w:r>
           </w:p>
           <w:p>
@@ -13035,7 +12818,7 @@
           <w:lang w:val="en-US"/>
           <w14:ligatures w14:val="none"/>
         </w:rPr>
-        <w:t>{program_name}</w:t>
+        <w:t>NACC</w:t>
       </w:r>
       <w:r>
         <w:rPr>
@@ -13049,7 +12832,7 @@
           <w:lang w:val="en-US"/>
           <w14:ligatures w14:val="none"/>
         </w:rPr>
-        <w:t xml:space="preserve"/>
+        <w:t xml:space="preserve"> </w:t>
       </w:r>
       <w:r>
         <w:rPr>
@@ -13062,7 +12845,7 @@
           <w:lang w:val="en-US"/>
           <w14:ligatures w14:val="none"/>
         </w:rPr>
-        <w:t/>
+        <w:t>Personal Support Worker (PSW)</w:t>
       </w:r>
       <w:r>
         <w:rPr>
@@ -15138,7 +14921,7 @@
           <w:sz w:val="28"/>
           <w:szCs w:val="28"/>
         </w:rPr>
-        <w:t>{student_full_name}</w:t>
+        <w:t>CHIDI GLORIA AROWOLO</w:t>
       </w:r>
       <w:r>
         <w:rPr>
@@ -15503,29 +15286,7 @@
           <w:lang w:val="en-US"/>
           <w14:ligatures w14:val="none"/>
         </w:rPr>
-        <w:t xml:space="preserve">submit up-to-date immunization status within 45 days of commencement of study and that I must, while enrolled in the program, maintain this status </w:t>
-      </w:r>
-      <w:r>
-        <w:rPr>
-          <w:rFonts w:ascii="Calibri" w:eastAsia="Calibri" w:hAnsi="Calibri" w:cs="Calibri"/>
-          <w:kern w:val="0"/>
-          <w:sz w:val="23"/>
-          <w:szCs w:val="23"/>
-          <w:lang w:val="en-US"/>
-          <w14:ligatures w14:val="none"/>
-        </w:rPr>
-        <w:t>in order to</w:t>
-      </w:r>
-      <w:r>
-        <w:rPr>
-          <w:rFonts w:ascii="Calibri" w:eastAsia="Calibri" w:hAnsi="Calibri" w:cs="Calibri"/>
-          <w:kern w:val="0"/>
-          <w:sz w:val="23"/>
-          <w:szCs w:val="23"/>
-          <w:lang w:val="en-US"/>
-          <w14:ligatures w14:val="none"/>
-        </w:rPr>
-        <w:t xml:space="preserve"> complete the practicum placement and graduate.</w:t>
+        <w:t>submit up-to-date immunization status within 45 days of commencement of study and that I must, while enrolled in the program, maintain this status in order to complete the practicum placement and graduate.</w:t>
       </w:r>
     </w:p>
     <w:p>
@@ -20159,7 +19920,7 @@
           <w:sz w:val="28"/>
           <w:szCs w:val="28"/>
         </w:rPr>
-        <w:t>{student_full_name}</w:t>
+        <w:t>CHIDI GLORIA AROWOLO</w:t>
       </w:r>
       <w:r>
         <w:rPr>
@@ -22104,7 +21865,7 @@
           <w:sz w:val="22"/>
           <w:szCs w:val="22"/>
         </w:rPr>
-        <w:t>{program_name}</w:t>
+        <w:t>Personal Support Worker (PSW) Program</w:t>
       </w:r>
       <w:r>
         <w:rPr>
@@ -22174,50 +21935,34 @@
           <w:sz w:val="22"/>
           <w:szCs w:val="22"/>
         </w:rPr>
-        <w:t xml:space="preserve">We ask that you read the following carefully and sign below to acknowledge </w:t>
-      </w:r>
-      <w:r>
+        <w:t>We ask that you read the following carefully and sign below to acknowledge your understanding and agreement.</w:t>
+      </w:r>
+    </w:p>
+    <w:p>
+      <w:pPr>
+        <w:pStyle w:val="Default"/>
         <w:rPr>
           <w:rFonts w:asciiTheme="minorHAnsi" w:hAnsiTheme="minorHAnsi"/>
           <w:sz w:val="22"/>
           <w:szCs w:val="22"/>
         </w:rPr>
-        <w:t>your</w:t>
-      </w:r>
-      <w:r>
+      </w:pPr>
+    </w:p>
+    <w:p>
+      <w:pPr>
+        <w:pStyle w:val="Default"/>
         <w:rPr>
           <w:rFonts w:asciiTheme="minorHAnsi" w:hAnsiTheme="minorHAnsi"/>
           <w:sz w:val="22"/>
           <w:szCs w:val="22"/>
         </w:rPr>
-        <w:t xml:space="preserve"> understanding and agreement.</w:t>
-      </w:r>
-    </w:p>
-    <w:p>
-      <w:pPr>
-        <w:pStyle w:val="Default"/>
+      </w:pPr>
+      <w:r>
         <w:rPr>
           <w:rFonts w:asciiTheme="minorHAnsi" w:hAnsiTheme="minorHAnsi"/>
           <w:sz w:val="22"/>
           <w:szCs w:val="22"/>
         </w:rPr>
-      </w:pPr>
-    </w:p>
-    <w:p>
-      <w:pPr>
-        <w:pStyle w:val="Default"/>
-        <w:rPr>
-          <w:rFonts w:asciiTheme="minorHAnsi" w:hAnsiTheme="minorHAnsi"/>
-          <w:sz w:val="22"/>
-          <w:szCs w:val="22"/>
-        </w:rPr>
-      </w:pPr>
-      <w:r>
-        <w:rPr>
-          <w:rFonts w:asciiTheme="minorHAnsi" w:hAnsiTheme="minorHAnsi"/>
-          <w:sz w:val="22"/>
-          <w:szCs w:val="22"/>
-        </w:rPr>
         <w:pict w14:anchorId="76A3705E">
           <v:rect id="_x0000_i1025" style="width:0;height:1.5pt" o:hralign="center" o:hrstd="t" o:hr="t" fillcolor="#a0a0a0" stroked="f"/>
         </w:pict>
@@ -22242,7 +21987,7 @@
           <w:sz w:val="22"/>
           <w:szCs w:val="22"/>
         </w:rPr>
-        <w:t/>
+        <w:t>📌</w:t>
       </w:r>
       <w:r>
         <w:rPr>
@@ -22372,23 +22117,7 @@
           <w:sz w:val="22"/>
           <w:szCs w:val="22"/>
         </w:rPr>
-        <w:t xml:space="preserve"> manner </w:t>
-      </w:r>
-      <w:r>
-        <w:rPr>
-          <w:rFonts w:asciiTheme="minorHAnsi" w:hAnsiTheme="minorHAnsi"/>
-          <w:sz w:val="22"/>
-          <w:szCs w:val="22"/>
-        </w:rPr>
-        <w:t>at all times</w:t>
-      </w:r>
-      <w:r>
-        <w:rPr>
-          <w:rFonts w:asciiTheme="minorHAnsi" w:hAnsiTheme="minorHAnsi"/>
-          <w:sz w:val="22"/>
-          <w:szCs w:val="22"/>
-        </w:rPr>
-        <w:t>.</w:t>
+        <w:t xml:space="preserve"> manner at all times.</w:t>
       </w:r>
     </w:p>
     <w:p>
@@ -22965,7 +22694,7 @@
           <w:sz w:val="22"/>
           <w:szCs w:val="22"/>
         </w:rPr>
-        <w:t>{total_practicum_hours} hours</w:t>
+        <w:t>300 hours</w:t>
       </w:r>
       <w:r>
         <w:rPr>
@@ -22995,7 +22724,7 @@
           <w:sz w:val="22"/>
           <w:szCs w:val="22"/>
         </w:rPr>
-        <w:t xml:space="preserve">{practicum_1_hours} hours in a </w:t>
+        <w:t xml:space="preserve">200 hours in a </w:t>
       </w:r>
       <w:r>
         <w:rPr>
@@ -23035,7 +22764,7 @@
           <w:sz w:val="22"/>
           <w:szCs w:val="22"/>
         </w:rPr>
-        <w:t xml:space="preserve">{practicum_2_hours} hours in a </w:t>
+        <w:t xml:space="preserve">100 hours in a </w:t>
       </w:r>
       <w:r>
         <w:rPr>
@@ -23195,23 +22924,7 @@
           <w:sz w:val="22"/>
           <w:szCs w:val="22"/>
         </w:rPr>
-        <w:t xml:space="preserve">, with proper </w:t>
-      </w:r>
-      <w:r>
-        <w:rPr>
-          <w:rFonts w:asciiTheme="minorHAnsi" w:hAnsiTheme="minorHAnsi"/>
-          <w:sz w:val="22"/>
-          <w:szCs w:val="22"/>
-        </w:rPr>
-        <w:t>sign-offs</w:t>
-      </w:r>
-      <w:r>
-        <w:rPr>
-          <w:rFonts w:asciiTheme="minorHAnsi" w:hAnsiTheme="minorHAnsi"/>
-          <w:sz w:val="22"/>
-          <w:szCs w:val="22"/>
-        </w:rPr>
-        <w:t>.</w:t>
+        <w:t>, with proper sign-offs.</w:t>
       </w:r>
     </w:p>
     <w:p>
@@ -23423,7 +23136,7 @@
           <w:sz w:val="22"/>
           <w:szCs w:val="22"/>
         </w:rPr>
-        <w:t/>
+        <w:t>📄</w:t>
       </w:r>
       <w:r>
         <w:rPr>
@@ -23512,7 +23225,7 @@
           <w:sz w:val="28"/>
           <w:szCs w:val="28"/>
         </w:rPr>
-        <w:t>{student_full_name}</w:t>
+        <w:t>CHIDI GLORIA AROWOLO</w:t>
       </w:r>
       <w:r>
         <w:rPr>
@@ -23838,7 +23551,7 @@
           <w:sz w:val="28"/>
           <w:szCs w:val="28"/>
         </w:rPr>
-        <w:t>{student_full_name}</w:t>
+        <w:t>CHIDI GLORIA AROWOLO</w:t>
       </w:r>
       <w:r>
         <w:rPr>
@@ -23868,7 +23581,7 @@
           <w:sz w:val="22"/>
           <w:szCs w:val="22"/>
         </w:rPr>
-        <w:t>{program_name}</w:t>
+        <w:t>NACC PSW</w:t>
       </w:r>
       <w:r>
         <w:rPr>
@@ -23899,7 +23612,7 @@
           <w:sz w:val="22"/>
           <w:szCs w:val="22"/>
         </w:rPr>
-        <w:t>{program_start_date}</w:t>
+        <w:t>27</w:t>
       </w:r>
       <w:r>
         <w:rPr>
@@ -23908,7 +23621,7 @@
           <w:sz w:val="22"/>
           <w:szCs w:val="22"/>
         </w:rPr>
-        <w:t/>
+        <w:t>/</w:t>
       </w:r>
       <w:r>
         <w:rPr>
@@ -23917,7 +23630,7 @@
           <w:sz w:val="22"/>
           <w:szCs w:val="22"/>
         </w:rPr>
-        <w:t/>
+        <w:t>04</w:t>
       </w:r>
       <w:r>
         <w:rPr>
@@ -23926,7 +23639,7 @@
           <w:sz w:val="22"/>
           <w:szCs w:val="22"/>
         </w:rPr>
-        <w:t/>
+        <w:t>/202</w:t>
       </w:r>
       <w:r>
         <w:rPr>
@@ -23935,7 +23648,7 @@
           <w:sz w:val="22"/>
           <w:szCs w:val="22"/>
         </w:rPr>
-        <w:t/>
+        <w:t>6</w:t>
       </w:r>
       <w:r>
         <w:rPr>
@@ -23972,7 +23685,7 @@
           <w:sz w:val="22"/>
           <w:szCs w:val="22"/>
         </w:rPr>
-        <w:t>{expected_completion_date}</w:t>
+        <w:t>25/</w:t>
       </w:r>
       <w:r>
         <w:rPr>
@@ -23981,7 +23694,7 @@
           <w:sz w:val="22"/>
           <w:szCs w:val="22"/>
         </w:rPr>
-        <w:t/>
+        <w:t>10</w:t>
       </w:r>
       <w:r>
         <w:rPr>
@@ -23990,7 +23703,7 @@
           <w:sz w:val="22"/>
           <w:szCs w:val="22"/>
         </w:rPr>
-        <w:t/>
+        <w:t>/2026</w:t>
       </w:r>
     </w:p>
     <w:p>
@@ -24249,21 +23962,7 @@
           <w:szCs w:val="22"/>
         </w:rPr>
         <w:br/>
-        <w:t xml:space="preserve">I understand that it is my responsibility to ensure compliance with Immigration, Refugees and Citizenship Canada (IRCC) regulations </w:t>
-      </w:r>
-      <w:r>
-        <w:rPr>
-          <w:sz w:val="22"/>
-          <w:szCs w:val="22"/>
-        </w:rPr>
-        <w:t>at all times</w:t>
-      </w:r>
-      <w:r>
-        <w:rPr>
-          <w:sz w:val="22"/>
-          <w:szCs w:val="22"/>
-        </w:rPr>
-        <w:t>, and to seek legal or immigration counsel if needed.</w:t>
+        <w:t>I understand that it is my responsibility to ensure compliance with Immigration, Refugees and Citizenship Canada (IRCC) regulations at all times, and to seek legal or immigration counsel if needed.</w:t>
       </w:r>
     </w:p>
     <w:p>
@@ -24683,7 +24382,7 @@
           <w:sz w:val="28"/>
           <w:szCs w:val="28"/>
         </w:rPr>
-        <w:t>{student_full_name}</w:t>
+        <w:t>CHIDI GLORIA AROWOLO</w:t>
       </w:r>
     </w:p>
     <w:p>

</xml_diff>

<commit_message>
Work on contract dynamic markers
</commit_message>
<xml_diff>
--- a/src/templates/contracts/student-enrolment-template.docx
+++ b/src/templates/contracts/student-enrolment-template.docx
@@ -1483,14 +1483,14 @@
                 <w:sz w:val="22"/>
                 <w:szCs w:val="22"/>
               </w:rPr>
-              <w:t>International Student</w:t>
-            </w:r>
-            <w:r>
-              <w:rPr>
-                <w:sz w:val="22"/>
-                <w:szCs w:val="22"/>
-              </w:rPr>
-              <w:t>:</w:t>
+              <w:t xml:space="preserve">International Student:  </w:t>
+            </w:r>
+            <w:r>
+              <w:rPr>
+                <w:sz w:val="22"/>
+                <w:szCs w:val="22"/>
+              </w:rPr>
+              <w:t xml:space="preserve">{international_yes} Yes</w:t>
             </w:r>
             <w:r>
               <w:rPr>
@@ -1498,7 +1498,6 @@
                 <w:szCs w:val="22"/>
               </w:rPr>
               <w:tab/>
-              <w:t xml:space="preserve">             Yes</w:t>
             </w:r>
             <w:r>
               <w:rPr>
@@ -1519,8 +1518,7 @@
                 <w:sz w:val="22"/>
                 <w:szCs w:val="22"/>
               </w:rPr>
-              <w:tab/>
-              <w:t xml:space="preserve">   No</w:t>
+              <w:t xml:space="preserve">{international_no} No</w:t>
             </w:r>
           </w:p>
           <w:p>
@@ -4020,101 +4018,14 @@
                 <w:sz w:val="22"/>
                 <w:szCs w:val="22"/>
               </w:rPr>
-              <w:t>Method of program delivery</w:t>
-            </w:r>
-            <w:r>
-              <w:rPr>
-                <w:sz w:val="22"/>
-                <w:szCs w:val="22"/>
-              </w:rPr>
-              <w:tab/>
-            </w:r>
-            <w:r>
-              <w:rPr>
-                <w:noProof/>
-                <w:sz w:val="22"/>
-                <w:szCs w:val="22"/>
-              </w:rPr>
-              <w:drawing>
-                <wp:inline distT="0" distB="0" distL="0" distR="0" wp14:anchorId="3BB91ED2" wp14:editId="0279843F">
-                  <wp:extent cx="115570" cy="103505"/>
-                  <wp:effectExtent l="0" t="0" r="0" b="0"/>
-                  <wp:docPr id="319108141" name="Picture 3"/>
-                  <wp:cNvGraphicFramePr>
-                    <a:graphicFrameLocks xmlns:a="http://schemas.openxmlformats.org/drawingml/2006/main" noChangeAspect="1"/>
-                  </wp:cNvGraphicFramePr>
-                  <a:graphic xmlns:a="http://schemas.openxmlformats.org/drawingml/2006/main">
-                    <a:graphicData uri="http://schemas.openxmlformats.org/drawingml/2006/picture">
-                      <pic:pic xmlns:pic="http://schemas.openxmlformats.org/drawingml/2006/picture">
-                        <pic:nvPicPr>
-                          <pic:cNvPr id="0" name="Picture 3"/>
-                          <pic:cNvPicPr>
-                            <a:picLocks noChangeAspect="1" noChangeArrowheads="1"/>
-                          </pic:cNvPicPr>
-                        </pic:nvPicPr>
-                        <pic:blipFill>
-                          <a:blip r:embed="rId8">
-                            <a:extLst>
-                              <a:ext uri="{28A0092B-C50C-407E-A947-70E740481C1C}">
-                                <a14:useLocalDpi xmlns:a14="http://schemas.microsoft.com/office/drawing/2010/main" val="0"/>
-                              </a:ext>
-                            </a:extLst>
-                          </a:blip>
-                          <a:srcRect/>
-                          <a:stretch>
-                            <a:fillRect/>
-                          </a:stretch>
-                        </pic:blipFill>
-                        <pic:spPr bwMode="auto">
-                          <a:xfrm>
-                            <a:off x="0" y="0"/>
-                            <a:ext cx="115570" cy="103505"/>
-                          </a:xfrm>
-                          <a:prstGeom prst="rect">
-                            <a:avLst/>
-                          </a:prstGeom>
-                          <a:noFill/>
-                        </pic:spPr>
-                      </pic:pic>
-                    </a:graphicData>
-                  </a:graphic>
-                </wp:inline>
-              </w:drawing>
-            </w:r>
-            <w:r>
-              <w:rPr>
-                <w:sz w:val="22"/>
-                <w:szCs w:val="22"/>
-              </w:rPr>
-              <w:t xml:space="preserve">  in-person </w:t>
-            </w:r>
-            <w:r>
-              <w:rPr>
-                <w:sz w:val="22"/>
-                <w:szCs w:val="22"/>
-              </w:rPr>
-              <w:t xml:space="preserve"> </w:t>
-            </w:r>
-            <w:r>
-              <w:rPr>
-                <w:sz w:val="22"/>
-                <w:szCs w:val="22"/>
-              </w:rPr>
-              <w:t xml:space="preserve"> </w:t>
-            </w:r>
-            <w:r>
-              <w:rPr>
-                <w:sz w:val="22"/>
-                <w:szCs w:val="22"/>
-              </w:rPr>
-              <w:t xml:space="preserve"> </w:t>
-            </w:r>
-            <w:r>
-              <w:rPr>
-                <w:sz w:val="22"/>
-                <w:szCs w:val="22"/>
-              </w:rPr>
-              <w:t>Hybrid</w:t>
+              <w:t xml:space="preserve">Method of program delivery  </w:t>
+            </w:r>
+            <w:r>
+              <w:rPr>
+                <w:sz w:val="22"/>
+                <w:szCs w:val="22"/>
+              </w:rPr>
+              <w:t xml:space="preserve">{delivery_in_person} in-person</w:t>
             </w:r>
             <w:r>
               <w:rPr>
@@ -4128,66 +4039,21 @@
                 <w:sz w:val="22"/>
                 <w:szCs w:val="22"/>
               </w:rPr>
-              <w:t xml:space="preserve"> </w:t>
-            </w:r>
-            <w:r>
-              <w:rPr>
-                <w:noProof/>
-                <w:sz w:val="22"/>
-                <w:szCs w:val="22"/>
-              </w:rPr>
-              <w:drawing>
-                <wp:inline distT="0" distB="0" distL="0" distR="0" wp14:anchorId="2C8E8DFF" wp14:editId="240033C0">
-                  <wp:extent cx="115570" cy="97790"/>
-                  <wp:effectExtent l="0" t="0" r="0" b="0"/>
-                  <wp:docPr id="928327405" name="Picture 2"/>
-                  <wp:cNvGraphicFramePr>
-                    <a:graphicFrameLocks xmlns:a="http://schemas.openxmlformats.org/drawingml/2006/main" noChangeAspect="1"/>
-                  </wp:cNvGraphicFramePr>
-                  <a:graphic xmlns:a="http://schemas.openxmlformats.org/drawingml/2006/main">
-                    <a:graphicData uri="http://schemas.openxmlformats.org/drawingml/2006/picture">
-                      <pic:pic xmlns:pic="http://schemas.openxmlformats.org/drawingml/2006/picture">
-                        <pic:nvPicPr>
-                          <pic:cNvPr id="0" name="Picture 2"/>
-                          <pic:cNvPicPr>
-                            <a:picLocks noChangeAspect="1" noChangeArrowheads="1"/>
-                          </pic:cNvPicPr>
-                        </pic:nvPicPr>
-                        <pic:blipFill>
-                          <a:blip r:embed="rId9">
-                            <a:extLst>
-                              <a:ext uri="{28A0092B-C50C-407E-A947-70E740481C1C}">
-                                <a14:useLocalDpi xmlns:a14="http://schemas.microsoft.com/office/drawing/2010/main" val="0"/>
-                              </a:ext>
-                            </a:extLst>
-                          </a:blip>
-                          <a:srcRect/>
-                          <a:stretch>
-                            <a:fillRect/>
-                          </a:stretch>
-                        </pic:blipFill>
-                        <pic:spPr bwMode="auto">
-                          <a:xfrm>
-                            <a:off x="0" y="0"/>
-                            <a:ext cx="115570" cy="97790"/>
-                          </a:xfrm>
-                          <a:prstGeom prst="rect">
-                            <a:avLst/>
-                          </a:prstGeom>
-                          <a:noFill/>
-                        </pic:spPr>
-                      </pic:pic>
-                    </a:graphicData>
-                  </a:graphic>
-                </wp:inline>
-              </w:drawing>
-            </w:r>
-            <w:r>
-              <w:rPr>
-                <w:sz w:val="22"/>
-                <w:szCs w:val="22"/>
-              </w:rPr>
-              <w:t xml:space="preserve"> Online</w:t>
+              <w:t xml:space="preserve">{delivery_hybrid} Hybrid</w:t>
+            </w:r>
+            <w:r>
+              <w:rPr>
+                <w:sz w:val="22"/>
+                <w:szCs w:val="22"/>
+              </w:rPr>
+              <w:t xml:space="preserve">      </w:t>
+            </w:r>
+            <w:r>
+              <w:rPr>
+                <w:sz w:val="22"/>
+                <w:szCs w:val="22"/>
+              </w:rPr>
+              <w:t xml:space="preserve">{delivery_online} Online</w:t>
             </w:r>
           </w:p>
           <w:p>
@@ -4390,7 +4256,7 @@
                 <w:szCs w:val="22"/>
                 <w:u w:val="single"/>
               </w:rPr>
-              <w:lastRenderedPageBreak/>
+              <w:br w:type="page"/>
               <w:t>English Language Proficiency</w:t>
             </w:r>
           </w:p>

</xml_diff>

<commit_message>
Work on contract dynamic markers (#33)
</commit_message>
<xml_diff>
--- a/src/templates/contracts/student-enrolment-template.docx
+++ b/src/templates/contracts/student-enrolment-template.docx
@@ -1483,14 +1483,14 @@
                 <w:sz w:val="22"/>
                 <w:szCs w:val="22"/>
               </w:rPr>
-              <w:t>International Student</w:t>
-            </w:r>
-            <w:r>
-              <w:rPr>
-                <w:sz w:val="22"/>
-                <w:szCs w:val="22"/>
-              </w:rPr>
-              <w:t>:</w:t>
+              <w:t xml:space="preserve">International Student:  </w:t>
+            </w:r>
+            <w:r>
+              <w:rPr>
+                <w:sz w:val="22"/>
+                <w:szCs w:val="22"/>
+              </w:rPr>
+              <w:t xml:space="preserve">{international_yes} Yes</w:t>
             </w:r>
             <w:r>
               <w:rPr>
@@ -1498,7 +1498,6 @@
                 <w:szCs w:val="22"/>
               </w:rPr>
               <w:tab/>
-              <w:t xml:space="preserve">             Yes</w:t>
             </w:r>
             <w:r>
               <w:rPr>
@@ -1519,8 +1518,7 @@
                 <w:sz w:val="22"/>
                 <w:szCs w:val="22"/>
               </w:rPr>
-              <w:tab/>
-              <w:t xml:space="preserve">   No</w:t>
+              <w:t xml:space="preserve">{international_no} No</w:t>
             </w:r>
           </w:p>
           <w:p>
@@ -4020,101 +4018,14 @@
                 <w:sz w:val="22"/>
                 <w:szCs w:val="22"/>
               </w:rPr>
-              <w:t>Method of program delivery</w:t>
-            </w:r>
-            <w:r>
-              <w:rPr>
-                <w:sz w:val="22"/>
-                <w:szCs w:val="22"/>
-              </w:rPr>
-              <w:tab/>
-            </w:r>
-            <w:r>
-              <w:rPr>
-                <w:noProof/>
-                <w:sz w:val="22"/>
-                <w:szCs w:val="22"/>
-              </w:rPr>
-              <w:drawing>
-                <wp:inline distT="0" distB="0" distL="0" distR="0" wp14:anchorId="3BB91ED2" wp14:editId="0279843F">
-                  <wp:extent cx="115570" cy="103505"/>
-                  <wp:effectExtent l="0" t="0" r="0" b="0"/>
-                  <wp:docPr id="319108141" name="Picture 3"/>
-                  <wp:cNvGraphicFramePr>
-                    <a:graphicFrameLocks xmlns:a="http://schemas.openxmlformats.org/drawingml/2006/main" noChangeAspect="1"/>
-                  </wp:cNvGraphicFramePr>
-                  <a:graphic xmlns:a="http://schemas.openxmlformats.org/drawingml/2006/main">
-                    <a:graphicData uri="http://schemas.openxmlformats.org/drawingml/2006/picture">
-                      <pic:pic xmlns:pic="http://schemas.openxmlformats.org/drawingml/2006/picture">
-                        <pic:nvPicPr>
-                          <pic:cNvPr id="0" name="Picture 3"/>
-                          <pic:cNvPicPr>
-                            <a:picLocks noChangeAspect="1" noChangeArrowheads="1"/>
-                          </pic:cNvPicPr>
-                        </pic:nvPicPr>
-                        <pic:blipFill>
-                          <a:blip r:embed="rId8">
-                            <a:extLst>
-                              <a:ext uri="{28A0092B-C50C-407E-A947-70E740481C1C}">
-                                <a14:useLocalDpi xmlns:a14="http://schemas.microsoft.com/office/drawing/2010/main" val="0"/>
-                              </a:ext>
-                            </a:extLst>
-                          </a:blip>
-                          <a:srcRect/>
-                          <a:stretch>
-                            <a:fillRect/>
-                          </a:stretch>
-                        </pic:blipFill>
-                        <pic:spPr bwMode="auto">
-                          <a:xfrm>
-                            <a:off x="0" y="0"/>
-                            <a:ext cx="115570" cy="103505"/>
-                          </a:xfrm>
-                          <a:prstGeom prst="rect">
-                            <a:avLst/>
-                          </a:prstGeom>
-                          <a:noFill/>
-                        </pic:spPr>
-                      </pic:pic>
-                    </a:graphicData>
-                  </a:graphic>
-                </wp:inline>
-              </w:drawing>
-            </w:r>
-            <w:r>
-              <w:rPr>
-                <w:sz w:val="22"/>
-                <w:szCs w:val="22"/>
-              </w:rPr>
-              <w:t xml:space="preserve">  in-person </w:t>
-            </w:r>
-            <w:r>
-              <w:rPr>
-                <w:sz w:val="22"/>
-                <w:szCs w:val="22"/>
-              </w:rPr>
-              <w:t xml:space="preserve"> </w:t>
-            </w:r>
-            <w:r>
-              <w:rPr>
-                <w:sz w:val="22"/>
-                <w:szCs w:val="22"/>
-              </w:rPr>
-              <w:t xml:space="preserve"> </w:t>
-            </w:r>
-            <w:r>
-              <w:rPr>
-                <w:sz w:val="22"/>
-                <w:szCs w:val="22"/>
-              </w:rPr>
-              <w:t xml:space="preserve"> </w:t>
-            </w:r>
-            <w:r>
-              <w:rPr>
-                <w:sz w:val="22"/>
-                <w:szCs w:val="22"/>
-              </w:rPr>
-              <w:t>Hybrid</w:t>
+              <w:t xml:space="preserve">Method of program delivery  </w:t>
+            </w:r>
+            <w:r>
+              <w:rPr>
+                <w:sz w:val="22"/>
+                <w:szCs w:val="22"/>
+              </w:rPr>
+              <w:t xml:space="preserve">{delivery_in_person} in-person</w:t>
             </w:r>
             <w:r>
               <w:rPr>
@@ -4128,66 +4039,21 @@
                 <w:sz w:val="22"/>
                 <w:szCs w:val="22"/>
               </w:rPr>
-              <w:t xml:space="preserve"> </w:t>
-            </w:r>
-            <w:r>
-              <w:rPr>
-                <w:noProof/>
-                <w:sz w:val="22"/>
-                <w:szCs w:val="22"/>
-              </w:rPr>
-              <w:drawing>
-                <wp:inline distT="0" distB="0" distL="0" distR="0" wp14:anchorId="2C8E8DFF" wp14:editId="240033C0">
-                  <wp:extent cx="115570" cy="97790"/>
-                  <wp:effectExtent l="0" t="0" r="0" b="0"/>
-                  <wp:docPr id="928327405" name="Picture 2"/>
-                  <wp:cNvGraphicFramePr>
-                    <a:graphicFrameLocks xmlns:a="http://schemas.openxmlformats.org/drawingml/2006/main" noChangeAspect="1"/>
-                  </wp:cNvGraphicFramePr>
-                  <a:graphic xmlns:a="http://schemas.openxmlformats.org/drawingml/2006/main">
-                    <a:graphicData uri="http://schemas.openxmlformats.org/drawingml/2006/picture">
-                      <pic:pic xmlns:pic="http://schemas.openxmlformats.org/drawingml/2006/picture">
-                        <pic:nvPicPr>
-                          <pic:cNvPr id="0" name="Picture 2"/>
-                          <pic:cNvPicPr>
-                            <a:picLocks noChangeAspect="1" noChangeArrowheads="1"/>
-                          </pic:cNvPicPr>
-                        </pic:nvPicPr>
-                        <pic:blipFill>
-                          <a:blip r:embed="rId9">
-                            <a:extLst>
-                              <a:ext uri="{28A0092B-C50C-407E-A947-70E740481C1C}">
-                                <a14:useLocalDpi xmlns:a14="http://schemas.microsoft.com/office/drawing/2010/main" val="0"/>
-                              </a:ext>
-                            </a:extLst>
-                          </a:blip>
-                          <a:srcRect/>
-                          <a:stretch>
-                            <a:fillRect/>
-                          </a:stretch>
-                        </pic:blipFill>
-                        <pic:spPr bwMode="auto">
-                          <a:xfrm>
-                            <a:off x="0" y="0"/>
-                            <a:ext cx="115570" cy="97790"/>
-                          </a:xfrm>
-                          <a:prstGeom prst="rect">
-                            <a:avLst/>
-                          </a:prstGeom>
-                          <a:noFill/>
-                        </pic:spPr>
-                      </pic:pic>
-                    </a:graphicData>
-                  </a:graphic>
-                </wp:inline>
-              </w:drawing>
-            </w:r>
-            <w:r>
-              <w:rPr>
-                <w:sz w:val="22"/>
-                <w:szCs w:val="22"/>
-              </w:rPr>
-              <w:t xml:space="preserve"> Online</w:t>
+              <w:t xml:space="preserve">{delivery_hybrid} Hybrid</w:t>
+            </w:r>
+            <w:r>
+              <w:rPr>
+                <w:sz w:val="22"/>
+                <w:szCs w:val="22"/>
+              </w:rPr>
+              <w:t xml:space="preserve">      </w:t>
+            </w:r>
+            <w:r>
+              <w:rPr>
+                <w:sz w:val="22"/>
+                <w:szCs w:val="22"/>
+              </w:rPr>
+              <w:t xml:space="preserve">{delivery_online} Online</w:t>
             </w:r>
           </w:p>
           <w:p>
@@ -4390,7 +4256,7 @@
                 <w:szCs w:val="22"/>
                 <w:u w:val="single"/>
               </w:rPr>
-              <w:lastRenderedPageBreak/>
+              <w:br w:type="page"/>
               <w:t>English Language Proficiency</w:t>
             </w:r>
           </w:p>

</xml_diff>

<commit_message>
Fix contract marker template placeholders
</commit_message>
<xml_diff>
--- a/src/templates/contracts/student-enrolment-template.docx
+++ b/src/templates/contracts/student-enrolment-template.docx
@@ -732,8 +732,9 @@
                 <w:sz w:val="22"/>
                 <w:szCs w:val="22"/>
               </w:rPr>
-              <w:t>437-225-8728</w:t>
-            </w:r>
+              <w:t>437-225-</w:t>
+            </w:r>
+            <w:proofErr w:type="gramStart"/>
             <w:r>
               <w:rPr>
                 <w:b/>
@@ -741,6 +742,15 @@
                 <w:sz w:val="22"/>
                 <w:szCs w:val="22"/>
               </w:rPr>
+              <w:t>8728</w:t>
+            </w:r>
+            <w:r>
+              <w:rPr>
+                <w:b/>
+                <w:bCs/>
+                <w:sz w:val="22"/>
+                <w:szCs w:val="22"/>
+              </w:rPr>
               <w:t xml:space="preserve">  </w:t>
             </w:r>
             <w:r>
@@ -750,6 +760,7 @@
               </w:rPr>
               <w:tab/>
             </w:r>
+            <w:proofErr w:type="gramEnd"/>
             <w:r>
               <w:rPr>
                 <w:sz w:val="22"/>
@@ -1243,282 +1254,62 @@
                 <w:szCs w:val="22"/>
               </w:rPr>
             </w:pPr>
-            <w:r>
-              <w:rPr>
-                <w:noProof/>
-                <w:sz w:val="22"/>
-                <w:szCs w:val="22"/>
-              </w:rPr>
-              <mc:AlternateContent>
-                <mc:Choice Requires="wps">
-                  <w:drawing>
-                    <wp:anchor distT="45720" distB="45720" distL="114300" distR="114300" simplePos="0" relativeHeight="251694080" behindDoc="0" locked="0" layoutInCell="1" allowOverlap="1" wp14:anchorId="467DE0D4" wp14:editId="425656E5">
-                      <wp:simplePos x="0" y="0"/>
-                      <wp:positionH relativeFrom="column">
-                        <wp:posOffset>1927390</wp:posOffset>
-                      </wp:positionH>
-                      <wp:positionV relativeFrom="paragraph">
-                        <wp:posOffset>106846</wp:posOffset>
-                      </wp:positionV>
-                      <wp:extent cx="218440" cy="231775"/>
-                      <wp:effectExtent l="0" t="0" r="10160" b="15875"/>
-                      <wp:wrapSquare wrapText="bothSides"/>
-                      <wp:docPr id="1771812289" name="Text Box 2"/>
-                      <wp:cNvGraphicFramePr>
-                        <a:graphicFrameLocks xmlns:a="http://schemas.openxmlformats.org/drawingml/2006/main"/>
-                      </wp:cNvGraphicFramePr>
-                      <a:graphic xmlns:a="http://schemas.openxmlformats.org/drawingml/2006/main">
-                        <a:graphicData uri="http://schemas.microsoft.com/office/word/2010/wordprocessingShape">
-                          <wps:wsp>
-                            <wps:cNvSpPr txBox="1">
-                              <a:spLocks noChangeArrowheads="1"/>
-                            </wps:cNvSpPr>
-                            <wps:spPr bwMode="auto">
-                              <a:xfrm>
-                                <a:off x="0" y="0"/>
-                                <a:ext cx="218440" cy="231775"/>
-                              </a:xfrm>
-                              <a:prstGeom prst="rect">
-                                <a:avLst/>
-                              </a:prstGeom>
-                              <a:solidFill>
-                                <a:srgbClr val="FFFFFF"/>
-                              </a:solidFill>
-                              <a:ln w="9525">
-                                <a:solidFill>
-                                  <a:srgbClr val="000000"/>
-                                </a:solidFill>
-                                <a:miter lim="800000"/>
-                                <a:headEnd/>
-                                <a:tailEnd/>
-                              </a:ln>
-                            </wps:spPr>
-                            <wps:txbx>
-                              <w:txbxContent>
-                                <w:p>
-                                  <w:pPr>
-                                    <w:rPr>
-                                      <w:b/>
-                                      <w:bCs/>
-                                      <w:sz w:val="20"/>
-                                      <w:szCs w:val="20"/>
-                                    </w:rPr>
-                                  </w:pPr>
-                                </w:p>
-                              </w:txbxContent>
-                            </wps:txbx>
-                            <wps:bodyPr rot="0" vert="horz" wrap="square" lIns="91440" tIns="45720" rIns="91440" bIns="45720" anchor="t" anchorCtr="0">
-                              <a:noAutofit/>
-                            </wps:bodyPr>
-                          </wps:wsp>
-                        </a:graphicData>
-                      </a:graphic>
-                      <wp14:sizeRelH relativeFrom="margin">
-                        <wp14:pctWidth>0</wp14:pctWidth>
-                      </wp14:sizeRelH>
-                      <wp14:sizeRelV relativeFrom="margin">
-                        <wp14:pctHeight>0</wp14:pctHeight>
-                      </wp14:sizeRelV>
-                    </wp:anchor>
-                  </w:drawing>
-                </mc:Choice>
-                <mc:Fallback>
-                  <w:pict>
-                    <v:shapetype w14:anchorId="467DE0D4" id="_x0000_t202" coordsize="21600,21600" o:spt="202" path="m,l,21600r21600,l21600,xe">
-                      <v:stroke joinstyle="miter"/>
-                      <v:path gradientshapeok="t" o:connecttype="rect"/>
-                    </v:shapetype>
-                    <v:shape id="Text Box 2" o:spid="_x0000_s1026" type="#_x0000_t202" style="position:absolute;margin-left:151.75pt;margin-top:8.4pt;width:17.2pt;height:18.25pt;z-index:251694080;visibility:visible;mso-wrap-style:square;mso-width-percent:0;mso-height-percent:0;mso-wrap-distance-left:9pt;mso-wrap-distance-top:3.6pt;mso-wrap-distance-right:9pt;mso-wrap-distance-bottom:3.6pt;mso-position-horizontal:absolute;mso-position-horizontal-relative:text;mso-position-vertical:absolute;mso-position-vertical-relative:text;mso-width-percent:0;mso-height-percent:0;mso-width-relative:margin;mso-height-relative:margin;v-text-anchor:top" o:gfxdata="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">
-                      <v:textbox>
-                        <w:txbxContent>
-                          <w:p>
-                            <w:pPr>
-                              <w:rPr>
-                                <w:b/>
-                                <w:bCs/>
-                                <w:sz w:val="20"/>
-                                <w:szCs w:val="20"/>
-                              </w:rPr>
-                            </w:pPr>
-                          </w:p>
-                        </w:txbxContent>
-                      </v:textbox>
-                      <w10:wrap type="square"/>
-                    </v:shape>
-                  </w:pict>
-                </mc:Fallback>
-              </mc:AlternateContent>
-            </w:r>
-            <w:r>
-              <w:rPr>
-                <w:noProof/>
-                <w:sz w:val="22"/>
-                <w:szCs w:val="22"/>
-              </w:rPr>
-              <mc:AlternateContent>
-                <mc:Choice Requires="wps">
-                  <w:drawing>
-                    <wp:anchor distT="45720" distB="45720" distL="114300" distR="114300" simplePos="0" relativeHeight="251665408" behindDoc="0" locked="0" layoutInCell="1" allowOverlap="1" wp14:anchorId="1737E518" wp14:editId="592AD27E">
-                      <wp:simplePos x="0" y="0"/>
-                      <wp:positionH relativeFrom="column">
-                        <wp:posOffset>3350205</wp:posOffset>
-                      </wp:positionH>
-                      <wp:positionV relativeFrom="paragraph">
-                        <wp:posOffset>122141</wp:posOffset>
-                      </wp:positionV>
-                      <wp:extent cx="218440" cy="231775"/>
-                      <wp:effectExtent l="0" t="0" r="10160" b="15875"/>
-                      <wp:wrapSquare wrapText="bothSides"/>
-                      <wp:docPr id="1126634135" name="Text Box 2"/>
-                      <wp:cNvGraphicFramePr>
-                        <a:graphicFrameLocks xmlns:a="http://schemas.openxmlformats.org/drawingml/2006/main"/>
-                      </wp:cNvGraphicFramePr>
-                      <a:graphic xmlns:a="http://schemas.openxmlformats.org/drawingml/2006/main">
-                        <a:graphicData uri="http://schemas.microsoft.com/office/word/2010/wordprocessingShape">
-                          <wps:wsp>
-                            <wps:cNvSpPr txBox="1">
-                              <a:spLocks noChangeArrowheads="1"/>
-                            </wps:cNvSpPr>
-                            <wps:spPr bwMode="auto">
-                              <a:xfrm>
-                                <a:off x="0" y="0"/>
-                                <a:ext cx="218440" cy="231775"/>
-                              </a:xfrm>
-                              <a:prstGeom prst="rect">
-                                <a:avLst/>
-                              </a:prstGeom>
-                              <a:solidFill>
-                                <a:srgbClr val="FFFFFF"/>
-                              </a:solidFill>
-                              <a:ln w="9525">
-                                <a:solidFill>
-                                  <a:srgbClr val="000000"/>
-                                </a:solidFill>
-                                <a:miter lim="800000"/>
-                                <a:headEnd/>
-                                <a:tailEnd/>
-                              </a:ln>
-                            </wps:spPr>
-                            <wps:txbx>
-                              <w:txbxContent>
-                                <w:p>
-                                  <w:pPr>
-                                    <w:rPr>
-                                      <w:b/>
-                                      <w:bCs/>
-                                      <w:sz w:val="20"/>
-                                      <w:szCs w:val="20"/>
-                                    </w:rPr>
-                                  </w:pPr>
-                                  <w:r>
-                                    <w:rPr>
-                                      <w:b/>
-                                      <w:bCs/>
-                                      <w:sz w:val="20"/>
-                                      <w:szCs w:val="20"/>
-                                    </w:rPr>
-                                    <w:t>X</w:t>
-                                  </w:r>
-                                </w:p>
-                              </w:txbxContent>
-                            </wps:txbx>
-                            <wps:bodyPr rot="0" vert="horz" wrap="square" lIns="91440" tIns="45720" rIns="91440" bIns="45720" anchor="t" anchorCtr="0">
-                              <a:noAutofit/>
-                            </wps:bodyPr>
-                          </wps:wsp>
-                        </a:graphicData>
-                      </a:graphic>
-                      <wp14:sizeRelH relativeFrom="margin">
-                        <wp14:pctWidth>0</wp14:pctWidth>
-                      </wp14:sizeRelH>
-                      <wp14:sizeRelV relativeFrom="margin">
-                        <wp14:pctHeight>0</wp14:pctHeight>
-                      </wp14:sizeRelV>
-                    </wp:anchor>
-                  </w:drawing>
-                </mc:Choice>
-                <mc:Fallback>
-                  <w:pict>
-                    <v:shape w14:anchorId="1737E518" id="_x0000_s1027" type="#_x0000_t202" style="position:absolute;margin-left:263.8pt;margin-top:9.6pt;width:17.2pt;height:18.25pt;z-index:251665408;visibility:visible;mso-wrap-style:square;mso-width-percent:0;mso-height-percent:0;mso-wrap-distance-left:9pt;mso-wrap-distance-top:3.6pt;mso-wrap-distance-right:9pt;mso-wrap-distance-bottom:3.6pt;mso-position-horizontal:absolute;mso-position-horizontal-relative:text;mso-position-vertical:absolute;mso-position-vertical-relative:text;mso-width-percent:0;mso-height-percent:0;mso-width-relative:margin;mso-height-relative:margin;v-text-anchor:top" o:gfxdata="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">
-                      <v:textbox>
-                        <w:txbxContent>
-                          <w:p>
-                            <w:pPr>
-                              <w:rPr>
-                                <w:b/>
-                                <w:bCs/>
-                                <w:sz w:val="20"/>
-                                <w:szCs w:val="20"/>
-                              </w:rPr>
-                            </w:pPr>
-                            <w:r>
-                              <w:rPr>
-                                <w:b/>
-                                <w:bCs/>
-                                <w:sz w:val="20"/>
-                                <w:szCs w:val="20"/>
-                              </w:rPr>
-                              <w:t>X</w:t>
-                            </w:r>
-                          </w:p>
-                        </w:txbxContent>
-                      </v:textbox>
-                      <w10:wrap type="square"/>
-                    </v:shape>
-                  </w:pict>
-                </mc:Fallback>
-              </mc:AlternateContent>
-            </w:r>
-          </w:p>
-          <w:p>
-            <w:pPr>
-              <w:pStyle w:val="Default"/>
-              <w:rPr>
-                <w:sz w:val="22"/>
-                <w:szCs w:val="22"/>
-              </w:rPr>
-            </w:pPr>
-            <w:r>
-              <w:rPr>
-                <w:sz w:val="22"/>
-                <w:szCs w:val="22"/>
-              </w:rPr>
-              <w:t xml:space="preserve">International Student:  </w:t>
-            </w:r>
-            <w:r>
-              <w:rPr>
-                <w:sz w:val="22"/>
-                <w:szCs w:val="22"/>
-              </w:rPr>
-              <w:t xml:space="preserve">{international_yes} Yes</w:t>
-            </w:r>
-            <w:r>
-              <w:rPr>
-                <w:sz w:val="22"/>
-                <w:szCs w:val="22"/>
-              </w:rPr>
-              <w:tab/>
-            </w:r>
-            <w:r>
-              <w:rPr>
-                <w:sz w:val="22"/>
-                <w:szCs w:val="22"/>
-              </w:rPr>
-              <w:tab/>
-            </w:r>
-            <w:r>
-              <w:rPr>
-                <w:sz w:val="22"/>
-                <w:szCs w:val="22"/>
-              </w:rPr>
-              <w:tab/>
-            </w:r>
-            <w:r>
-              <w:rPr>
-                <w:sz w:val="22"/>
-                <w:szCs w:val="22"/>
-              </w:rPr>
-              <w:t xml:space="preserve">{international_no} No</w:t>
+          </w:p>
+          <w:p>
+            <w:pPr>
+              <w:pStyle w:val="Default"/>
+              <w:rPr>
+                <w:sz w:val="22"/>
+                <w:szCs w:val="22"/>
+              </w:rPr>
+            </w:pPr>
+            <w:r>
+              <w:rPr>
+                <w:sz w:val="22"/>
+                <w:szCs w:val="22"/>
+              </w:rPr>
+              <w:t>International Student: {</w:t>
+            </w:r>
+            <w:proofErr w:type="spellStart"/>
+            <w:r>
+              <w:rPr>
+                <w:sz w:val="22"/>
+                <w:szCs w:val="22"/>
+              </w:rPr>
+              <w:t>international_yes</w:t>
+            </w:r>
+            <w:proofErr w:type="spellEnd"/>
+            <w:r>
+              <w:rPr>
+                <w:sz w:val="22"/>
+                <w:szCs w:val="22"/>
+              </w:rPr>
+              <w:t xml:space="preserve">} Yes     </w:t>
+            </w:r>
+            <w:proofErr w:type="gramStart"/>
+            <w:r>
+              <w:rPr>
+                <w:sz w:val="22"/>
+                <w:szCs w:val="22"/>
+              </w:rPr>
+              <w:t xml:space="preserve">   {</w:t>
+            </w:r>
+            <w:proofErr w:type="spellStart"/>
+            <w:proofErr w:type="gramEnd"/>
+            <w:r>
+              <w:rPr>
+                <w:sz w:val="22"/>
+                <w:szCs w:val="22"/>
+              </w:rPr>
+              <w:t>international_no</w:t>
+            </w:r>
+            <w:proofErr w:type="spellEnd"/>
+            <w:r>
+              <w:rPr>
+                <w:sz w:val="22"/>
+                <w:szCs w:val="22"/>
+              </w:rPr>
+              <w:t>} No</w:t>
             </w:r>
           </w:p>
           <w:p>
@@ -2308,7 +2099,27 @@
                 <w:sz w:val="28"/>
                 <w:szCs w:val="28"/>
               </w:rPr>
-              <w:t xml:space="preserve">25 Watline Avenue, Unit 204 </w:t>
+              <w:t xml:space="preserve">25 </w:t>
+            </w:r>
+            <w:proofErr w:type="spellStart"/>
+            <w:r>
+              <w:rPr>
+                <w:b/>
+                <w:bCs/>
+                <w:sz w:val="28"/>
+                <w:szCs w:val="28"/>
+              </w:rPr>
+              <w:t>Watline</w:t>
+            </w:r>
+            <w:proofErr w:type="spellEnd"/>
+            <w:r>
+              <w:rPr>
+                <w:b/>
+                <w:bCs/>
+                <w:sz w:val="28"/>
+                <w:szCs w:val="28"/>
+              </w:rPr>
+              <w:t xml:space="preserve"> Avenue, Unit 204 </w:t>
             </w:r>
           </w:p>
           <w:p>
@@ -3886,174 +3697,76 @@
             </w:pPr>
             <w:r>
               <w:rPr>
-                <w:noProof/>
-                <w:sz w:val="22"/>
-                <w:szCs w:val="22"/>
-              </w:rPr>
-              <mc:AlternateContent>
-                <mc:Choice Requires="wps">
-                  <w:drawing>
-                    <wp:anchor distT="45720" distB="45720" distL="114300" distR="114300" simplePos="0" relativeHeight="251669504" behindDoc="0" locked="0" layoutInCell="1" allowOverlap="1" wp14:anchorId="3C7F2D48" wp14:editId="3DDD7C8B">
-                      <wp:simplePos x="0" y="0"/>
-                      <wp:positionH relativeFrom="column">
-                        <wp:posOffset>2817826</wp:posOffset>
-                      </wp:positionH>
-                      <wp:positionV relativeFrom="paragraph">
-                        <wp:posOffset>122389</wp:posOffset>
-                      </wp:positionV>
-                      <wp:extent cx="218440" cy="231775"/>
-                      <wp:effectExtent l="0" t="0" r="10160" b="15875"/>
-                      <wp:wrapSquare wrapText="bothSides"/>
-                      <wp:docPr id="751020824" name="Text Box 2"/>
-                      <wp:cNvGraphicFramePr>
-                        <a:graphicFrameLocks xmlns:a="http://schemas.openxmlformats.org/drawingml/2006/main"/>
-                      </wp:cNvGraphicFramePr>
-                      <a:graphic xmlns:a="http://schemas.openxmlformats.org/drawingml/2006/main">
-                        <a:graphicData uri="http://schemas.microsoft.com/office/word/2010/wordprocessingShape">
-                          <wps:wsp>
-                            <wps:cNvSpPr txBox="1">
-                              <a:spLocks noChangeArrowheads="1"/>
-                            </wps:cNvSpPr>
-                            <wps:spPr bwMode="auto">
-                              <a:xfrm>
-                                <a:off x="0" y="0"/>
-                                <a:ext cx="218440" cy="231775"/>
-                              </a:xfrm>
-                              <a:prstGeom prst="rect">
-                                <a:avLst/>
-                              </a:prstGeom>
-                              <a:solidFill>
-                                <a:srgbClr val="FFFFFF"/>
-                              </a:solidFill>
-                              <a:ln w="9525">
-                                <a:solidFill>
-                                  <a:srgbClr val="000000"/>
-                                </a:solidFill>
-                                <a:miter lim="800000"/>
-                                <a:headEnd/>
-                                <a:tailEnd/>
-                              </a:ln>
-                            </wps:spPr>
-                            <wps:txbx>
-                              <w:txbxContent>
-                                <w:p>
-                                  <w:pPr>
-                                    <w:rPr>
-                                      <w:b/>
-                                      <w:bCs/>
-                                      <w:sz w:val="20"/>
-                                      <w:szCs w:val="20"/>
-                                    </w:rPr>
-                                  </w:pPr>
-                                  <w:r>
-                                    <w:rPr>
-                                      <w:b/>
-                                      <w:bCs/>
-                                      <w:sz w:val="20"/>
-                                      <w:szCs w:val="20"/>
-                                    </w:rPr>
-                                    <w:t>X</w:t>
-                                  </w:r>
-                                </w:p>
-                              </w:txbxContent>
-                            </wps:txbx>
-                            <wps:bodyPr rot="0" vert="horz" wrap="square" lIns="91440" tIns="45720" rIns="91440" bIns="45720" anchor="t" anchorCtr="0">
-                              <a:noAutofit/>
-                            </wps:bodyPr>
-                          </wps:wsp>
-                        </a:graphicData>
-                      </a:graphic>
-                      <wp14:sizeRelH relativeFrom="margin">
-                        <wp14:pctWidth>0</wp14:pctWidth>
-                      </wp14:sizeRelH>
-                      <wp14:sizeRelV relativeFrom="margin">
-                        <wp14:pctHeight>0</wp14:pctHeight>
-                      </wp14:sizeRelV>
-                    </wp:anchor>
-                  </w:drawing>
-                </mc:Choice>
-                <mc:Fallback>
-                  <w:pict>
-                    <v:shape w14:anchorId="3C7F2D48" id="_x0000_s1030" type="#_x0000_t202" style="position:absolute;margin-left:221.9pt;margin-top:9.65pt;width:17.2pt;height:18.25pt;z-index:251669504;visibility:visible;mso-wrap-style:square;mso-width-percent:0;mso-height-percent:0;mso-wrap-distance-left:9pt;mso-wrap-distance-top:3.6pt;mso-wrap-distance-right:9pt;mso-wrap-distance-bottom:3.6pt;mso-position-horizontal:absolute;mso-position-horizontal-relative:text;mso-position-vertical:absolute;mso-position-vertical-relative:text;mso-width-percent:0;mso-height-percent:0;mso-width-relative:margin;mso-height-relative:margin;v-text-anchor:top" o:gfxdata="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">
-                      <v:textbox>
-                        <w:txbxContent>
-                          <w:p>
-                            <w:pPr>
-                              <w:rPr>
-                                <w:b/>
-                                <w:bCs/>
-                                <w:sz w:val="20"/>
-                                <w:szCs w:val="20"/>
-                              </w:rPr>
-                            </w:pPr>
-                            <w:r>
-                              <w:rPr>
-                                <w:b/>
-                                <w:bCs/>
-                                <w:sz w:val="20"/>
-                                <w:szCs w:val="20"/>
-                              </w:rPr>
-                              <w:t>X</w:t>
-                            </w:r>
-                          </w:p>
-                        </w:txbxContent>
-                      </v:textbox>
-                      <w10:wrap type="square"/>
-                    </v:shape>
-                  </w:pict>
-                </mc:Fallback>
-              </mc:AlternateContent>
-            </w:r>
-          </w:p>
-          <w:p>
-            <w:pPr>
-              <w:pStyle w:val="Default"/>
-              <w:rPr>
-                <w:sz w:val="22"/>
-                <w:szCs w:val="22"/>
-              </w:rPr>
-            </w:pPr>
-            <w:r>
-              <w:rPr>
-                <w:sz w:val="22"/>
-                <w:szCs w:val="22"/>
-              </w:rPr>
-              <w:t xml:space="preserve">Method of program delivery  </w:t>
-            </w:r>
-            <w:r>
-              <w:rPr>
-                <w:sz w:val="22"/>
-                <w:szCs w:val="22"/>
-              </w:rPr>
-              <w:t xml:space="preserve">{delivery_in_person} in-person</w:t>
-            </w:r>
-            <w:r>
-              <w:rPr>
-                <w:sz w:val="22"/>
-                <w:szCs w:val="22"/>
-              </w:rPr>
-              <w:t xml:space="preserve">    </w:t>
-            </w:r>
-            <w:r>
-              <w:rPr>
-                <w:sz w:val="22"/>
-                <w:szCs w:val="22"/>
-              </w:rPr>
-              <w:t xml:space="preserve">{delivery_hybrid} Hybrid</w:t>
-            </w:r>
-            <w:r>
-              <w:rPr>
-                <w:sz w:val="22"/>
-                <w:szCs w:val="22"/>
-              </w:rPr>
-              <w:t xml:space="preserve">      </w:t>
-            </w:r>
-            <w:r>
-              <w:rPr>
-                <w:sz w:val="22"/>
-                <w:szCs w:val="22"/>
-              </w:rPr>
-              <w:t xml:space="preserve">{delivery_online} Online</w:t>
+                <w:sz w:val="22"/>
+                <w:szCs w:val="22"/>
+              </w:rPr>
+              <w:t>Method of program delivery</w:t>
+            </w:r>
+            <w:proofErr w:type="gramStart"/>
+            <w:r>
+              <w:rPr>
+                <w:sz w:val="22"/>
+                <w:szCs w:val="22"/>
+              </w:rPr>
+              <w:t xml:space="preserve">   {</w:t>
+            </w:r>
+            <w:proofErr w:type="spellStart"/>
+            <w:proofErr w:type="gramEnd"/>
+            <w:r>
+              <w:rPr>
+                <w:sz w:val="22"/>
+                <w:szCs w:val="22"/>
+              </w:rPr>
+              <w:t>delivery_in_person</w:t>
+            </w:r>
+            <w:proofErr w:type="spellEnd"/>
+            <w:r>
+              <w:rPr>
+                <w:sz w:val="22"/>
+                <w:szCs w:val="22"/>
+              </w:rPr>
+              <w:t>} in-</w:t>
+            </w:r>
+            <w:proofErr w:type="gramStart"/>
+            <w:r>
+              <w:rPr>
+                <w:sz w:val="22"/>
+                <w:szCs w:val="22"/>
+              </w:rPr>
+              <w:t>person  {</w:t>
+            </w:r>
+            <w:proofErr w:type="spellStart"/>
+            <w:proofErr w:type="gramEnd"/>
+            <w:r>
+              <w:rPr>
+                <w:sz w:val="22"/>
+                <w:szCs w:val="22"/>
+              </w:rPr>
+              <w:t>delivery_hybrid</w:t>
+            </w:r>
+            <w:proofErr w:type="spellEnd"/>
+            <w:r>
+              <w:rPr>
+                <w:sz w:val="22"/>
+                <w:szCs w:val="22"/>
+              </w:rPr>
+              <w:t>} Hybrid {</w:t>
+            </w:r>
+            <w:proofErr w:type="spellStart"/>
+            <w:r>
+              <w:rPr>
+                <w:sz w:val="22"/>
+                <w:szCs w:val="22"/>
+              </w:rPr>
+              <w:t>delivery_online</w:t>
+            </w:r>
+            <w:proofErr w:type="spellEnd"/>
+            <w:r>
+              <w:rPr>
+                <w:sz w:val="22"/>
+                <w:szCs w:val="22"/>
+              </w:rPr>
+              <w:t>} Online</w:t>
             </w:r>
           </w:p>
           <w:p>
@@ -4167,7 +3880,7 @@
               </w:rPr>
               <w:t xml:space="preserve">International Student and/or Applicant with foreign credentials. All foreign credentials must be translated into English and compared for Grade 12 equivalency by a recognized organization such as World Education Services: </w:t>
             </w:r>
-            <w:hyperlink r:id="rId10" w:history="1">
+            <w:hyperlink r:id="rId8" w:history="1">
               <w:r>
                 <w:rPr>
                   <w:rStyle w:val="Hyperlink"/>
@@ -4240,15 +3953,18 @@
           <w:p>
             <w:pPr>
               <w:pStyle w:val="Default"/>
+              <w:ind w:left="720"/>
               <w:rPr>
                 <w:b/>
                 <w:bCs/>
                 <w:sz w:val="22"/>
                 <w:szCs w:val="22"/>
-                <w:u w:val="single"/>
-              </w:rPr>
-            </w:pPr>
-            <w:r>
+              </w:rPr>
+            </w:pPr>
+          </w:p>
+          <w:p>
+            <w:pPr>
+              <w:pStyle w:val="Default"/>
               <w:rPr>
                 <w:b/>
                 <w:bCs/>
@@ -4256,7 +3972,27 @@
                 <w:szCs w:val="22"/>
                 <w:u w:val="single"/>
               </w:rPr>
-              <w:br w:type="page"/>
+            </w:pPr>
+          </w:p>
+          <w:p>
+            <w:pPr>
+              <w:pStyle w:val="Default"/>
+              <w:rPr>
+                <w:b/>
+                <w:bCs/>
+                <w:sz w:val="22"/>
+                <w:szCs w:val="22"/>
+                <w:u w:val="single"/>
+              </w:rPr>
+            </w:pPr>
+            <w:r>
+              <w:rPr>
+                <w:b/>
+                <w:bCs/>
+                <w:sz w:val="22"/>
+                <w:szCs w:val="22"/>
+                <w:u w:val="single"/>
+              </w:rPr>
               <w:t>English Language Proficiency</w:t>
             </w:r>
           </w:p>
@@ -4586,6 +4322,7 @@
               </w:rPr>
               <w:t xml:space="preserve">            </w:t>
             </w:r>
+            <w:proofErr w:type="gramStart"/>
             <w:r>
               <w:rPr>
                 <w:sz w:val="22"/>
@@ -4612,7 +4349,15 @@
                 <w:sz w:val="22"/>
                 <w:szCs w:val="22"/>
               </w:rPr>
-              <w:t>___</w:t>
+              <w:t>_</w:t>
+            </w:r>
+            <w:proofErr w:type="gramEnd"/>
+            <w:r>
+              <w:rPr>
+                <w:sz w:val="22"/>
+                <w:szCs w:val="22"/>
+              </w:rPr>
+              <w:t>__</w:t>
             </w:r>
             <w:r>
               <w:rPr>
@@ -5448,7 +5193,6 @@
                 <w:szCs w:val="28"/>
                 <w:u w:val="single"/>
               </w:rPr>
-              <w:lastRenderedPageBreak/>
               <w:t>Payment Schedule</w:t>
             </w:r>
           </w:p>
@@ -8309,6 +8053,7 @@
               </w:rPr>
               <w:t xml:space="preserve">(Signature of </w:t>
             </w:r>
+            <w:proofErr w:type="gramStart"/>
             <w:r>
               <w:rPr>
                 <w:sz w:val="22"/>
@@ -8328,7 +8073,15 @@
                 <w:sz w:val="22"/>
                 <w:szCs w:val="22"/>
               </w:rPr>
-              <w:t xml:space="preserve">                                                                 Date</w:t>
+              <w:t xml:space="preserve"> </w:t>
+            </w:r>
+            <w:proofErr w:type="gramEnd"/>
+            <w:r>
+              <w:rPr>
+                <w:sz w:val="22"/>
+                <w:szCs w:val="22"/>
+              </w:rPr>
+              <w:t xml:space="preserve">                                                                Date</w:t>
             </w:r>
             <w:r>
               <w:rPr>
@@ -8828,6 +8581,7 @@
               </w:rPr>
               <w:t xml:space="preserve">(Signature of </w:t>
             </w:r>
+            <w:proofErr w:type="gramStart"/>
             <w:r>
               <w:rPr>
                 <w:sz w:val="22"/>
@@ -8847,7 +8601,15 @@
                 <w:sz w:val="22"/>
                 <w:szCs w:val="22"/>
               </w:rPr>
-              <w:t xml:space="preserve">                                </w:t>
+              <w:t xml:space="preserve"> </w:t>
+            </w:r>
+            <w:proofErr w:type="gramEnd"/>
+            <w:r>
+              <w:rPr>
+                <w:sz w:val="22"/>
+                <w:szCs w:val="22"/>
+              </w:rPr>
+              <w:t xml:space="preserve">                               </w:t>
             </w:r>
             <w:r>
               <w:rPr>
@@ -8875,7 +8637,23 @@
                 <w:sz w:val="22"/>
                 <w:szCs w:val="22"/>
               </w:rPr>
-              <w:t xml:space="preserve">           (Date)</w:t>
+              <w:t xml:space="preserve">        </w:t>
+            </w:r>
+            <w:proofErr w:type="gramStart"/>
+            <w:r>
+              <w:rPr>
+                <w:sz w:val="22"/>
+                <w:szCs w:val="22"/>
+              </w:rPr>
+              <w:t xml:space="preserve">   (</w:t>
+            </w:r>
+            <w:proofErr w:type="gramEnd"/>
+            <w:r>
+              <w:rPr>
+                <w:sz w:val="22"/>
+                <w:szCs w:val="22"/>
+              </w:rPr>
+              <w:t>Date)</w:t>
             </w:r>
           </w:p>
           <w:p>
@@ -9132,6 +8910,7 @@
               </w:rPr>
               <w:t xml:space="preserve">      (Signature of Admission Officer, Registrar, </w:t>
             </w:r>
+            <w:proofErr w:type="gramStart"/>
             <w:r>
               <w:rPr>
                 <w:sz w:val="22"/>
@@ -9151,7 +8930,15 @@
                 <w:sz w:val="22"/>
                 <w:szCs w:val="22"/>
               </w:rPr>
-              <w:t xml:space="preserve">                                  Date</w:t>
+              <w:t xml:space="preserve"> </w:t>
+            </w:r>
+            <w:proofErr w:type="gramEnd"/>
+            <w:r>
+              <w:rPr>
+                <w:sz w:val="22"/>
+                <w:szCs w:val="22"/>
+              </w:rPr>
+              <w:t xml:space="preserve">                                 Date</w:t>
             </w:r>
           </w:p>
           <w:p>
@@ -9732,7 +9519,23 @@
                 <w:sz w:val="22"/>
                 <w:szCs w:val="22"/>
               </w:rPr>
-              <w:t>I understand that I can refuse to sign this consent form and that I can withdraw my consent at any time for future uses of my personal information by writing to the Chief Operating Officer at 25 Watline Avenue, Unit 204 Mississauga, Ontario, L4Z 2Z1. I understand that if I refuse or withdraw my consent the Superintendent may not be able to contact me to inform me of my rights under the Act or collect information to help potential students make informed decisions about their educational choices.</w:t>
+              <w:t xml:space="preserve">I understand that I can refuse to sign this consent form and that I can withdraw my consent at any time for future uses of my personal information by writing to the Chief Operating Officer at 25 </w:t>
+            </w:r>
+            <w:proofErr w:type="spellStart"/>
+            <w:r>
+              <w:rPr>
+                <w:sz w:val="22"/>
+                <w:szCs w:val="22"/>
+              </w:rPr>
+              <w:t>Watline</w:t>
+            </w:r>
+            <w:proofErr w:type="spellEnd"/>
+            <w:r>
+              <w:rPr>
+                <w:sz w:val="22"/>
+                <w:szCs w:val="22"/>
+              </w:rPr>
+              <w:t xml:space="preserve"> Avenue, Unit 204 Mississauga, Ontario, L4Z 2Z1. I understand that if I refuse or withdraw my consent the Superintendent may not be able to contact me to inform me of my rights under the Act or collect information to help potential students make informed decisions about their educational choices.</w:t>
             </w:r>
           </w:p>
           <w:p>
@@ -9978,6 +9781,7 @@
               </w:rPr>
               <w:t xml:space="preserve">(Signature of </w:t>
             </w:r>
+            <w:proofErr w:type="gramStart"/>
             <w:r>
               <w:rPr>
                 <w:sz w:val="22"/>
@@ -9990,7 +9794,15 @@
                 <w:sz w:val="22"/>
                 <w:szCs w:val="22"/>
               </w:rPr>
-              <w:t xml:space="preserve">                                                  </w:t>
+              <w:t xml:space="preserve"> </w:t>
+            </w:r>
+            <w:proofErr w:type="gramEnd"/>
+            <w:r>
+              <w:rPr>
+                <w:sz w:val="22"/>
+                <w:szCs w:val="22"/>
+              </w:rPr>
+              <w:t xml:space="preserve">                                                 </w:t>
             </w:r>
             <w:r>
               <w:rPr>
@@ -10004,7 +9816,23 @@
                 <w:sz w:val="22"/>
                 <w:szCs w:val="22"/>
               </w:rPr>
-              <w:t xml:space="preserve">     (Date)</w:t>
+              <w:t xml:space="preserve">  </w:t>
+            </w:r>
+            <w:proofErr w:type="gramStart"/>
+            <w:r>
+              <w:rPr>
+                <w:sz w:val="22"/>
+                <w:szCs w:val="22"/>
+              </w:rPr>
+              <w:t xml:space="preserve">   (</w:t>
+            </w:r>
+            <w:proofErr w:type="gramEnd"/>
+            <w:r>
+              <w:rPr>
+                <w:sz w:val="22"/>
+                <w:szCs w:val="22"/>
+              </w:rPr>
+              <w:t>Date)</w:t>
             </w:r>
           </w:p>
           <w:p>
@@ -10258,7 +10086,23 @@
                 <w:sz w:val="22"/>
                 <w:szCs w:val="22"/>
               </w:rPr>
-              <w:t xml:space="preserve"> mid-point” means the point in the progress of a vocational program where half of the scheduled hours of instruction for the program have taken place; (“mi-parcours du programme”) </w:t>
+              <w:t xml:space="preserve"> mid-point” means the point in the progress of a vocational program where half of the scheduled hours of instruction for the program have taken place; (“mi-</w:t>
+            </w:r>
+            <w:proofErr w:type="spellStart"/>
+            <w:r>
+              <w:rPr>
+                <w:sz w:val="22"/>
+                <w:szCs w:val="22"/>
+              </w:rPr>
+              <w:t>parcours</w:t>
+            </w:r>
+            <w:proofErr w:type="spellEnd"/>
+            <w:r>
+              <w:rPr>
+                <w:sz w:val="22"/>
+                <w:szCs w:val="22"/>
+              </w:rPr>
+              <w:t xml:space="preserve"> du programme”) </w:t>
             </w:r>
           </w:p>
           <w:p>
@@ -10338,7 +10182,23 @@
                 <w:sz w:val="22"/>
                 <w:szCs w:val="22"/>
               </w:rPr>
-              <w:t xml:space="preserve">25. If a student has entered into a contract with a career college for a vocational program, the college shall give a refund of all fees paid for the program in the following circumstances: </w:t>
+              <w:t xml:space="preserve">25. If a student has </w:t>
+            </w:r>
+            <w:proofErr w:type="gramStart"/>
+            <w:r>
+              <w:rPr>
+                <w:sz w:val="22"/>
+                <w:szCs w:val="22"/>
+              </w:rPr>
+              <w:t>entered into</w:t>
+            </w:r>
+            <w:proofErr w:type="gramEnd"/>
+            <w:r>
+              <w:rPr>
+                <w:sz w:val="22"/>
+                <w:szCs w:val="22"/>
+              </w:rPr>
+              <w:t xml:space="preserve"> a contract with a career college for a vocational program, the college shall give a refund of all fees paid for the program in the following circumstances: </w:t>
             </w:r>
           </w:p>
           <w:p>
@@ -10463,7 +10323,23 @@
                 <w:sz w:val="22"/>
                 <w:szCs w:val="22"/>
               </w:rPr>
-              <w:t xml:space="preserve">5.The college collects any fees other than a service fee before the student has entered into a contract with the college. </w:t>
+              <w:t xml:space="preserve">5.The college collects any fees other than a service fee before the student has </w:t>
+            </w:r>
+            <w:proofErr w:type="gramStart"/>
+            <w:r>
+              <w:rPr>
+                <w:sz w:val="22"/>
+                <w:szCs w:val="22"/>
+              </w:rPr>
+              <w:t>entered into</w:t>
+            </w:r>
+            <w:proofErr w:type="gramEnd"/>
+            <w:r>
+              <w:rPr>
+                <w:sz w:val="22"/>
+                <w:szCs w:val="22"/>
+              </w:rPr>
+              <w:t xml:space="preserve"> a contract with the college. </w:t>
             </w:r>
           </w:p>
           <w:p>
@@ -10656,7 +10532,6 @@
                 <w:szCs w:val="28"/>
                 <w:u w:val="single"/>
               </w:rPr>
-              <w:lastRenderedPageBreak/>
               <w:t>Full refunds minus service fee</w:t>
             </w:r>
           </w:p>
@@ -15152,7 +15027,31 @@
           <w:lang w:val="en-US"/>
           <w14:ligatures w14:val="none"/>
         </w:rPr>
-        <w:t>submit up-to-date immunization status within 45 days of commencement of study and that I must, while enrolled in the program, maintain this status in order to complete the practicum placement and graduate.</w:t>
+        <w:t xml:space="preserve">submit up-to-date immunization status within 45 days of commencement of study and that I must, while enrolled in the program, maintain this status </w:t>
+      </w:r>
+      <w:proofErr w:type="gramStart"/>
+      <w:r>
+        <w:rPr>
+          <w:rFonts w:ascii="Calibri" w:eastAsia="Calibri" w:hAnsi="Calibri" w:cs="Calibri"/>
+          <w:kern w:val="0"/>
+          <w:sz w:val="23"/>
+          <w:szCs w:val="23"/>
+          <w:lang w:val="en-US"/>
+          <w14:ligatures w14:val="none"/>
+        </w:rPr>
+        <w:t>in order to</w:t>
+      </w:r>
+      <w:proofErr w:type="gramEnd"/>
+      <w:r>
+        <w:rPr>
+          <w:rFonts w:ascii="Calibri" w:eastAsia="Calibri" w:hAnsi="Calibri" w:cs="Calibri"/>
+          <w:kern w:val="0"/>
+          <w:sz w:val="23"/>
+          <w:szCs w:val="23"/>
+          <w:lang w:val="en-US"/>
+          <w14:ligatures w14:val="none"/>
+        </w:rPr>
+        <w:t xml:space="preserve"> complete the practicum placement and graduate.</w:t>
       </w:r>
     </w:p>
     <w:p>
@@ -21801,7 +21700,25 @@
           <w:sz w:val="22"/>
           <w:szCs w:val="22"/>
         </w:rPr>
-        <w:t>We ask that you read the following carefully and sign below to acknowledge your understanding and agreement.</w:t>
+        <w:t xml:space="preserve">We ask that you read the following carefully and sign below to acknowledge </w:t>
+      </w:r>
+      <w:proofErr w:type="gramStart"/>
+      <w:r>
+        <w:rPr>
+          <w:rFonts w:asciiTheme="minorHAnsi" w:hAnsiTheme="minorHAnsi"/>
+          <w:sz w:val="22"/>
+          <w:szCs w:val="22"/>
+        </w:rPr>
+        <w:t>your</w:t>
+      </w:r>
+      <w:proofErr w:type="gramEnd"/>
+      <w:r>
+        <w:rPr>
+          <w:rFonts w:asciiTheme="minorHAnsi" w:hAnsiTheme="minorHAnsi"/>
+          <w:sz w:val="22"/>
+          <w:szCs w:val="22"/>
+        </w:rPr>
+        <w:t xml:space="preserve"> understanding and agreement.</w:t>
       </w:r>
     </w:p>
     <w:p>
@@ -21983,7 +21900,25 @@
           <w:sz w:val="22"/>
           <w:szCs w:val="22"/>
         </w:rPr>
-        <w:t xml:space="preserve"> manner at all times.</w:t>
+        <w:t xml:space="preserve"> manner </w:t>
+      </w:r>
+      <w:proofErr w:type="gramStart"/>
+      <w:r>
+        <w:rPr>
+          <w:rFonts w:asciiTheme="minorHAnsi" w:hAnsiTheme="minorHAnsi"/>
+          <w:sz w:val="22"/>
+          <w:szCs w:val="22"/>
+        </w:rPr>
+        <w:t>at all times</w:t>
+      </w:r>
+      <w:proofErr w:type="gramEnd"/>
+      <w:r>
+        <w:rPr>
+          <w:rFonts w:asciiTheme="minorHAnsi" w:hAnsiTheme="minorHAnsi"/>
+          <w:sz w:val="22"/>
+          <w:szCs w:val="22"/>
+        </w:rPr>
+        <w:t>.</w:t>
       </w:r>
     </w:p>
     <w:p>
@@ -22790,7 +22725,25 @@
           <w:sz w:val="22"/>
           <w:szCs w:val="22"/>
         </w:rPr>
-        <w:t>, with proper sign-offs.</w:t>
+        <w:t xml:space="preserve">, with proper </w:t>
+      </w:r>
+      <w:proofErr w:type="gramStart"/>
+      <w:r>
+        <w:rPr>
+          <w:rFonts w:asciiTheme="minorHAnsi" w:hAnsiTheme="minorHAnsi"/>
+          <w:sz w:val="22"/>
+          <w:szCs w:val="22"/>
+        </w:rPr>
+        <w:t>sign-offs</w:t>
+      </w:r>
+      <w:proofErr w:type="gramEnd"/>
+      <w:r>
+        <w:rPr>
+          <w:rFonts w:asciiTheme="minorHAnsi" w:hAnsiTheme="minorHAnsi"/>
+          <w:sz w:val="22"/>
+          <w:szCs w:val="22"/>
+        </w:rPr>
+        <w:t>.</w:t>
       </w:r>
     </w:p>
     <w:p>
@@ -23828,7 +23781,23 @@
           <w:szCs w:val="22"/>
         </w:rPr>
         <w:br/>
-        <w:t>I understand that it is my responsibility to ensure compliance with Immigration, Refugees and Citizenship Canada (IRCC) regulations at all times, and to seek legal or immigration counsel if needed.</w:t>
+        <w:t xml:space="preserve">I understand that it is my responsibility to ensure compliance with Immigration, Refugees and Citizenship Canada (IRCC) regulations </w:t>
+      </w:r>
+      <w:proofErr w:type="gramStart"/>
+      <w:r>
+        <w:rPr>
+          <w:sz w:val="22"/>
+          <w:szCs w:val="22"/>
+        </w:rPr>
+        <w:t>at all times</w:t>
+      </w:r>
+      <w:proofErr w:type="gramEnd"/>
+      <w:r>
+        <w:rPr>
+          <w:sz w:val="22"/>
+          <w:szCs w:val="22"/>
+        </w:rPr>
+        <w:t>, and to seek legal or immigration counsel if needed.</w:t>
       </w:r>
     </w:p>
     <w:p>
@@ -24337,8 +24306,8 @@
       </w:pPr>
     </w:p>
     <w:sectPr>
-      <w:headerReference w:type="default" r:id="rId11"/>
-      <w:footerReference w:type="default" r:id="rId12"/>
+      <w:headerReference w:type="default" r:id="rId9"/>
+      <w:footerReference w:type="default" r:id="rId10"/>
       <w:pgSz w:w="12240" w:h="15840"/>
       <w:pgMar w:top="720" w:right="720" w:bottom="432" w:left="720" w:header="720" w:footer="144" w:gutter="0"/>
       <w:cols w:space="720"/>
@@ -24549,7 +24518,33 @@
         <w:sz w:val="16"/>
         <w:szCs w:val="16"/>
       </w:rPr>
-      <w:t>25 Watline Ave, Unit 204, Mississauga</w:t>
+      <w:t xml:space="preserve">25 </w:t>
+    </w:r>
+    <w:proofErr w:type="spellStart"/>
+    <w:r>
+      <w:rPr>
+        <w:rFonts w:ascii="Arial" w:hAnsi="Arial" w:cs="Arial"/>
+        <w:b/>
+        <w:bCs/>
+        <w:i/>
+        <w:iCs/>
+        <w:sz w:val="16"/>
+        <w:szCs w:val="16"/>
+      </w:rPr>
+      <w:t>Watline</w:t>
+    </w:r>
+    <w:proofErr w:type="spellEnd"/>
+    <w:r>
+      <w:rPr>
+        <w:rFonts w:ascii="Arial" w:hAnsi="Arial" w:cs="Arial"/>
+        <w:b/>
+        <w:bCs/>
+        <w:i/>
+        <w:iCs/>
+        <w:sz w:val="16"/>
+        <w:szCs w:val="16"/>
+      </w:rPr>
+      <w:t xml:space="preserve"> Ave, Unit 204, Mississauga</w:t>
     </w:r>
     <w:r>
       <w:rPr>
@@ -27475,7 +27470,6 @@
   <w:style w:type="character" w:default="1" w:styleId="DefaultParagraphFont">
     <w:name w:val="Default Paragraph Font"/>
     <w:uiPriority w:val="1"/>
-    <w:semiHidden/>
     <w:unhideWhenUsed/>
   </w:style>
   <w:style w:type="table" w:default="1" w:styleId="TableNormal">

</xml_diff>

<commit_message>
Fix contract marker template placeholders (#35)
</commit_message>
<xml_diff>
--- a/src/templates/contracts/student-enrolment-template.docx
+++ b/src/templates/contracts/student-enrolment-template.docx
@@ -732,8 +732,9 @@
                 <w:sz w:val="22"/>
                 <w:szCs w:val="22"/>
               </w:rPr>
-              <w:t>437-225-8728</w:t>
-            </w:r>
+              <w:t>437-225-</w:t>
+            </w:r>
+            <w:proofErr w:type="gramStart"/>
             <w:r>
               <w:rPr>
                 <w:b/>
@@ -741,6 +742,15 @@
                 <w:sz w:val="22"/>
                 <w:szCs w:val="22"/>
               </w:rPr>
+              <w:t>8728</w:t>
+            </w:r>
+            <w:r>
+              <w:rPr>
+                <w:b/>
+                <w:bCs/>
+                <w:sz w:val="22"/>
+                <w:szCs w:val="22"/>
+              </w:rPr>
               <w:t xml:space="preserve">  </w:t>
             </w:r>
             <w:r>
@@ -750,6 +760,7 @@
               </w:rPr>
               <w:tab/>
             </w:r>
+            <w:proofErr w:type="gramEnd"/>
             <w:r>
               <w:rPr>
                 <w:sz w:val="22"/>
@@ -1243,282 +1254,62 @@
                 <w:szCs w:val="22"/>
               </w:rPr>
             </w:pPr>
-            <w:r>
-              <w:rPr>
-                <w:noProof/>
-                <w:sz w:val="22"/>
-                <w:szCs w:val="22"/>
-              </w:rPr>
-              <mc:AlternateContent>
-                <mc:Choice Requires="wps">
-                  <w:drawing>
-                    <wp:anchor distT="45720" distB="45720" distL="114300" distR="114300" simplePos="0" relativeHeight="251694080" behindDoc="0" locked="0" layoutInCell="1" allowOverlap="1" wp14:anchorId="467DE0D4" wp14:editId="425656E5">
-                      <wp:simplePos x="0" y="0"/>
-                      <wp:positionH relativeFrom="column">
-                        <wp:posOffset>1927390</wp:posOffset>
-                      </wp:positionH>
-                      <wp:positionV relativeFrom="paragraph">
-                        <wp:posOffset>106846</wp:posOffset>
-                      </wp:positionV>
-                      <wp:extent cx="218440" cy="231775"/>
-                      <wp:effectExtent l="0" t="0" r="10160" b="15875"/>
-                      <wp:wrapSquare wrapText="bothSides"/>
-                      <wp:docPr id="1771812289" name="Text Box 2"/>
-                      <wp:cNvGraphicFramePr>
-                        <a:graphicFrameLocks xmlns:a="http://schemas.openxmlformats.org/drawingml/2006/main"/>
-                      </wp:cNvGraphicFramePr>
-                      <a:graphic xmlns:a="http://schemas.openxmlformats.org/drawingml/2006/main">
-                        <a:graphicData uri="http://schemas.microsoft.com/office/word/2010/wordprocessingShape">
-                          <wps:wsp>
-                            <wps:cNvSpPr txBox="1">
-                              <a:spLocks noChangeArrowheads="1"/>
-                            </wps:cNvSpPr>
-                            <wps:spPr bwMode="auto">
-                              <a:xfrm>
-                                <a:off x="0" y="0"/>
-                                <a:ext cx="218440" cy="231775"/>
-                              </a:xfrm>
-                              <a:prstGeom prst="rect">
-                                <a:avLst/>
-                              </a:prstGeom>
-                              <a:solidFill>
-                                <a:srgbClr val="FFFFFF"/>
-                              </a:solidFill>
-                              <a:ln w="9525">
-                                <a:solidFill>
-                                  <a:srgbClr val="000000"/>
-                                </a:solidFill>
-                                <a:miter lim="800000"/>
-                                <a:headEnd/>
-                                <a:tailEnd/>
-                              </a:ln>
-                            </wps:spPr>
-                            <wps:txbx>
-                              <w:txbxContent>
-                                <w:p>
-                                  <w:pPr>
-                                    <w:rPr>
-                                      <w:b/>
-                                      <w:bCs/>
-                                      <w:sz w:val="20"/>
-                                      <w:szCs w:val="20"/>
-                                    </w:rPr>
-                                  </w:pPr>
-                                </w:p>
-                              </w:txbxContent>
-                            </wps:txbx>
-                            <wps:bodyPr rot="0" vert="horz" wrap="square" lIns="91440" tIns="45720" rIns="91440" bIns="45720" anchor="t" anchorCtr="0">
-                              <a:noAutofit/>
-                            </wps:bodyPr>
-                          </wps:wsp>
-                        </a:graphicData>
-                      </a:graphic>
-                      <wp14:sizeRelH relativeFrom="margin">
-                        <wp14:pctWidth>0</wp14:pctWidth>
-                      </wp14:sizeRelH>
-                      <wp14:sizeRelV relativeFrom="margin">
-                        <wp14:pctHeight>0</wp14:pctHeight>
-                      </wp14:sizeRelV>
-                    </wp:anchor>
-                  </w:drawing>
-                </mc:Choice>
-                <mc:Fallback>
-                  <w:pict>
-                    <v:shapetype w14:anchorId="467DE0D4" id="_x0000_t202" coordsize="21600,21600" o:spt="202" path="m,l,21600r21600,l21600,xe">
-                      <v:stroke joinstyle="miter"/>
-                      <v:path gradientshapeok="t" o:connecttype="rect"/>
-                    </v:shapetype>
-                    <v:shape id="Text Box 2" o:spid="_x0000_s1026" type="#_x0000_t202" style="position:absolute;margin-left:151.75pt;margin-top:8.4pt;width:17.2pt;height:18.25pt;z-index:251694080;visibility:visible;mso-wrap-style:square;mso-width-percent:0;mso-height-percent:0;mso-wrap-distance-left:9pt;mso-wrap-distance-top:3.6pt;mso-wrap-distance-right:9pt;mso-wrap-distance-bottom:3.6pt;mso-position-horizontal:absolute;mso-position-horizontal-relative:text;mso-position-vertical:absolute;mso-position-vertical-relative:text;mso-width-percent:0;mso-height-percent:0;mso-width-relative:margin;mso-height-relative:margin;v-text-anchor:top" o:gfxdata="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">
-                      <v:textbox>
-                        <w:txbxContent>
-                          <w:p>
-                            <w:pPr>
-                              <w:rPr>
-                                <w:b/>
-                                <w:bCs/>
-                                <w:sz w:val="20"/>
-                                <w:szCs w:val="20"/>
-                              </w:rPr>
-                            </w:pPr>
-                          </w:p>
-                        </w:txbxContent>
-                      </v:textbox>
-                      <w10:wrap type="square"/>
-                    </v:shape>
-                  </w:pict>
-                </mc:Fallback>
-              </mc:AlternateContent>
-            </w:r>
-            <w:r>
-              <w:rPr>
-                <w:noProof/>
-                <w:sz w:val="22"/>
-                <w:szCs w:val="22"/>
-              </w:rPr>
-              <mc:AlternateContent>
-                <mc:Choice Requires="wps">
-                  <w:drawing>
-                    <wp:anchor distT="45720" distB="45720" distL="114300" distR="114300" simplePos="0" relativeHeight="251665408" behindDoc="0" locked="0" layoutInCell="1" allowOverlap="1" wp14:anchorId="1737E518" wp14:editId="592AD27E">
-                      <wp:simplePos x="0" y="0"/>
-                      <wp:positionH relativeFrom="column">
-                        <wp:posOffset>3350205</wp:posOffset>
-                      </wp:positionH>
-                      <wp:positionV relativeFrom="paragraph">
-                        <wp:posOffset>122141</wp:posOffset>
-                      </wp:positionV>
-                      <wp:extent cx="218440" cy="231775"/>
-                      <wp:effectExtent l="0" t="0" r="10160" b="15875"/>
-                      <wp:wrapSquare wrapText="bothSides"/>
-                      <wp:docPr id="1126634135" name="Text Box 2"/>
-                      <wp:cNvGraphicFramePr>
-                        <a:graphicFrameLocks xmlns:a="http://schemas.openxmlformats.org/drawingml/2006/main"/>
-                      </wp:cNvGraphicFramePr>
-                      <a:graphic xmlns:a="http://schemas.openxmlformats.org/drawingml/2006/main">
-                        <a:graphicData uri="http://schemas.microsoft.com/office/word/2010/wordprocessingShape">
-                          <wps:wsp>
-                            <wps:cNvSpPr txBox="1">
-                              <a:spLocks noChangeArrowheads="1"/>
-                            </wps:cNvSpPr>
-                            <wps:spPr bwMode="auto">
-                              <a:xfrm>
-                                <a:off x="0" y="0"/>
-                                <a:ext cx="218440" cy="231775"/>
-                              </a:xfrm>
-                              <a:prstGeom prst="rect">
-                                <a:avLst/>
-                              </a:prstGeom>
-                              <a:solidFill>
-                                <a:srgbClr val="FFFFFF"/>
-                              </a:solidFill>
-                              <a:ln w="9525">
-                                <a:solidFill>
-                                  <a:srgbClr val="000000"/>
-                                </a:solidFill>
-                                <a:miter lim="800000"/>
-                                <a:headEnd/>
-                                <a:tailEnd/>
-                              </a:ln>
-                            </wps:spPr>
-                            <wps:txbx>
-                              <w:txbxContent>
-                                <w:p>
-                                  <w:pPr>
-                                    <w:rPr>
-                                      <w:b/>
-                                      <w:bCs/>
-                                      <w:sz w:val="20"/>
-                                      <w:szCs w:val="20"/>
-                                    </w:rPr>
-                                  </w:pPr>
-                                  <w:r>
-                                    <w:rPr>
-                                      <w:b/>
-                                      <w:bCs/>
-                                      <w:sz w:val="20"/>
-                                      <w:szCs w:val="20"/>
-                                    </w:rPr>
-                                    <w:t>X</w:t>
-                                  </w:r>
-                                </w:p>
-                              </w:txbxContent>
-                            </wps:txbx>
-                            <wps:bodyPr rot="0" vert="horz" wrap="square" lIns="91440" tIns="45720" rIns="91440" bIns="45720" anchor="t" anchorCtr="0">
-                              <a:noAutofit/>
-                            </wps:bodyPr>
-                          </wps:wsp>
-                        </a:graphicData>
-                      </a:graphic>
-                      <wp14:sizeRelH relativeFrom="margin">
-                        <wp14:pctWidth>0</wp14:pctWidth>
-                      </wp14:sizeRelH>
-                      <wp14:sizeRelV relativeFrom="margin">
-                        <wp14:pctHeight>0</wp14:pctHeight>
-                      </wp14:sizeRelV>
-                    </wp:anchor>
-                  </w:drawing>
-                </mc:Choice>
-                <mc:Fallback>
-                  <w:pict>
-                    <v:shape w14:anchorId="1737E518" id="_x0000_s1027" type="#_x0000_t202" style="position:absolute;margin-left:263.8pt;margin-top:9.6pt;width:17.2pt;height:18.25pt;z-index:251665408;visibility:visible;mso-wrap-style:square;mso-width-percent:0;mso-height-percent:0;mso-wrap-distance-left:9pt;mso-wrap-distance-top:3.6pt;mso-wrap-distance-right:9pt;mso-wrap-distance-bottom:3.6pt;mso-position-horizontal:absolute;mso-position-horizontal-relative:text;mso-position-vertical:absolute;mso-position-vertical-relative:text;mso-width-percent:0;mso-height-percent:0;mso-width-relative:margin;mso-height-relative:margin;v-text-anchor:top" o:gfxdata="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">
-                      <v:textbox>
-                        <w:txbxContent>
-                          <w:p>
-                            <w:pPr>
-                              <w:rPr>
-                                <w:b/>
-                                <w:bCs/>
-                                <w:sz w:val="20"/>
-                                <w:szCs w:val="20"/>
-                              </w:rPr>
-                            </w:pPr>
-                            <w:r>
-                              <w:rPr>
-                                <w:b/>
-                                <w:bCs/>
-                                <w:sz w:val="20"/>
-                                <w:szCs w:val="20"/>
-                              </w:rPr>
-                              <w:t>X</w:t>
-                            </w:r>
-                          </w:p>
-                        </w:txbxContent>
-                      </v:textbox>
-                      <w10:wrap type="square"/>
-                    </v:shape>
-                  </w:pict>
-                </mc:Fallback>
-              </mc:AlternateContent>
-            </w:r>
-          </w:p>
-          <w:p>
-            <w:pPr>
-              <w:pStyle w:val="Default"/>
-              <w:rPr>
-                <w:sz w:val="22"/>
-                <w:szCs w:val="22"/>
-              </w:rPr>
-            </w:pPr>
-            <w:r>
-              <w:rPr>
-                <w:sz w:val="22"/>
-                <w:szCs w:val="22"/>
-              </w:rPr>
-              <w:t xml:space="preserve">International Student:  </w:t>
-            </w:r>
-            <w:r>
-              <w:rPr>
-                <w:sz w:val="22"/>
-                <w:szCs w:val="22"/>
-              </w:rPr>
-              <w:t xml:space="preserve">{international_yes} Yes</w:t>
-            </w:r>
-            <w:r>
-              <w:rPr>
-                <w:sz w:val="22"/>
-                <w:szCs w:val="22"/>
-              </w:rPr>
-              <w:tab/>
-            </w:r>
-            <w:r>
-              <w:rPr>
-                <w:sz w:val="22"/>
-                <w:szCs w:val="22"/>
-              </w:rPr>
-              <w:tab/>
-            </w:r>
-            <w:r>
-              <w:rPr>
-                <w:sz w:val="22"/>
-                <w:szCs w:val="22"/>
-              </w:rPr>
-              <w:tab/>
-            </w:r>
-            <w:r>
-              <w:rPr>
-                <w:sz w:val="22"/>
-                <w:szCs w:val="22"/>
-              </w:rPr>
-              <w:t xml:space="preserve">{international_no} No</w:t>
+          </w:p>
+          <w:p>
+            <w:pPr>
+              <w:pStyle w:val="Default"/>
+              <w:rPr>
+                <w:sz w:val="22"/>
+                <w:szCs w:val="22"/>
+              </w:rPr>
+            </w:pPr>
+            <w:r>
+              <w:rPr>
+                <w:sz w:val="22"/>
+                <w:szCs w:val="22"/>
+              </w:rPr>
+              <w:t>International Student: {</w:t>
+            </w:r>
+            <w:proofErr w:type="spellStart"/>
+            <w:r>
+              <w:rPr>
+                <w:sz w:val="22"/>
+                <w:szCs w:val="22"/>
+              </w:rPr>
+              <w:t>international_yes</w:t>
+            </w:r>
+            <w:proofErr w:type="spellEnd"/>
+            <w:r>
+              <w:rPr>
+                <w:sz w:val="22"/>
+                <w:szCs w:val="22"/>
+              </w:rPr>
+              <w:t xml:space="preserve">} Yes     </w:t>
+            </w:r>
+            <w:proofErr w:type="gramStart"/>
+            <w:r>
+              <w:rPr>
+                <w:sz w:val="22"/>
+                <w:szCs w:val="22"/>
+              </w:rPr>
+              <w:t xml:space="preserve">   {</w:t>
+            </w:r>
+            <w:proofErr w:type="spellStart"/>
+            <w:proofErr w:type="gramEnd"/>
+            <w:r>
+              <w:rPr>
+                <w:sz w:val="22"/>
+                <w:szCs w:val="22"/>
+              </w:rPr>
+              <w:t>international_no</w:t>
+            </w:r>
+            <w:proofErr w:type="spellEnd"/>
+            <w:r>
+              <w:rPr>
+                <w:sz w:val="22"/>
+                <w:szCs w:val="22"/>
+              </w:rPr>
+              <w:t>} No</w:t>
             </w:r>
           </w:p>
           <w:p>
@@ -2308,7 +2099,27 @@
                 <w:sz w:val="28"/>
                 <w:szCs w:val="28"/>
               </w:rPr>
-              <w:t xml:space="preserve">25 Watline Avenue, Unit 204 </w:t>
+              <w:t xml:space="preserve">25 </w:t>
+            </w:r>
+            <w:proofErr w:type="spellStart"/>
+            <w:r>
+              <w:rPr>
+                <w:b/>
+                <w:bCs/>
+                <w:sz w:val="28"/>
+                <w:szCs w:val="28"/>
+              </w:rPr>
+              <w:t>Watline</w:t>
+            </w:r>
+            <w:proofErr w:type="spellEnd"/>
+            <w:r>
+              <w:rPr>
+                <w:b/>
+                <w:bCs/>
+                <w:sz w:val="28"/>
+                <w:szCs w:val="28"/>
+              </w:rPr>
+              <w:t xml:space="preserve"> Avenue, Unit 204 </w:t>
             </w:r>
           </w:p>
           <w:p>
@@ -3886,174 +3697,76 @@
             </w:pPr>
             <w:r>
               <w:rPr>
-                <w:noProof/>
-                <w:sz w:val="22"/>
-                <w:szCs w:val="22"/>
-              </w:rPr>
-              <mc:AlternateContent>
-                <mc:Choice Requires="wps">
-                  <w:drawing>
-                    <wp:anchor distT="45720" distB="45720" distL="114300" distR="114300" simplePos="0" relativeHeight="251669504" behindDoc="0" locked="0" layoutInCell="1" allowOverlap="1" wp14:anchorId="3C7F2D48" wp14:editId="3DDD7C8B">
-                      <wp:simplePos x="0" y="0"/>
-                      <wp:positionH relativeFrom="column">
-                        <wp:posOffset>2817826</wp:posOffset>
-                      </wp:positionH>
-                      <wp:positionV relativeFrom="paragraph">
-                        <wp:posOffset>122389</wp:posOffset>
-                      </wp:positionV>
-                      <wp:extent cx="218440" cy="231775"/>
-                      <wp:effectExtent l="0" t="0" r="10160" b="15875"/>
-                      <wp:wrapSquare wrapText="bothSides"/>
-                      <wp:docPr id="751020824" name="Text Box 2"/>
-                      <wp:cNvGraphicFramePr>
-                        <a:graphicFrameLocks xmlns:a="http://schemas.openxmlformats.org/drawingml/2006/main"/>
-                      </wp:cNvGraphicFramePr>
-                      <a:graphic xmlns:a="http://schemas.openxmlformats.org/drawingml/2006/main">
-                        <a:graphicData uri="http://schemas.microsoft.com/office/word/2010/wordprocessingShape">
-                          <wps:wsp>
-                            <wps:cNvSpPr txBox="1">
-                              <a:spLocks noChangeArrowheads="1"/>
-                            </wps:cNvSpPr>
-                            <wps:spPr bwMode="auto">
-                              <a:xfrm>
-                                <a:off x="0" y="0"/>
-                                <a:ext cx="218440" cy="231775"/>
-                              </a:xfrm>
-                              <a:prstGeom prst="rect">
-                                <a:avLst/>
-                              </a:prstGeom>
-                              <a:solidFill>
-                                <a:srgbClr val="FFFFFF"/>
-                              </a:solidFill>
-                              <a:ln w="9525">
-                                <a:solidFill>
-                                  <a:srgbClr val="000000"/>
-                                </a:solidFill>
-                                <a:miter lim="800000"/>
-                                <a:headEnd/>
-                                <a:tailEnd/>
-                              </a:ln>
-                            </wps:spPr>
-                            <wps:txbx>
-                              <w:txbxContent>
-                                <w:p>
-                                  <w:pPr>
-                                    <w:rPr>
-                                      <w:b/>
-                                      <w:bCs/>
-                                      <w:sz w:val="20"/>
-                                      <w:szCs w:val="20"/>
-                                    </w:rPr>
-                                  </w:pPr>
-                                  <w:r>
-                                    <w:rPr>
-                                      <w:b/>
-                                      <w:bCs/>
-                                      <w:sz w:val="20"/>
-                                      <w:szCs w:val="20"/>
-                                    </w:rPr>
-                                    <w:t>X</w:t>
-                                  </w:r>
-                                </w:p>
-                              </w:txbxContent>
-                            </wps:txbx>
-                            <wps:bodyPr rot="0" vert="horz" wrap="square" lIns="91440" tIns="45720" rIns="91440" bIns="45720" anchor="t" anchorCtr="0">
-                              <a:noAutofit/>
-                            </wps:bodyPr>
-                          </wps:wsp>
-                        </a:graphicData>
-                      </a:graphic>
-                      <wp14:sizeRelH relativeFrom="margin">
-                        <wp14:pctWidth>0</wp14:pctWidth>
-                      </wp14:sizeRelH>
-                      <wp14:sizeRelV relativeFrom="margin">
-                        <wp14:pctHeight>0</wp14:pctHeight>
-                      </wp14:sizeRelV>
-                    </wp:anchor>
-                  </w:drawing>
-                </mc:Choice>
-                <mc:Fallback>
-                  <w:pict>
-                    <v:shape w14:anchorId="3C7F2D48" id="_x0000_s1030" type="#_x0000_t202" style="position:absolute;margin-left:221.9pt;margin-top:9.65pt;width:17.2pt;height:18.25pt;z-index:251669504;visibility:visible;mso-wrap-style:square;mso-width-percent:0;mso-height-percent:0;mso-wrap-distance-left:9pt;mso-wrap-distance-top:3.6pt;mso-wrap-distance-right:9pt;mso-wrap-distance-bottom:3.6pt;mso-position-horizontal:absolute;mso-position-horizontal-relative:text;mso-position-vertical:absolute;mso-position-vertical-relative:text;mso-width-percent:0;mso-height-percent:0;mso-width-relative:margin;mso-height-relative:margin;v-text-anchor:top" o:gfxdata="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">
-                      <v:textbox>
-                        <w:txbxContent>
-                          <w:p>
-                            <w:pPr>
-                              <w:rPr>
-                                <w:b/>
-                                <w:bCs/>
-                                <w:sz w:val="20"/>
-                                <w:szCs w:val="20"/>
-                              </w:rPr>
-                            </w:pPr>
-                            <w:r>
-                              <w:rPr>
-                                <w:b/>
-                                <w:bCs/>
-                                <w:sz w:val="20"/>
-                                <w:szCs w:val="20"/>
-                              </w:rPr>
-                              <w:t>X</w:t>
-                            </w:r>
-                          </w:p>
-                        </w:txbxContent>
-                      </v:textbox>
-                      <w10:wrap type="square"/>
-                    </v:shape>
-                  </w:pict>
-                </mc:Fallback>
-              </mc:AlternateContent>
-            </w:r>
-          </w:p>
-          <w:p>
-            <w:pPr>
-              <w:pStyle w:val="Default"/>
-              <w:rPr>
-                <w:sz w:val="22"/>
-                <w:szCs w:val="22"/>
-              </w:rPr>
-            </w:pPr>
-            <w:r>
-              <w:rPr>
-                <w:sz w:val="22"/>
-                <w:szCs w:val="22"/>
-              </w:rPr>
-              <w:t xml:space="preserve">Method of program delivery  </w:t>
-            </w:r>
-            <w:r>
-              <w:rPr>
-                <w:sz w:val="22"/>
-                <w:szCs w:val="22"/>
-              </w:rPr>
-              <w:t xml:space="preserve">{delivery_in_person} in-person</w:t>
-            </w:r>
-            <w:r>
-              <w:rPr>
-                <w:sz w:val="22"/>
-                <w:szCs w:val="22"/>
-              </w:rPr>
-              <w:t xml:space="preserve">    </w:t>
-            </w:r>
-            <w:r>
-              <w:rPr>
-                <w:sz w:val="22"/>
-                <w:szCs w:val="22"/>
-              </w:rPr>
-              <w:t xml:space="preserve">{delivery_hybrid} Hybrid</w:t>
-            </w:r>
-            <w:r>
-              <w:rPr>
-                <w:sz w:val="22"/>
-                <w:szCs w:val="22"/>
-              </w:rPr>
-              <w:t xml:space="preserve">      </w:t>
-            </w:r>
-            <w:r>
-              <w:rPr>
-                <w:sz w:val="22"/>
-                <w:szCs w:val="22"/>
-              </w:rPr>
-              <w:t xml:space="preserve">{delivery_online} Online</w:t>
+                <w:sz w:val="22"/>
+                <w:szCs w:val="22"/>
+              </w:rPr>
+              <w:t>Method of program delivery</w:t>
+            </w:r>
+            <w:proofErr w:type="gramStart"/>
+            <w:r>
+              <w:rPr>
+                <w:sz w:val="22"/>
+                <w:szCs w:val="22"/>
+              </w:rPr>
+              <w:t xml:space="preserve">   {</w:t>
+            </w:r>
+            <w:proofErr w:type="spellStart"/>
+            <w:proofErr w:type="gramEnd"/>
+            <w:r>
+              <w:rPr>
+                <w:sz w:val="22"/>
+                <w:szCs w:val="22"/>
+              </w:rPr>
+              <w:t>delivery_in_person</w:t>
+            </w:r>
+            <w:proofErr w:type="spellEnd"/>
+            <w:r>
+              <w:rPr>
+                <w:sz w:val="22"/>
+                <w:szCs w:val="22"/>
+              </w:rPr>
+              <w:t>} in-</w:t>
+            </w:r>
+            <w:proofErr w:type="gramStart"/>
+            <w:r>
+              <w:rPr>
+                <w:sz w:val="22"/>
+                <w:szCs w:val="22"/>
+              </w:rPr>
+              <w:t>person  {</w:t>
+            </w:r>
+            <w:proofErr w:type="spellStart"/>
+            <w:proofErr w:type="gramEnd"/>
+            <w:r>
+              <w:rPr>
+                <w:sz w:val="22"/>
+                <w:szCs w:val="22"/>
+              </w:rPr>
+              <w:t>delivery_hybrid</w:t>
+            </w:r>
+            <w:proofErr w:type="spellEnd"/>
+            <w:r>
+              <w:rPr>
+                <w:sz w:val="22"/>
+                <w:szCs w:val="22"/>
+              </w:rPr>
+              <w:t>} Hybrid {</w:t>
+            </w:r>
+            <w:proofErr w:type="spellStart"/>
+            <w:r>
+              <w:rPr>
+                <w:sz w:val="22"/>
+                <w:szCs w:val="22"/>
+              </w:rPr>
+              <w:t>delivery_online</w:t>
+            </w:r>
+            <w:proofErr w:type="spellEnd"/>
+            <w:r>
+              <w:rPr>
+                <w:sz w:val="22"/>
+                <w:szCs w:val="22"/>
+              </w:rPr>
+              <w:t>} Online</w:t>
             </w:r>
           </w:p>
           <w:p>
@@ -4167,7 +3880,7 @@
               </w:rPr>
               <w:t xml:space="preserve">International Student and/or Applicant with foreign credentials. All foreign credentials must be translated into English and compared for Grade 12 equivalency by a recognized organization such as World Education Services: </w:t>
             </w:r>
-            <w:hyperlink r:id="rId10" w:history="1">
+            <w:hyperlink r:id="rId8" w:history="1">
               <w:r>
                 <w:rPr>
                   <w:rStyle w:val="Hyperlink"/>
@@ -4240,15 +3953,18 @@
           <w:p>
             <w:pPr>
               <w:pStyle w:val="Default"/>
+              <w:ind w:left="720"/>
               <w:rPr>
                 <w:b/>
                 <w:bCs/>
                 <w:sz w:val="22"/>
                 <w:szCs w:val="22"/>
-                <w:u w:val="single"/>
-              </w:rPr>
-            </w:pPr>
-            <w:r>
+              </w:rPr>
+            </w:pPr>
+          </w:p>
+          <w:p>
+            <w:pPr>
+              <w:pStyle w:val="Default"/>
               <w:rPr>
                 <w:b/>
                 <w:bCs/>
@@ -4256,7 +3972,27 @@
                 <w:szCs w:val="22"/>
                 <w:u w:val="single"/>
               </w:rPr>
-              <w:br w:type="page"/>
+            </w:pPr>
+          </w:p>
+          <w:p>
+            <w:pPr>
+              <w:pStyle w:val="Default"/>
+              <w:rPr>
+                <w:b/>
+                <w:bCs/>
+                <w:sz w:val="22"/>
+                <w:szCs w:val="22"/>
+                <w:u w:val="single"/>
+              </w:rPr>
+            </w:pPr>
+            <w:r>
+              <w:rPr>
+                <w:b/>
+                <w:bCs/>
+                <w:sz w:val="22"/>
+                <w:szCs w:val="22"/>
+                <w:u w:val="single"/>
+              </w:rPr>
               <w:t>English Language Proficiency</w:t>
             </w:r>
           </w:p>
@@ -4586,6 +4322,7 @@
               </w:rPr>
               <w:t xml:space="preserve">            </w:t>
             </w:r>
+            <w:proofErr w:type="gramStart"/>
             <w:r>
               <w:rPr>
                 <w:sz w:val="22"/>
@@ -4612,7 +4349,15 @@
                 <w:sz w:val="22"/>
                 <w:szCs w:val="22"/>
               </w:rPr>
-              <w:t>___</w:t>
+              <w:t>_</w:t>
+            </w:r>
+            <w:proofErr w:type="gramEnd"/>
+            <w:r>
+              <w:rPr>
+                <w:sz w:val="22"/>
+                <w:szCs w:val="22"/>
+              </w:rPr>
+              <w:t>__</w:t>
             </w:r>
             <w:r>
               <w:rPr>
@@ -5448,7 +5193,6 @@
                 <w:szCs w:val="28"/>
                 <w:u w:val="single"/>
               </w:rPr>
-              <w:lastRenderedPageBreak/>
               <w:t>Payment Schedule</w:t>
             </w:r>
           </w:p>
@@ -8309,6 +8053,7 @@
               </w:rPr>
               <w:t xml:space="preserve">(Signature of </w:t>
             </w:r>
+            <w:proofErr w:type="gramStart"/>
             <w:r>
               <w:rPr>
                 <w:sz w:val="22"/>
@@ -8328,7 +8073,15 @@
                 <w:sz w:val="22"/>
                 <w:szCs w:val="22"/>
               </w:rPr>
-              <w:t xml:space="preserve">                                                                 Date</w:t>
+              <w:t xml:space="preserve"> </w:t>
+            </w:r>
+            <w:proofErr w:type="gramEnd"/>
+            <w:r>
+              <w:rPr>
+                <w:sz w:val="22"/>
+                <w:szCs w:val="22"/>
+              </w:rPr>
+              <w:t xml:space="preserve">                                                                Date</w:t>
             </w:r>
             <w:r>
               <w:rPr>
@@ -8828,6 +8581,7 @@
               </w:rPr>
               <w:t xml:space="preserve">(Signature of </w:t>
             </w:r>
+            <w:proofErr w:type="gramStart"/>
             <w:r>
               <w:rPr>
                 <w:sz w:val="22"/>
@@ -8847,7 +8601,15 @@
                 <w:sz w:val="22"/>
                 <w:szCs w:val="22"/>
               </w:rPr>
-              <w:t xml:space="preserve">                                </w:t>
+              <w:t xml:space="preserve"> </w:t>
+            </w:r>
+            <w:proofErr w:type="gramEnd"/>
+            <w:r>
+              <w:rPr>
+                <w:sz w:val="22"/>
+                <w:szCs w:val="22"/>
+              </w:rPr>
+              <w:t xml:space="preserve">                               </w:t>
             </w:r>
             <w:r>
               <w:rPr>
@@ -8875,7 +8637,23 @@
                 <w:sz w:val="22"/>
                 <w:szCs w:val="22"/>
               </w:rPr>
-              <w:t xml:space="preserve">           (Date)</w:t>
+              <w:t xml:space="preserve">        </w:t>
+            </w:r>
+            <w:proofErr w:type="gramStart"/>
+            <w:r>
+              <w:rPr>
+                <w:sz w:val="22"/>
+                <w:szCs w:val="22"/>
+              </w:rPr>
+              <w:t xml:space="preserve">   (</w:t>
+            </w:r>
+            <w:proofErr w:type="gramEnd"/>
+            <w:r>
+              <w:rPr>
+                <w:sz w:val="22"/>
+                <w:szCs w:val="22"/>
+              </w:rPr>
+              <w:t>Date)</w:t>
             </w:r>
           </w:p>
           <w:p>
@@ -9132,6 +8910,7 @@
               </w:rPr>
               <w:t xml:space="preserve">      (Signature of Admission Officer, Registrar, </w:t>
             </w:r>
+            <w:proofErr w:type="gramStart"/>
             <w:r>
               <w:rPr>
                 <w:sz w:val="22"/>
@@ -9151,7 +8930,15 @@
                 <w:sz w:val="22"/>
                 <w:szCs w:val="22"/>
               </w:rPr>
-              <w:t xml:space="preserve">                                  Date</w:t>
+              <w:t xml:space="preserve"> </w:t>
+            </w:r>
+            <w:proofErr w:type="gramEnd"/>
+            <w:r>
+              <w:rPr>
+                <w:sz w:val="22"/>
+                <w:szCs w:val="22"/>
+              </w:rPr>
+              <w:t xml:space="preserve">                                 Date</w:t>
             </w:r>
           </w:p>
           <w:p>
@@ -9732,7 +9519,23 @@
                 <w:sz w:val="22"/>
                 <w:szCs w:val="22"/>
               </w:rPr>
-              <w:t>I understand that I can refuse to sign this consent form and that I can withdraw my consent at any time for future uses of my personal information by writing to the Chief Operating Officer at 25 Watline Avenue, Unit 204 Mississauga, Ontario, L4Z 2Z1. I understand that if I refuse or withdraw my consent the Superintendent may not be able to contact me to inform me of my rights under the Act or collect information to help potential students make informed decisions about their educational choices.</w:t>
+              <w:t xml:space="preserve">I understand that I can refuse to sign this consent form and that I can withdraw my consent at any time for future uses of my personal information by writing to the Chief Operating Officer at 25 </w:t>
+            </w:r>
+            <w:proofErr w:type="spellStart"/>
+            <w:r>
+              <w:rPr>
+                <w:sz w:val="22"/>
+                <w:szCs w:val="22"/>
+              </w:rPr>
+              <w:t>Watline</w:t>
+            </w:r>
+            <w:proofErr w:type="spellEnd"/>
+            <w:r>
+              <w:rPr>
+                <w:sz w:val="22"/>
+                <w:szCs w:val="22"/>
+              </w:rPr>
+              <w:t xml:space="preserve"> Avenue, Unit 204 Mississauga, Ontario, L4Z 2Z1. I understand that if I refuse or withdraw my consent the Superintendent may not be able to contact me to inform me of my rights under the Act or collect information to help potential students make informed decisions about their educational choices.</w:t>
             </w:r>
           </w:p>
           <w:p>
@@ -9978,6 +9781,7 @@
               </w:rPr>
               <w:t xml:space="preserve">(Signature of </w:t>
             </w:r>
+            <w:proofErr w:type="gramStart"/>
             <w:r>
               <w:rPr>
                 <w:sz w:val="22"/>
@@ -9990,7 +9794,15 @@
                 <w:sz w:val="22"/>
                 <w:szCs w:val="22"/>
               </w:rPr>
-              <w:t xml:space="preserve">                                                  </w:t>
+              <w:t xml:space="preserve"> </w:t>
+            </w:r>
+            <w:proofErr w:type="gramEnd"/>
+            <w:r>
+              <w:rPr>
+                <w:sz w:val="22"/>
+                <w:szCs w:val="22"/>
+              </w:rPr>
+              <w:t xml:space="preserve">                                                 </w:t>
             </w:r>
             <w:r>
               <w:rPr>
@@ -10004,7 +9816,23 @@
                 <w:sz w:val="22"/>
                 <w:szCs w:val="22"/>
               </w:rPr>
-              <w:t xml:space="preserve">     (Date)</w:t>
+              <w:t xml:space="preserve">  </w:t>
+            </w:r>
+            <w:proofErr w:type="gramStart"/>
+            <w:r>
+              <w:rPr>
+                <w:sz w:val="22"/>
+                <w:szCs w:val="22"/>
+              </w:rPr>
+              <w:t xml:space="preserve">   (</w:t>
+            </w:r>
+            <w:proofErr w:type="gramEnd"/>
+            <w:r>
+              <w:rPr>
+                <w:sz w:val="22"/>
+                <w:szCs w:val="22"/>
+              </w:rPr>
+              <w:t>Date)</w:t>
             </w:r>
           </w:p>
           <w:p>
@@ -10258,7 +10086,23 @@
                 <w:sz w:val="22"/>
                 <w:szCs w:val="22"/>
               </w:rPr>
-              <w:t xml:space="preserve"> mid-point” means the point in the progress of a vocational program where half of the scheduled hours of instruction for the program have taken place; (“mi-parcours du programme”) </w:t>
+              <w:t xml:space="preserve"> mid-point” means the point in the progress of a vocational program where half of the scheduled hours of instruction for the program have taken place; (“mi-</w:t>
+            </w:r>
+            <w:proofErr w:type="spellStart"/>
+            <w:r>
+              <w:rPr>
+                <w:sz w:val="22"/>
+                <w:szCs w:val="22"/>
+              </w:rPr>
+              <w:t>parcours</w:t>
+            </w:r>
+            <w:proofErr w:type="spellEnd"/>
+            <w:r>
+              <w:rPr>
+                <w:sz w:val="22"/>
+                <w:szCs w:val="22"/>
+              </w:rPr>
+              <w:t xml:space="preserve"> du programme”) </w:t>
             </w:r>
           </w:p>
           <w:p>
@@ -10338,7 +10182,23 @@
                 <w:sz w:val="22"/>
                 <w:szCs w:val="22"/>
               </w:rPr>
-              <w:t xml:space="preserve">25. If a student has entered into a contract with a career college for a vocational program, the college shall give a refund of all fees paid for the program in the following circumstances: </w:t>
+              <w:t xml:space="preserve">25. If a student has </w:t>
+            </w:r>
+            <w:proofErr w:type="gramStart"/>
+            <w:r>
+              <w:rPr>
+                <w:sz w:val="22"/>
+                <w:szCs w:val="22"/>
+              </w:rPr>
+              <w:t>entered into</w:t>
+            </w:r>
+            <w:proofErr w:type="gramEnd"/>
+            <w:r>
+              <w:rPr>
+                <w:sz w:val="22"/>
+                <w:szCs w:val="22"/>
+              </w:rPr>
+              <w:t xml:space="preserve"> a contract with a career college for a vocational program, the college shall give a refund of all fees paid for the program in the following circumstances: </w:t>
             </w:r>
           </w:p>
           <w:p>
@@ -10463,7 +10323,23 @@
                 <w:sz w:val="22"/>
                 <w:szCs w:val="22"/>
               </w:rPr>
-              <w:t xml:space="preserve">5.The college collects any fees other than a service fee before the student has entered into a contract with the college. </w:t>
+              <w:t xml:space="preserve">5.The college collects any fees other than a service fee before the student has </w:t>
+            </w:r>
+            <w:proofErr w:type="gramStart"/>
+            <w:r>
+              <w:rPr>
+                <w:sz w:val="22"/>
+                <w:szCs w:val="22"/>
+              </w:rPr>
+              <w:t>entered into</w:t>
+            </w:r>
+            <w:proofErr w:type="gramEnd"/>
+            <w:r>
+              <w:rPr>
+                <w:sz w:val="22"/>
+                <w:szCs w:val="22"/>
+              </w:rPr>
+              <w:t xml:space="preserve"> a contract with the college. </w:t>
             </w:r>
           </w:p>
           <w:p>
@@ -10656,7 +10532,6 @@
                 <w:szCs w:val="28"/>
                 <w:u w:val="single"/>
               </w:rPr>
-              <w:lastRenderedPageBreak/>
               <w:t>Full refunds minus service fee</w:t>
             </w:r>
           </w:p>
@@ -15152,7 +15027,31 @@
           <w:lang w:val="en-US"/>
           <w14:ligatures w14:val="none"/>
         </w:rPr>
-        <w:t>submit up-to-date immunization status within 45 days of commencement of study and that I must, while enrolled in the program, maintain this status in order to complete the practicum placement and graduate.</w:t>
+        <w:t xml:space="preserve">submit up-to-date immunization status within 45 days of commencement of study and that I must, while enrolled in the program, maintain this status </w:t>
+      </w:r>
+      <w:proofErr w:type="gramStart"/>
+      <w:r>
+        <w:rPr>
+          <w:rFonts w:ascii="Calibri" w:eastAsia="Calibri" w:hAnsi="Calibri" w:cs="Calibri"/>
+          <w:kern w:val="0"/>
+          <w:sz w:val="23"/>
+          <w:szCs w:val="23"/>
+          <w:lang w:val="en-US"/>
+          <w14:ligatures w14:val="none"/>
+        </w:rPr>
+        <w:t>in order to</w:t>
+      </w:r>
+      <w:proofErr w:type="gramEnd"/>
+      <w:r>
+        <w:rPr>
+          <w:rFonts w:ascii="Calibri" w:eastAsia="Calibri" w:hAnsi="Calibri" w:cs="Calibri"/>
+          <w:kern w:val="0"/>
+          <w:sz w:val="23"/>
+          <w:szCs w:val="23"/>
+          <w:lang w:val="en-US"/>
+          <w14:ligatures w14:val="none"/>
+        </w:rPr>
+        <w:t xml:space="preserve"> complete the practicum placement and graduate.</w:t>
       </w:r>
     </w:p>
     <w:p>
@@ -21801,7 +21700,25 @@
           <w:sz w:val="22"/>
           <w:szCs w:val="22"/>
         </w:rPr>
-        <w:t>We ask that you read the following carefully and sign below to acknowledge your understanding and agreement.</w:t>
+        <w:t xml:space="preserve">We ask that you read the following carefully and sign below to acknowledge </w:t>
+      </w:r>
+      <w:proofErr w:type="gramStart"/>
+      <w:r>
+        <w:rPr>
+          <w:rFonts w:asciiTheme="minorHAnsi" w:hAnsiTheme="minorHAnsi"/>
+          <w:sz w:val="22"/>
+          <w:szCs w:val="22"/>
+        </w:rPr>
+        <w:t>your</w:t>
+      </w:r>
+      <w:proofErr w:type="gramEnd"/>
+      <w:r>
+        <w:rPr>
+          <w:rFonts w:asciiTheme="minorHAnsi" w:hAnsiTheme="minorHAnsi"/>
+          <w:sz w:val="22"/>
+          <w:szCs w:val="22"/>
+        </w:rPr>
+        <w:t xml:space="preserve"> understanding and agreement.</w:t>
       </w:r>
     </w:p>
     <w:p>
@@ -21983,7 +21900,25 @@
           <w:sz w:val="22"/>
           <w:szCs w:val="22"/>
         </w:rPr>
-        <w:t xml:space="preserve"> manner at all times.</w:t>
+        <w:t xml:space="preserve"> manner </w:t>
+      </w:r>
+      <w:proofErr w:type="gramStart"/>
+      <w:r>
+        <w:rPr>
+          <w:rFonts w:asciiTheme="minorHAnsi" w:hAnsiTheme="minorHAnsi"/>
+          <w:sz w:val="22"/>
+          <w:szCs w:val="22"/>
+        </w:rPr>
+        <w:t>at all times</w:t>
+      </w:r>
+      <w:proofErr w:type="gramEnd"/>
+      <w:r>
+        <w:rPr>
+          <w:rFonts w:asciiTheme="minorHAnsi" w:hAnsiTheme="minorHAnsi"/>
+          <w:sz w:val="22"/>
+          <w:szCs w:val="22"/>
+        </w:rPr>
+        <w:t>.</w:t>
       </w:r>
     </w:p>
     <w:p>
@@ -22790,7 +22725,25 @@
           <w:sz w:val="22"/>
           <w:szCs w:val="22"/>
         </w:rPr>
-        <w:t>, with proper sign-offs.</w:t>
+        <w:t xml:space="preserve">, with proper </w:t>
+      </w:r>
+      <w:proofErr w:type="gramStart"/>
+      <w:r>
+        <w:rPr>
+          <w:rFonts w:asciiTheme="minorHAnsi" w:hAnsiTheme="minorHAnsi"/>
+          <w:sz w:val="22"/>
+          <w:szCs w:val="22"/>
+        </w:rPr>
+        <w:t>sign-offs</w:t>
+      </w:r>
+      <w:proofErr w:type="gramEnd"/>
+      <w:r>
+        <w:rPr>
+          <w:rFonts w:asciiTheme="minorHAnsi" w:hAnsiTheme="minorHAnsi"/>
+          <w:sz w:val="22"/>
+          <w:szCs w:val="22"/>
+        </w:rPr>
+        <w:t>.</w:t>
       </w:r>
     </w:p>
     <w:p>
@@ -23828,7 +23781,23 @@
           <w:szCs w:val="22"/>
         </w:rPr>
         <w:br/>
-        <w:t>I understand that it is my responsibility to ensure compliance with Immigration, Refugees and Citizenship Canada (IRCC) regulations at all times, and to seek legal or immigration counsel if needed.</w:t>
+        <w:t xml:space="preserve">I understand that it is my responsibility to ensure compliance with Immigration, Refugees and Citizenship Canada (IRCC) regulations </w:t>
+      </w:r>
+      <w:proofErr w:type="gramStart"/>
+      <w:r>
+        <w:rPr>
+          <w:sz w:val="22"/>
+          <w:szCs w:val="22"/>
+        </w:rPr>
+        <w:t>at all times</w:t>
+      </w:r>
+      <w:proofErr w:type="gramEnd"/>
+      <w:r>
+        <w:rPr>
+          <w:sz w:val="22"/>
+          <w:szCs w:val="22"/>
+        </w:rPr>
+        <w:t>, and to seek legal or immigration counsel if needed.</w:t>
       </w:r>
     </w:p>
     <w:p>
@@ -24337,8 +24306,8 @@
       </w:pPr>
     </w:p>
     <w:sectPr>
-      <w:headerReference w:type="default" r:id="rId11"/>
-      <w:footerReference w:type="default" r:id="rId12"/>
+      <w:headerReference w:type="default" r:id="rId9"/>
+      <w:footerReference w:type="default" r:id="rId10"/>
       <w:pgSz w:w="12240" w:h="15840"/>
       <w:pgMar w:top="720" w:right="720" w:bottom="432" w:left="720" w:header="720" w:footer="144" w:gutter="0"/>
       <w:cols w:space="720"/>
@@ -24549,7 +24518,33 @@
         <w:sz w:val="16"/>
         <w:szCs w:val="16"/>
       </w:rPr>
-      <w:t>25 Watline Ave, Unit 204, Mississauga</w:t>
+      <w:t xml:space="preserve">25 </w:t>
+    </w:r>
+    <w:proofErr w:type="spellStart"/>
+    <w:r>
+      <w:rPr>
+        <w:rFonts w:ascii="Arial" w:hAnsi="Arial" w:cs="Arial"/>
+        <w:b/>
+        <w:bCs/>
+        <w:i/>
+        <w:iCs/>
+        <w:sz w:val="16"/>
+        <w:szCs w:val="16"/>
+      </w:rPr>
+      <w:t>Watline</w:t>
+    </w:r>
+    <w:proofErr w:type="spellEnd"/>
+    <w:r>
+      <w:rPr>
+        <w:rFonts w:ascii="Arial" w:hAnsi="Arial" w:cs="Arial"/>
+        <w:b/>
+        <w:bCs/>
+        <w:i/>
+        <w:iCs/>
+        <w:sz w:val="16"/>
+        <w:szCs w:val="16"/>
+      </w:rPr>
+      <w:t xml:space="preserve"> Ave, Unit 204, Mississauga</w:t>
     </w:r>
     <w:r>
       <w:rPr>
@@ -27475,7 +27470,6 @@
   <w:style w:type="character" w:default="1" w:styleId="DefaultParagraphFont">
     <w:name w:val="Default Paragraph Font"/>
     <w:uiPriority w:val="1"/>
-    <w:semiHidden/>
     <w:unhideWhenUsed/>
   </w:style>
   <w:style w:type="table" w:default="1" w:styleId="TableNormal">

</xml_diff>

<commit_message>
Stabilize runtime contract template
</commit_message>
<xml_diff>
--- a/src/templates/contracts/student-enrolment-template.docx
+++ b/src/templates/contracts/student-enrolment-template.docx
@@ -1268,9 +1268,18 @@
                 <w:sz w:val="22"/>
                 <w:szCs w:val="22"/>
               </w:rPr>
-              <w:t>International Student: {</w:t>
+              <w:t>International Student</w:t>
+            </w:r>
+            <w:proofErr w:type="gramStart"/>
+            <w:r>
+              <w:rPr>
+                <w:sz w:val="22"/>
+                <w:szCs w:val="22"/>
+              </w:rPr>
+              <w:t>:  {</w:t>
             </w:r>
             <w:proofErr w:type="spellStart"/>
+            <w:proofErr w:type="gramEnd"/>
             <w:r>
               <w:rPr>
                 <w:sz w:val="22"/>
@@ -1284,7 +1293,14 @@
                 <w:sz w:val="22"/>
                 <w:szCs w:val="22"/>
               </w:rPr>
-              <w:t xml:space="preserve">} Yes     </w:t>
+              <w:t>} Yes</w:t>
+            </w:r>
+            <w:r>
+              <w:rPr>
+                <w:sz w:val="22"/>
+                <w:szCs w:val="22"/>
+              </w:rPr>
+              <w:t xml:space="preserve">      </w:t>
             </w:r>
             <w:proofErr w:type="gramStart"/>
             <w:r>
@@ -1292,7 +1308,14 @@
                 <w:sz w:val="22"/>
                 <w:szCs w:val="22"/>
               </w:rPr>
-              <w:t xml:space="preserve">   {</w:t>
+              <w:t xml:space="preserve">   </w:t>
+            </w:r>
+            <w:r>
+              <w:rPr>
+                <w:sz w:val="22"/>
+                <w:szCs w:val="22"/>
+              </w:rPr>
+              <w:t>{</w:t>
             </w:r>
             <w:proofErr w:type="spellStart"/>
             <w:proofErr w:type="gramEnd"/>
@@ -3695,12 +3718,21 @@
                 <w:szCs w:val="22"/>
               </w:rPr>
             </w:pPr>
-            <w:r>
-              <w:rPr>
-                <w:sz w:val="22"/>
-                <w:szCs w:val="22"/>
-              </w:rPr>
-              <w:t>Method of program delivery</w:t>
+          </w:p>
+          <w:p>
+            <w:pPr>
+              <w:pStyle w:val="Default"/>
+              <w:rPr>
+                <w:sz w:val="22"/>
+                <w:szCs w:val="22"/>
+              </w:rPr>
+            </w:pPr>
+            <w:r>
+              <w:rPr>
+                <w:sz w:val="22"/>
+                <w:szCs w:val="22"/>
+              </w:rPr>
+              <w:t xml:space="preserve">Method of program </w:t>
             </w:r>
             <w:proofErr w:type="gramStart"/>
             <w:r>
@@ -3708,7 +3740,7 @@
                 <w:sz w:val="22"/>
                 <w:szCs w:val="22"/>
               </w:rPr>
-              <w:t xml:space="preserve">   {</w:t>
+              <w:t>delivery  {</w:t>
             </w:r>
             <w:proofErr w:type="spellStart"/>
             <w:proofErr w:type="gramEnd"/>
@@ -3725,7 +3757,7 @@
                 <w:sz w:val="22"/>
                 <w:szCs w:val="22"/>
               </w:rPr>
-              <w:t>} in-</w:t>
+              <w:t xml:space="preserve">} in-person </w:t>
             </w:r>
             <w:proofErr w:type="gramStart"/>
             <w:r>
@@ -3733,7 +3765,7 @@
                 <w:sz w:val="22"/>
                 <w:szCs w:val="22"/>
               </w:rPr>
-              <w:t>person  {</w:t>
+              <w:t xml:space="preserve">   {</w:t>
             </w:r>
             <w:proofErr w:type="spellStart"/>
             <w:proofErr w:type="gramEnd"/>
@@ -3750,9 +3782,18 @@
                 <w:sz w:val="22"/>
                 <w:szCs w:val="22"/>
               </w:rPr>
-              <w:t>} Hybrid {</w:t>
+              <w:t xml:space="preserve">} Hybrid   </w:t>
+            </w:r>
+            <w:proofErr w:type="gramStart"/>
+            <w:r>
+              <w:rPr>
+                <w:sz w:val="22"/>
+                <w:szCs w:val="22"/>
+              </w:rPr>
+              <w:t xml:space="preserve">   {</w:t>
             </w:r>
             <w:proofErr w:type="spellStart"/>
+            <w:proofErr w:type="gramEnd"/>
             <w:r>
               <w:rPr>
                 <w:sz w:val="22"/>
@@ -3953,18 +3994,15 @@
           <w:p>
             <w:pPr>
               <w:pStyle w:val="Default"/>
-              <w:ind w:left="720"/>
               <w:rPr>
                 <w:b/>
                 <w:bCs/>
                 <w:sz w:val="22"/>
                 <w:szCs w:val="22"/>
-              </w:rPr>
-            </w:pPr>
-          </w:p>
-          <w:p>
-            <w:pPr>
-              <w:pStyle w:val="Default"/>
+                <w:u w:val="single"/>
+              </w:rPr>
+            </w:pPr>
+            <w:r>
               <w:rPr>
                 <w:b/>
                 <w:bCs/>
@@ -3972,27 +4010,8 @@
                 <w:szCs w:val="22"/>
                 <w:u w:val="single"/>
               </w:rPr>
-            </w:pPr>
-          </w:p>
-          <w:p>
-            <w:pPr>
-              <w:pStyle w:val="Default"/>
-              <w:rPr>
-                <w:b/>
-                <w:bCs/>
-                <w:sz w:val="22"/>
-                <w:szCs w:val="22"/>
-                <w:u w:val="single"/>
-              </w:rPr>
-            </w:pPr>
-            <w:r>
-              <w:rPr>
-                <w:b/>
-                <w:bCs/>
-                <w:sz w:val="22"/>
-                <w:szCs w:val="22"/>
-                <w:u w:val="single"/>
-              </w:rPr>
+              <w:lastRenderedPageBreak/>
+              <w:br w:type="page"/>
               <w:t>English Language Proficiency</w:t>
             </w:r>
           </w:p>
@@ -5193,6 +5212,7 @@
                 <w:szCs w:val="28"/>
                 <w:u w:val="single"/>
               </w:rPr>
+              <w:lastRenderedPageBreak/>
               <w:t>Payment Schedule</w:t>
             </w:r>
           </w:p>
@@ -10532,6 +10552,7 @@
                 <w:szCs w:val="28"/>
                 <w:u w:val="single"/>
               </w:rPr>
+              <w:lastRenderedPageBreak/>
               <w:t>Full refunds minus service fee</w:t>
             </w:r>
           </w:p>
@@ -10877,21 +10898,9 @@
     </w:p>
     <w:p>
       <w:pPr>
-        <w:widowControl w:val="0"/>
-        <w:autoSpaceDE w:val="0"/>
-        <w:autoSpaceDN w:val="0"/>
-        <w:spacing w:before="275" w:after="0" w:line="240" w:lineRule="auto"/>
-        <w:ind w:right="15"/>
-        <w:rPr>
-          <w:rFonts w:ascii="Calibri" w:eastAsia="Calibri" w:hAnsi="Calibri" w:cs="Calibri"/>
-          <w:b/>
-          <w:bCs/>
-          <w:kern w:val="0"/>
-          <w:sz w:val="40"/>
-          <w:szCs w:val="40"/>
-          <w:lang w:val="en-US"/>
-          <w14:ligatures w14:val="none"/>
-        </w:rPr>
+        <w:tabs>
+          <w:tab w:val="left" w:pos="2950"/>
+        </w:tabs>
       </w:pPr>
     </w:p>
     <w:p>
@@ -22385,6 +22394,30 @@
           <w:szCs w:val="22"/>
         </w:rPr>
       </w:pPr>
+    </w:p>
+    <w:p>
+      <w:pPr>
+        <w:pStyle w:val="Default"/>
+        <w:rPr>
+          <w:rFonts w:asciiTheme="minorHAnsi" w:hAnsiTheme="minorHAnsi"/>
+          <w:b/>
+          <w:bCs/>
+          <w:sz w:val="22"/>
+          <w:szCs w:val="22"/>
+        </w:rPr>
+      </w:pPr>
+    </w:p>
+    <w:p>
+      <w:pPr>
+        <w:pStyle w:val="Default"/>
+        <w:rPr>
+          <w:rFonts w:asciiTheme="minorHAnsi" w:hAnsiTheme="minorHAnsi"/>
+          <w:b/>
+          <w:bCs/>
+          <w:sz w:val="22"/>
+          <w:szCs w:val="22"/>
+        </w:rPr>
+      </w:pPr>
       <w:r>
         <w:rPr>
           <w:rFonts w:asciiTheme="minorHAnsi" w:hAnsiTheme="minorHAnsi"/>
@@ -23262,7 +23295,6 @@
           <w:u w:val="single"/>
           <w:lang w:val="en-SG"/>
         </w:rPr>
-        <w:lastRenderedPageBreak/>
         <w:t>STUDENT IMMIGRATION STATUS ACKNOWLEDGEMENT</w:t>
       </w:r>
     </w:p>
@@ -23979,7 +24011,6 @@
           <w:szCs w:val="28"/>
           <w:u w:val="single"/>
         </w:rPr>
-        <w:lastRenderedPageBreak/>
         <w:t>Photography and Videography Consent Form</w:t>
       </w:r>
       <w:r>
@@ -27470,6 +27501,7 @@
   <w:style w:type="character" w:default="1" w:styleId="DefaultParagraphFont">
     <w:name w:val="Default Paragraph Font"/>
     <w:uiPriority w:val="1"/>
+    <w:semiHidden/>
     <w:unhideWhenUsed/>
   </w:style>
   <w:style w:type="table" w:default="1" w:styleId="TableNormal">

</xml_diff>

<commit_message>
Stabilize runtime contract template (#37)
</commit_message>
<xml_diff>
--- a/src/templates/contracts/student-enrolment-template.docx
+++ b/src/templates/contracts/student-enrolment-template.docx
@@ -1268,9 +1268,18 @@
                 <w:sz w:val="22"/>
                 <w:szCs w:val="22"/>
               </w:rPr>
-              <w:t>International Student: {</w:t>
+              <w:t>International Student</w:t>
+            </w:r>
+            <w:proofErr w:type="gramStart"/>
+            <w:r>
+              <w:rPr>
+                <w:sz w:val="22"/>
+                <w:szCs w:val="22"/>
+              </w:rPr>
+              <w:t>:  {</w:t>
             </w:r>
             <w:proofErr w:type="spellStart"/>
+            <w:proofErr w:type="gramEnd"/>
             <w:r>
               <w:rPr>
                 <w:sz w:val="22"/>
@@ -1284,7 +1293,14 @@
                 <w:sz w:val="22"/>
                 <w:szCs w:val="22"/>
               </w:rPr>
-              <w:t xml:space="preserve">} Yes     </w:t>
+              <w:t>} Yes</w:t>
+            </w:r>
+            <w:r>
+              <w:rPr>
+                <w:sz w:val="22"/>
+                <w:szCs w:val="22"/>
+              </w:rPr>
+              <w:t xml:space="preserve">      </w:t>
             </w:r>
             <w:proofErr w:type="gramStart"/>
             <w:r>
@@ -1292,7 +1308,14 @@
                 <w:sz w:val="22"/>
                 <w:szCs w:val="22"/>
               </w:rPr>
-              <w:t xml:space="preserve">   {</w:t>
+              <w:t xml:space="preserve">   </w:t>
+            </w:r>
+            <w:r>
+              <w:rPr>
+                <w:sz w:val="22"/>
+                <w:szCs w:val="22"/>
+              </w:rPr>
+              <w:t>{</w:t>
             </w:r>
             <w:proofErr w:type="spellStart"/>
             <w:proofErr w:type="gramEnd"/>
@@ -3695,12 +3718,21 @@
                 <w:szCs w:val="22"/>
               </w:rPr>
             </w:pPr>
-            <w:r>
-              <w:rPr>
-                <w:sz w:val="22"/>
-                <w:szCs w:val="22"/>
-              </w:rPr>
-              <w:t>Method of program delivery</w:t>
+          </w:p>
+          <w:p>
+            <w:pPr>
+              <w:pStyle w:val="Default"/>
+              <w:rPr>
+                <w:sz w:val="22"/>
+                <w:szCs w:val="22"/>
+              </w:rPr>
+            </w:pPr>
+            <w:r>
+              <w:rPr>
+                <w:sz w:val="22"/>
+                <w:szCs w:val="22"/>
+              </w:rPr>
+              <w:t xml:space="preserve">Method of program </w:t>
             </w:r>
             <w:proofErr w:type="gramStart"/>
             <w:r>
@@ -3708,7 +3740,7 @@
                 <w:sz w:val="22"/>
                 <w:szCs w:val="22"/>
               </w:rPr>
-              <w:t xml:space="preserve">   {</w:t>
+              <w:t>delivery  {</w:t>
             </w:r>
             <w:proofErr w:type="spellStart"/>
             <w:proofErr w:type="gramEnd"/>
@@ -3725,7 +3757,7 @@
                 <w:sz w:val="22"/>
                 <w:szCs w:val="22"/>
               </w:rPr>
-              <w:t>} in-</w:t>
+              <w:t xml:space="preserve">} in-person </w:t>
             </w:r>
             <w:proofErr w:type="gramStart"/>
             <w:r>
@@ -3733,7 +3765,7 @@
                 <w:sz w:val="22"/>
                 <w:szCs w:val="22"/>
               </w:rPr>
-              <w:t>person  {</w:t>
+              <w:t xml:space="preserve">   {</w:t>
             </w:r>
             <w:proofErr w:type="spellStart"/>
             <w:proofErr w:type="gramEnd"/>
@@ -3750,9 +3782,18 @@
                 <w:sz w:val="22"/>
                 <w:szCs w:val="22"/>
               </w:rPr>
-              <w:t>} Hybrid {</w:t>
+              <w:t xml:space="preserve">} Hybrid   </w:t>
+            </w:r>
+            <w:proofErr w:type="gramStart"/>
+            <w:r>
+              <w:rPr>
+                <w:sz w:val="22"/>
+                <w:szCs w:val="22"/>
+              </w:rPr>
+              <w:t xml:space="preserve">   {</w:t>
             </w:r>
             <w:proofErr w:type="spellStart"/>
+            <w:proofErr w:type="gramEnd"/>
             <w:r>
               <w:rPr>
                 <w:sz w:val="22"/>
@@ -3953,18 +3994,15 @@
           <w:p>
             <w:pPr>
               <w:pStyle w:val="Default"/>
-              <w:ind w:left="720"/>
               <w:rPr>
                 <w:b/>
                 <w:bCs/>
                 <w:sz w:val="22"/>
                 <w:szCs w:val="22"/>
-              </w:rPr>
-            </w:pPr>
-          </w:p>
-          <w:p>
-            <w:pPr>
-              <w:pStyle w:val="Default"/>
+                <w:u w:val="single"/>
+              </w:rPr>
+            </w:pPr>
+            <w:r>
               <w:rPr>
                 <w:b/>
                 <w:bCs/>
@@ -3972,27 +4010,8 @@
                 <w:szCs w:val="22"/>
                 <w:u w:val="single"/>
               </w:rPr>
-            </w:pPr>
-          </w:p>
-          <w:p>
-            <w:pPr>
-              <w:pStyle w:val="Default"/>
-              <w:rPr>
-                <w:b/>
-                <w:bCs/>
-                <w:sz w:val="22"/>
-                <w:szCs w:val="22"/>
-                <w:u w:val="single"/>
-              </w:rPr>
-            </w:pPr>
-            <w:r>
-              <w:rPr>
-                <w:b/>
-                <w:bCs/>
-                <w:sz w:val="22"/>
-                <w:szCs w:val="22"/>
-                <w:u w:val="single"/>
-              </w:rPr>
+              <w:lastRenderedPageBreak/>
+              <w:br w:type="page"/>
               <w:t>English Language Proficiency</w:t>
             </w:r>
           </w:p>
@@ -5193,6 +5212,7 @@
                 <w:szCs w:val="28"/>
                 <w:u w:val="single"/>
               </w:rPr>
+              <w:lastRenderedPageBreak/>
               <w:t>Payment Schedule</w:t>
             </w:r>
           </w:p>
@@ -10532,6 +10552,7 @@
                 <w:szCs w:val="28"/>
                 <w:u w:val="single"/>
               </w:rPr>
+              <w:lastRenderedPageBreak/>
               <w:t>Full refunds minus service fee</w:t>
             </w:r>
           </w:p>
@@ -10877,21 +10898,9 @@
     </w:p>
     <w:p>
       <w:pPr>
-        <w:widowControl w:val="0"/>
-        <w:autoSpaceDE w:val="0"/>
-        <w:autoSpaceDN w:val="0"/>
-        <w:spacing w:before="275" w:after="0" w:line="240" w:lineRule="auto"/>
-        <w:ind w:right="15"/>
-        <w:rPr>
-          <w:rFonts w:ascii="Calibri" w:eastAsia="Calibri" w:hAnsi="Calibri" w:cs="Calibri"/>
-          <w:b/>
-          <w:bCs/>
-          <w:kern w:val="0"/>
-          <w:sz w:val="40"/>
-          <w:szCs w:val="40"/>
-          <w:lang w:val="en-US"/>
-          <w14:ligatures w14:val="none"/>
-        </w:rPr>
+        <w:tabs>
+          <w:tab w:val="left" w:pos="2950"/>
+        </w:tabs>
       </w:pPr>
     </w:p>
     <w:p>
@@ -22385,6 +22394,30 @@
           <w:szCs w:val="22"/>
         </w:rPr>
       </w:pPr>
+    </w:p>
+    <w:p>
+      <w:pPr>
+        <w:pStyle w:val="Default"/>
+        <w:rPr>
+          <w:rFonts w:asciiTheme="minorHAnsi" w:hAnsiTheme="minorHAnsi"/>
+          <w:b/>
+          <w:bCs/>
+          <w:sz w:val="22"/>
+          <w:szCs w:val="22"/>
+        </w:rPr>
+      </w:pPr>
+    </w:p>
+    <w:p>
+      <w:pPr>
+        <w:pStyle w:val="Default"/>
+        <w:rPr>
+          <w:rFonts w:asciiTheme="minorHAnsi" w:hAnsiTheme="minorHAnsi"/>
+          <w:b/>
+          <w:bCs/>
+          <w:sz w:val="22"/>
+          <w:szCs w:val="22"/>
+        </w:rPr>
+      </w:pPr>
       <w:r>
         <w:rPr>
           <w:rFonts w:asciiTheme="minorHAnsi" w:hAnsiTheme="minorHAnsi"/>
@@ -23262,7 +23295,6 @@
           <w:u w:val="single"/>
           <w:lang w:val="en-SG"/>
         </w:rPr>
-        <w:lastRenderedPageBreak/>
         <w:t>STUDENT IMMIGRATION STATUS ACKNOWLEDGEMENT</w:t>
       </w:r>
     </w:p>
@@ -23979,7 +24011,6 @@
           <w:szCs w:val="28"/>
           <w:u w:val="single"/>
         </w:rPr>
-        <w:lastRenderedPageBreak/>
         <w:t>Photography and Videography Consent Form</w:t>
       </w:r>
       <w:r>
@@ -27470,6 +27501,7 @@
   <w:style w:type="character" w:default="1" w:styleId="DefaultParagraphFont">
     <w:name w:val="Default Paragraph Font"/>
     <w:uiPriority w:val="1"/>
+    <w:semiHidden/>
     <w:unhideWhenUsed/>
   </w:style>
   <w:style w:type="table" w:default="1" w:styleId="TableNormal">

</xml_diff>